<commit_message>
Adding Relational Mapping Diagram
</commit_message>
<xml_diff>
--- a/EER diagram.docx
+++ b/EER diagram.docx
@@ -4524,15 +4524,7 @@
                                     <w:szCs w:val="16"/>
                                     <w:u w:val="single"/>
                                   </w:rPr>
-                                  <w:t>Medical</w:t>
-                                </w:r>
-                                <w:r>
-                                  <w:rPr>
-                                    <w:sz w:val="16"/>
-                                    <w:szCs w:val="16"/>
-                                    <w:u w:val="single"/>
-                                  </w:rPr>
-                                  <w:t>_ID</w:t>
+                                  <w:t>Medical_ID</w:t>
                                 </w:r>
                                 <w:proofErr w:type="spellEnd"/>
                               </w:p>
@@ -4887,14 +4879,7 @@
                                     <w:sz w:val="16"/>
                                     <w:szCs w:val="16"/>
                                   </w:rPr>
-                                  <w:t>End</w:t>
-                                </w:r>
-                                <w:r>
-                                  <w:rPr>
-                                    <w:sz w:val="16"/>
-                                    <w:szCs w:val="16"/>
-                                  </w:rPr>
-                                  <w:t>_Date</w:t>
+                                  <w:t>End_Date</w:t>
                                 </w:r>
                                 <w:proofErr w:type="spellEnd"/>
                               </w:p>
@@ -5071,15 +5056,7 @@
                               <w:szCs w:val="16"/>
                               <w:u w:val="single"/>
                             </w:rPr>
-                            <w:t>Medical</w:t>
-                          </w:r>
-                          <w:r>
-                            <w:rPr>
-                              <w:sz w:val="16"/>
-                              <w:szCs w:val="16"/>
-                              <w:u w:val="single"/>
-                            </w:rPr>
-                            <w:t>_ID</w:t>
+                            <w:t>Medical_ID</w:t>
                           </w:r>
                           <w:proofErr w:type="spellEnd"/>
                         </w:p>
@@ -5180,14 +5157,7 @@
                               <w:sz w:val="16"/>
                               <w:szCs w:val="16"/>
                             </w:rPr>
-                            <w:t>End</w:t>
-                          </w:r>
-                          <w:r>
-                            <w:rPr>
-                              <w:sz w:val="16"/>
-                              <w:szCs w:val="16"/>
-                            </w:rPr>
-                            <w:t>_Date</w:t>
+                            <w:t>End_Date</w:t>
                           </w:r>
                           <w:proofErr w:type="spellEnd"/>
                         </w:p>
@@ -5314,6 +5284,109 @@
           <w:tab w:val="left" w:pos="5064"/>
         </w:tabs>
       </w:pPr>
+      <w:r>
+        <w:rPr>
+          <w:noProof/>
+          <w:sz w:val="16"/>
+          <w:szCs w:val="16"/>
+        </w:rPr>
+        <mc:AlternateContent>
+          <mc:Choice Requires="wps">
+            <w:drawing>
+              <wp:anchor distT="0" distB="0" distL="114300" distR="114300" simplePos="0" relativeHeight="251911168" behindDoc="0" locked="0" layoutInCell="1" allowOverlap="1" wp14:anchorId="725D0DEC" wp14:editId="2461494C">
+                <wp:simplePos x="0" y="0"/>
+                <wp:positionH relativeFrom="column">
+                  <wp:posOffset>16282185</wp:posOffset>
+                </wp:positionH>
+                <wp:positionV relativeFrom="paragraph">
+                  <wp:posOffset>138319</wp:posOffset>
+                </wp:positionV>
+                <wp:extent cx="237066" cy="214598"/>
+                <wp:effectExtent l="0" t="0" r="0" b="0"/>
+                <wp:wrapNone/>
+                <wp:docPr id="1084538928" name="Text Box 190"/>
+                <wp:cNvGraphicFramePr/>
+                <a:graphic xmlns:a="http://schemas.openxmlformats.org/drawingml/2006/main">
+                  <a:graphicData uri="http://schemas.microsoft.com/office/word/2010/wordprocessingShape">
+                    <wps:wsp>
+                      <wps:cNvSpPr txBox="1"/>
+                      <wps:spPr>
+                        <a:xfrm>
+                          <a:off x="0" y="0"/>
+                          <a:ext cx="237066" cy="214598"/>
+                        </a:xfrm>
+                        <a:prstGeom prst="rect">
+                          <a:avLst/>
+                        </a:prstGeom>
+                        <a:noFill/>
+                        <a:ln w="6350">
+                          <a:noFill/>
+                        </a:ln>
+                      </wps:spPr>
+                      <wps:txbx>
+                        <w:txbxContent>
+                          <w:p>
+                            <w:pPr>
+                              <w:rPr>
+                                <w:sz w:val="16"/>
+                                <w:szCs w:val="16"/>
+                              </w:rPr>
+                            </w:pPr>
+                            <w:r>
+                              <w:rPr>
+                                <w:sz w:val="16"/>
+                                <w:szCs w:val="16"/>
+                              </w:rPr>
+                              <w:t>N</w:t>
+                            </w:r>
+                          </w:p>
+                        </w:txbxContent>
+                      </wps:txbx>
+                      <wps:bodyPr rot="0" spcFirstLastPara="0" vertOverflow="overflow" horzOverflow="overflow" vert="horz" wrap="square" lIns="91440" tIns="45720" rIns="91440" bIns="45720" numCol="1" spcCol="0" rtlCol="0" fromWordArt="0" anchor="t" anchorCtr="0" forceAA="0" compatLnSpc="1">
+                        <a:prstTxWarp prst="textNoShape">
+                          <a:avLst/>
+                        </a:prstTxWarp>
+                        <a:noAutofit/>
+                      </wps:bodyPr>
+                    </wps:wsp>
+                  </a:graphicData>
+                </a:graphic>
+                <wp14:sizeRelH relativeFrom="margin">
+                  <wp14:pctWidth>0</wp14:pctWidth>
+                </wp14:sizeRelH>
+                <wp14:sizeRelV relativeFrom="margin">
+                  <wp14:pctHeight>0</wp14:pctHeight>
+                </wp14:sizeRelV>
+              </wp:anchor>
+            </w:drawing>
+          </mc:Choice>
+          <mc:Fallback>
+            <w:pict>
+              <v:shape w14:anchorId="725D0DEC" id="Text Box 190" o:spid="_x0000_s1130" type="#_x0000_t202" style="position:absolute;margin-left:1282.05pt;margin-top:10.9pt;width:18.65pt;height:16.9pt;z-index:251911168;visibility:visible;mso-wrap-style:square;mso-width-percent:0;mso-height-percent:0;mso-wrap-distance-left:9pt;mso-wrap-distance-top:0;mso-wrap-distance-right:9pt;mso-wrap-distance-bottom:0;mso-position-horizontal:absolute;mso-position-horizontal-relative:text;mso-position-vertical:absolute;mso-position-vertical-relative:text;mso-width-percent:0;mso-height-percent:0;mso-width-relative:margin;mso-height-relative:margin;v-text-anchor:top" o:gfxdata="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" filled="f" stroked="f" strokeweight=".5pt">
+                <v:textbox>
+                  <w:txbxContent>
+                    <w:p>
+                      <w:pPr>
+                        <w:rPr>
+                          <w:sz w:val="16"/>
+                          <w:szCs w:val="16"/>
+                        </w:rPr>
+                      </w:pPr>
+                      <w:r>
+                        <w:rPr>
+                          <w:sz w:val="16"/>
+                          <w:szCs w:val="16"/>
+                        </w:rPr>
+                        <w:t>N</w:t>
+                      </w:r>
+                    </w:p>
+                  </w:txbxContent>
+                </v:textbox>
+              </v:shape>
+            </w:pict>
+          </mc:Fallback>
+        </mc:AlternateContent>
+      </w:r>
       <w:r>
         <w:rPr>
           <w:noProof/>
@@ -5603,14 +5676,14 @@
           </mc:Choice>
           <mc:Fallback>
             <w:pict>
-              <v:group w14:anchorId="61AB0AEA" id="Group 186" o:spid="_x0000_s1130" style="position:absolute;margin-left:1126.35pt;margin-top:5.85pt;width:68.85pt;height:38.6pt;z-index:251892736" coordsize="8743,4902" o:gfxdata="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">
-                <v:group id="_x0000_s1131" style="position:absolute;width:8743;height:4902" coordsize="8746,4903" o:gfxdata="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">
+              <v:group w14:anchorId="61AB0AEA" id="Group 186" o:spid="_x0000_s1131" style="position:absolute;margin-left:1126.35pt;margin-top:5.85pt;width:68.85pt;height:38.6pt;z-index:251892736" coordsize="8743,4902" o:gfxdata="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">
+                <v:group id="_x0000_s1132" style="position:absolute;width:8743;height:4902" coordsize="8746,4903" o:gfxdata="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">
                   <v:shapetype id="_x0000_t4" coordsize="21600,21600" o:spt="4" path="m10800,l,10800,10800,21600,21600,10800xe">
                     <v:stroke joinstyle="miter"/>
                     <v:path gradientshapeok="t" o:connecttype="rect" textboxrect="5400,5400,16200,16200"/>
                   </v:shapetype>
-                  <v:shape id="Diamond 10" o:spid="_x0000_s1132" type="#_x0000_t4" style="position:absolute;width:8746;height:4903;visibility:visible;mso-wrap-style:square;v-text-anchor:middle" o:gfxdata="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" filled="f" strokecolor="#172c51" strokeweight=".5pt"/>
-                  <v:shape id="Text Box 11" o:spid="_x0000_s1133" type="#_x0000_t202" style="position:absolute;left:1867;top:1166;width:5925;height:2551;visibility:visible;mso-wrap-style:square;v-text-anchor:top" o:gfxdata="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" filled="f" stroked="f" strokeweight=".5pt">
+                  <v:shape id="Diamond 10" o:spid="_x0000_s1133" type="#_x0000_t4" style="position:absolute;width:8746;height:4903;visibility:visible;mso-wrap-style:square;v-text-anchor:middle" o:gfxdata="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" filled="f" strokecolor="#172c51" strokeweight=".5pt"/>
+                  <v:shape id="Text Box 11" o:spid="_x0000_s1134" type="#_x0000_t202" style="position:absolute;left:1867;top:1166;width:5925;height:2551;visibility:visible;mso-wrap-style:square;v-text-anchor:top" o:gfxdata="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" filled="f" stroked="f" strokeweight=".5pt">
                     <v:textbox>
                       <w:txbxContent>
                         <w:p>
@@ -5632,7 +5705,7 @@
                     </v:textbox>
                   </v:shape>
                 </v:group>
-                <v:shape id="Diamond 185" o:spid="_x0000_s1134" type="#_x0000_t4" style="position:absolute;left:285;top:219;width:8131;height:4448;visibility:visible;mso-wrap-style:square;v-text-anchor:middle" o:gfxdata="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" filled="f" strokecolor="#172c51" strokeweight=".5pt"/>
+                <v:shape id="Diamond 185" o:spid="_x0000_s1135" type="#_x0000_t4" style="position:absolute;left:285;top:219;width:8131;height:4448;visibility:visible;mso-wrap-style:square;v-text-anchor:middle" o:gfxdata="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" filled="f" strokecolor="#172c51" strokeweight=".5pt"/>
               </v:group>
             </w:pict>
           </mc:Fallback>
@@ -5823,11 +5896,11 @@
           </mc:Choice>
           <mc:Fallback>
             <w:pict>
-              <v:group w14:anchorId="3C6F01C0" id="_x0000_s1135" style="position:absolute;margin-left:951.65pt;margin-top:5.3pt;width:82.3pt;height:30.8pt;z-index:251598848" coordsize="10453,3909" o:gfxdata="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">
-                <v:oval id="Oval 14" o:spid="_x0000_s1136" style="position:absolute;width:8150;height:2534;visibility:visible;mso-wrap-style:square;v-text-anchor:middle" o:gfxdata="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" filled="f" strokecolor="#172c51" strokeweight=".5pt">
+              <v:group w14:anchorId="3C6F01C0" id="_x0000_s1136" style="position:absolute;margin-left:951.65pt;margin-top:5.3pt;width:82.3pt;height:30.8pt;z-index:251598848" coordsize="10453,3909" o:gfxdata="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">
+                <v:oval id="Oval 14" o:spid="_x0000_s1137" style="position:absolute;width:8150;height:2534;visibility:visible;mso-wrap-style:square;v-text-anchor:middle" o:gfxdata="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" filled="f" strokecolor="#172c51" strokeweight=".5pt">
                   <v:stroke joinstyle="miter"/>
                 </v:oval>
-                <v:shape id="Text Box 15" o:spid="_x0000_s1137" type="#_x0000_t202" style="position:absolute;left:1872;width:8581;height:3909;visibility:visible;mso-wrap-style:square;v-text-anchor:top" o:gfxdata="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" filled="f" stroked="f" strokeweight=".5pt">
+                <v:shape id="Text Box 15" o:spid="_x0000_s1138" type="#_x0000_t202" style="position:absolute;left:1872;width:8581;height:3909;visibility:visible;mso-wrap-style:square;v-text-anchor:top" o:gfxdata="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" filled="f" stroked="f" strokeweight=".5pt">
                   <v:textbox>
                     <w:txbxContent>
                       <w:p>
@@ -6049,11 +6122,11 @@
           </mc:Choice>
           <mc:Fallback>
             <w:pict>
-              <v:group w14:anchorId="569E386F" id="_x0000_s1138" style="position:absolute;margin-left:879.15pt;margin-top:5.05pt;width:81.1pt;height:30.8pt;z-index:251592704" coordsize="10303,3909" o:gfxdata="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">
-                <v:oval id="Oval 14" o:spid="_x0000_s1139" style="position:absolute;width:8150;height:2534;visibility:visible;mso-wrap-style:square;v-text-anchor:middle" o:gfxdata="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" filled="f" strokecolor="#09101d [484]" strokeweight=".5pt">
+              <v:group w14:anchorId="569E386F" id="_x0000_s1139" style="position:absolute;margin-left:879.15pt;margin-top:5.05pt;width:81.1pt;height:30.8pt;z-index:251592704" coordsize="10303,3909" o:gfxdata="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">
+                <v:oval id="Oval 14" o:spid="_x0000_s1140" style="position:absolute;width:8150;height:2534;visibility:visible;mso-wrap-style:square;v-text-anchor:middle" o:gfxdata="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" filled="f" strokecolor="#09101d [484]" strokeweight=".5pt">
                   <v:stroke joinstyle="miter"/>
                 </v:oval>
-                <v:shape id="Text Box 15" o:spid="_x0000_s1140" type="#_x0000_t202" style="position:absolute;left:1722;width:8581;height:3909;visibility:visible;mso-wrap-style:square;v-text-anchor:top" o:gfxdata="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" filled="f" stroked="f" strokeweight=".5pt">
+                <v:shape id="Text Box 15" o:spid="_x0000_s1141" type="#_x0000_t202" style="position:absolute;left:1722;width:8581;height:3909;visibility:visible;mso-wrap-style:square;v-text-anchor:top" o:gfxdata="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" filled="f" stroked="f" strokeweight=".5pt">
                   <v:textbox>
                     <w:txbxContent>
                       <w:p>
@@ -6099,7 +6172,213 @@
         <mc:AlternateContent>
           <mc:Choice Requires="wps">
             <w:drawing>
-              <wp:anchor distT="0" distB="0" distL="114300" distR="114300" simplePos="0" relativeHeight="251899904" behindDoc="0" locked="0" layoutInCell="1" allowOverlap="1" wp14:anchorId="70C9164E" wp14:editId="5838D4B4">
+              <wp:anchor distT="0" distB="0" distL="114300" distR="114300" simplePos="0" relativeHeight="251915264" behindDoc="0" locked="0" layoutInCell="1" allowOverlap="1" wp14:anchorId="5E761D27" wp14:editId="29F41682">
+                <wp:simplePos x="0" y="0"/>
+                <wp:positionH relativeFrom="column">
+                  <wp:posOffset>16623623</wp:posOffset>
+                </wp:positionH>
+                <wp:positionV relativeFrom="paragraph">
+                  <wp:posOffset>95433</wp:posOffset>
+                </wp:positionV>
+                <wp:extent cx="232833" cy="192071"/>
+                <wp:effectExtent l="0" t="0" r="0" b="0"/>
+                <wp:wrapNone/>
+                <wp:docPr id="1472585901" name="Text Box 190"/>
+                <wp:cNvGraphicFramePr/>
+                <a:graphic xmlns:a="http://schemas.openxmlformats.org/drawingml/2006/main">
+                  <a:graphicData uri="http://schemas.microsoft.com/office/word/2010/wordprocessingShape">
+                    <wps:wsp>
+                      <wps:cNvSpPr txBox="1"/>
+                      <wps:spPr>
+                        <a:xfrm>
+                          <a:off x="0" y="0"/>
+                          <a:ext cx="232833" cy="192071"/>
+                        </a:xfrm>
+                        <a:prstGeom prst="rect">
+                          <a:avLst/>
+                        </a:prstGeom>
+                        <a:noFill/>
+                        <a:ln w="6350">
+                          <a:noFill/>
+                        </a:ln>
+                      </wps:spPr>
+                      <wps:txbx>
+                        <w:txbxContent>
+                          <w:p>
+                            <w:pPr>
+                              <w:rPr>
+                                <w:sz w:val="16"/>
+                                <w:szCs w:val="16"/>
+                              </w:rPr>
+                            </w:pPr>
+                            <w:r>
+                              <w:rPr>
+                                <w:sz w:val="16"/>
+                                <w:szCs w:val="16"/>
+                              </w:rPr>
+                              <w:t>1</w:t>
+                            </w:r>
+                          </w:p>
+                        </w:txbxContent>
+                      </wps:txbx>
+                      <wps:bodyPr rot="0" spcFirstLastPara="0" vertOverflow="overflow" horzOverflow="overflow" vert="horz" wrap="square" lIns="91440" tIns="45720" rIns="91440" bIns="45720" numCol="1" spcCol="0" rtlCol="0" fromWordArt="0" anchor="t" anchorCtr="0" forceAA="0" compatLnSpc="1">
+                        <a:prstTxWarp prst="textNoShape">
+                          <a:avLst/>
+                        </a:prstTxWarp>
+                        <a:noAutofit/>
+                      </wps:bodyPr>
+                    </wps:wsp>
+                  </a:graphicData>
+                </a:graphic>
+                <wp14:sizeRelH relativeFrom="margin">
+                  <wp14:pctWidth>0</wp14:pctWidth>
+                </wp14:sizeRelH>
+                <wp14:sizeRelV relativeFrom="margin">
+                  <wp14:pctHeight>0</wp14:pctHeight>
+                </wp14:sizeRelV>
+              </wp:anchor>
+            </w:drawing>
+          </mc:Choice>
+          <mc:Fallback>
+            <w:pict>
+              <v:shape w14:anchorId="5E761D27" id="_x0000_s1142" type="#_x0000_t202" style="position:absolute;margin-left:1308.95pt;margin-top:7.5pt;width:18.35pt;height:15.1pt;z-index:251915264;visibility:visible;mso-wrap-style:square;mso-width-percent:0;mso-height-percent:0;mso-wrap-distance-left:9pt;mso-wrap-distance-top:0;mso-wrap-distance-right:9pt;mso-wrap-distance-bottom:0;mso-position-horizontal:absolute;mso-position-horizontal-relative:text;mso-position-vertical:absolute;mso-position-vertical-relative:text;mso-width-percent:0;mso-height-percent:0;mso-width-relative:margin;mso-height-relative:margin;v-text-anchor:top" o:gfxdata="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" filled="f" stroked="f" strokeweight=".5pt">
+                <v:textbox>
+                  <w:txbxContent>
+                    <w:p>
+                      <w:pPr>
+                        <w:rPr>
+                          <w:sz w:val="16"/>
+                          <w:szCs w:val="16"/>
+                        </w:rPr>
+                      </w:pPr>
+                      <w:r>
+                        <w:rPr>
+                          <w:sz w:val="16"/>
+                          <w:szCs w:val="16"/>
+                        </w:rPr>
+                        <w:t>1</w:t>
+                      </w:r>
+                    </w:p>
+                  </w:txbxContent>
+                </v:textbox>
+              </v:shape>
+            </w:pict>
+          </mc:Fallback>
+        </mc:AlternateContent>
+      </w:r>
+      <w:r>
+        <w:rPr>
+          <w:noProof/>
+          <w:sz w:val="16"/>
+          <w:szCs w:val="16"/>
+        </w:rPr>
+        <mc:AlternateContent>
+          <mc:Choice Requires="wps">
+            <w:drawing>
+              <wp:anchor distT="0" distB="0" distL="114300" distR="114300" simplePos="0" relativeHeight="251909120" behindDoc="0" locked="0" layoutInCell="1" allowOverlap="1" wp14:anchorId="787855BD" wp14:editId="0CF537DF">
+                <wp:simplePos x="0" y="0"/>
+                <wp:positionH relativeFrom="column">
+                  <wp:posOffset>12266429</wp:posOffset>
+                </wp:positionH>
+                <wp:positionV relativeFrom="paragraph">
+                  <wp:posOffset>222462</wp:posOffset>
+                </wp:positionV>
+                <wp:extent cx="232833" cy="192071"/>
+                <wp:effectExtent l="0" t="0" r="0" b="0"/>
+                <wp:wrapNone/>
+                <wp:docPr id="1480427765" name="Text Box 190"/>
+                <wp:cNvGraphicFramePr/>
+                <a:graphic xmlns:a="http://schemas.openxmlformats.org/drawingml/2006/main">
+                  <a:graphicData uri="http://schemas.microsoft.com/office/word/2010/wordprocessingShape">
+                    <wps:wsp>
+                      <wps:cNvSpPr txBox="1"/>
+                      <wps:spPr>
+                        <a:xfrm>
+                          <a:off x="0" y="0"/>
+                          <a:ext cx="232833" cy="192071"/>
+                        </a:xfrm>
+                        <a:prstGeom prst="rect">
+                          <a:avLst/>
+                        </a:prstGeom>
+                        <a:noFill/>
+                        <a:ln w="6350">
+                          <a:noFill/>
+                        </a:ln>
+                      </wps:spPr>
+                      <wps:txbx>
+                        <w:txbxContent>
+                          <w:p>
+                            <w:pPr>
+                              <w:rPr>
+                                <w:sz w:val="16"/>
+                                <w:szCs w:val="16"/>
+                              </w:rPr>
+                            </w:pPr>
+                            <w:r>
+                              <w:rPr>
+                                <w:sz w:val="16"/>
+                                <w:szCs w:val="16"/>
+                              </w:rPr>
+                              <w:t>1</w:t>
+                            </w:r>
+                          </w:p>
+                        </w:txbxContent>
+                      </wps:txbx>
+                      <wps:bodyPr rot="0" spcFirstLastPara="0" vertOverflow="overflow" horzOverflow="overflow" vert="horz" wrap="square" lIns="91440" tIns="45720" rIns="91440" bIns="45720" numCol="1" spcCol="0" rtlCol="0" fromWordArt="0" anchor="t" anchorCtr="0" forceAA="0" compatLnSpc="1">
+                        <a:prstTxWarp prst="textNoShape">
+                          <a:avLst/>
+                        </a:prstTxWarp>
+                        <a:noAutofit/>
+                      </wps:bodyPr>
+                    </wps:wsp>
+                  </a:graphicData>
+                </a:graphic>
+                <wp14:sizeRelH relativeFrom="margin">
+                  <wp14:pctWidth>0</wp14:pctWidth>
+                </wp14:sizeRelH>
+                <wp14:sizeRelV relativeFrom="margin">
+                  <wp14:pctHeight>0</wp14:pctHeight>
+                </wp14:sizeRelV>
+              </wp:anchor>
+            </w:drawing>
+          </mc:Choice>
+          <mc:Fallback>
+            <w:pict>
+              <v:shape w14:anchorId="787855BD" id="_x0000_s1143" type="#_x0000_t202" style="position:absolute;margin-left:965.85pt;margin-top:17.5pt;width:18.35pt;height:15.1pt;z-index:251909120;visibility:visible;mso-wrap-style:square;mso-width-percent:0;mso-height-percent:0;mso-wrap-distance-left:9pt;mso-wrap-distance-top:0;mso-wrap-distance-right:9pt;mso-wrap-distance-bottom:0;mso-position-horizontal:absolute;mso-position-horizontal-relative:text;mso-position-vertical:absolute;mso-position-vertical-relative:text;mso-width-percent:0;mso-height-percent:0;mso-width-relative:margin;mso-height-relative:margin;v-text-anchor:top" o:gfxdata="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" filled="f" stroked="f" strokeweight=".5pt">
+                <v:textbox>
+                  <w:txbxContent>
+                    <w:p>
+                      <w:pPr>
+                        <w:rPr>
+                          <w:sz w:val="16"/>
+                          <w:szCs w:val="16"/>
+                        </w:rPr>
+                      </w:pPr>
+                      <w:r>
+                        <w:rPr>
+                          <w:sz w:val="16"/>
+                          <w:szCs w:val="16"/>
+                        </w:rPr>
+                        <w:t>1</w:t>
+                      </w:r>
+                    </w:p>
+                  </w:txbxContent>
+                </v:textbox>
+              </v:shape>
+            </w:pict>
+          </mc:Fallback>
+        </mc:AlternateContent>
+      </w:r>
+      <w:r>
+        <w:rPr>
+          <w:noProof/>
+          <w:sz w:val="16"/>
+          <w:szCs w:val="16"/>
+        </w:rPr>
+        <mc:AlternateContent>
+          <mc:Choice Requires="wps">
+            <w:drawing>
+              <wp:anchor distT="0" distB="0" distL="114300" distR="114300" simplePos="0" relativeHeight="251899904" behindDoc="0" locked="0" layoutInCell="1" allowOverlap="1" wp14:anchorId="70C9164E" wp14:editId="758375BC">
                 <wp:simplePos x="0" y="0"/>
                 <wp:positionH relativeFrom="column">
                   <wp:posOffset>16824960</wp:posOffset>
@@ -6148,7 +6427,7 @@
           </mc:Choice>
           <mc:Fallback>
             <w:pict>
-              <v:line w14:anchorId="3B090034" id="Straight Connector 229" o:spid="_x0000_s1026" style="position:absolute;z-index:251899904;visibility:visible;mso-wrap-style:square;mso-wrap-distance-left:9pt;mso-wrap-distance-top:0;mso-wrap-distance-right:9pt;mso-wrap-distance-bottom:0;mso-position-horizontal:absolute;mso-position-horizontal-relative:text;mso-position-vertical:absolute;mso-position-vertical-relative:text" from="1324.8pt,9.8pt" to="1324.8pt,99.55pt" o:gfxdata="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" strokecolor="black [3200]" strokeweight=".5pt">
+              <v:line w14:anchorId="22EFCC72" id="Straight Connector 229" o:spid="_x0000_s1026" style="position:absolute;z-index:251899904;visibility:visible;mso-wrap-style:square;mso-wrap-distance-left:9pt;mso-wrap-distance-top:0;mso-wrap-distance-right:9pt;mso-wrap-distance-bottom:0;mso-position-horizontal:absolute;mso-position-horizontal-relative:text;mso-position-vertical:absolute;mso-position-vertical-relative:text" from="1324.8pt,9.8pt" to="1324.8pt,99.55pt" o:gfxdata="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" strokecolor="black [3200]" strokeweight=".5pt">
                 <v:stroke joinstyle="miter"/>
               </v:line>
             </w:pict>
@@ -6208,7 +6487,7 @@
                                 <w:sz w:val="16"/>
                                 <w:szCs w:val="16"/>
                               </w:rPr>
-                              <w:t>M</w:t>
+                              <w:t>N</w:t>
                             </w:r>
                           </w:p>
                         </w:txbxContent>
@@ -6233,7 +6512,7 @@
           </mc:Choice>
           <mc:Fallback>
             <w:pict>
-              <v:shape w14:anchorId="5BC8132F" id="Text Box 190" o:spid="_x0000_s1141" type="#_x0000_t202" style="position:absolute;margin-left:902.35pt;margin-top:16.7pt;width:18.65pt;height:16.9pt;z-index:251832320;visibility:visible;mso-wrap-style:square;mso-width-percent:0;mso-height-percent:0;mso-wrap-distance-left:9pt;mso-wrap-distance-top:0;mso-wrap-distance-right:9pt;mso-wrap-distance-bottom:0;mso-position-horizontal:absolute;mso-position-horizontal-relative:text;mso-position-vertical:absolute;mso-position-vertical-relative:text;mso-width-percent:0;mso-height-percent:0;mso-width-relative:margin;mso-height-relative:margin;v-text-anchor:top" o:gfxdata="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" filled="f" stroked="f" strokeweight=".5pt">
+              <v:shape w14:anchorId="5BC8132F" id="_x0000_s1144" type="#_x0000_t202" style="position:absolute;margin-left:902.35pt;margin-top:16.7pt;width:18.65pt;height:16.9pt;z-index:251832320;visibility:visible;mso-wrap-style:square;mso-width-percent:0;mso-height-percent:0;mso-wrap-distance-left:9pt;mso-wrap-distance-top:0;mso-wrap-distance-right:9pt;mso-wrap-distance-bottom:0;mso-position-horizontal:absolute;mso-position-horizontal-relative:text;mso-position-vertical:absolute;mso-position-vertical-relative:text;mso-width-percent:0;mso-height-percent:0;mso-width-relative:margin;mso-height-relative:margin;v-text-anchor:top" o:gfxdata="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" filled="f" stroked="f" strokeweight=".5pt">
                 <v:textbox>
                   <w:txbxContent>
                     <w:p>
@@ -6248,7 +6527,7 @@
                           <w:sz w:val="16"/>
                           <w:szCs w:val="16"/>
                         </w:rPr>
-                        <w:t>M</w:t>
+                        <w:t>N</w:t>
                       </w:r>
                     </w:p>
                   </w:txbxContent>
@@ -6274,7 +6553,7 @@
         <mc:AlternateContent>
           <mc:Choice Requires="wps">
             <w:drawing>
-              <wp:anchor distT="0" distB="0" distL="114300" distR="114300" simplePos="0" relativeHeight="251779072" behindDoc="0" locked="0" layoutInCell="1" allowOverlap="1" wp14:anchorId="0A944CAC" wp14:editId="7552D967">
+              <wp:anchor distT="0" distB="0" distL="114300" distR="114300" simplePos="0" relativeHeight="251779072" behindDoc="0" locked="0" layoutInCell="1" allowOverlap="1" wp14:anchorId="0A944CAC" wp14:editId="6C26F3D8">
                 <wp:simplePos x="0" y="0"/>
                 <wp:positionH relativeFrom="column">
                   <wp:posOffset>12315662</wp:posOffset>
@@ -6331,7 +6610,18 @@
           </mc:Choice>
           <mc:Fallback>
             <w:pict>
-              <v:shape w14:anchorId="63CA46BC" id="Connector: Elbow 74" o:spid="_x0000_s1026" type="#_x0000_t34" style="position:absolute;margin-left:969.75pt;margin-top:13.8pt;width:246.25pt;height:85.85pt;z-index:251779072;visibility:visible;mso-wrap-style:square;mso-width-percent:0;mso-height-percent:0;mso-wrap-distance-left:9pt;mso-wrap-distance-top:0;mso-wrap-distance-right:9pt;mso-wrap-distance-bottom:0;mso-position-horizontal:absolute;mso-position-horizontal-relative:text;mso-position-vertical:absolute;mso-position-vertical-relative:text;mso-width-percent:0;mso-height-percent:0;mso-width-relative:margin;mso-height-relative:margin" o:gfxdata="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" adj="21590" strokecolor="black [3200]" strokeweight=".5pt"/>
+              <v:shapetype w14:anchorId="3D668575" id="_x0000_t34" coordsize="21600,21600" o:spt="34" o:oned="t" adj="10800" path="m,l@0,0@0,21600,21600,21600e" filled="f">
+                <v:stroke joinstyle="miter"/>
+                <v:formulas>
+                  <v:f eqn="val #0"/>
+                </v:formulas>
+                <v:path arrowok="t" fillok="f" o:connecttype="none"/>
+                <v:handles>
+                  <v:h position="#0,center"/>
+                </v:handles>
+                <o:lock v:ext="edit" shapetype="t"/>
+              </v:shapetype>
+              <v:shape id="Connector: Elbow 74" o:spid="_x0000_s1026" type="#_x0000_t34" style="position:absolute;margin-left:969.75pt;margin-top:13.8pt;width:246.25pt;height:85.85pt;z-index:251779072;visibility:visible;mso-wrap-style:square;mso-width-percent:0;mso-height-percent:0;mso-wrap-distance-left:9pt;mso-wrap-distance-top:0;mso-wrap-distance-right:9pt;mso-wrap-distance-bottom:0;mso-position-horizontal:absolute;mso-position-horizontal-relative:text;mso-position-vertical:absolute;mso-position-vertical-relative:text;mso-width-percent:0;mso-height-percent:0;mso-width-relative:margin;mso-height-relative:margin" o:gfxdata="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" adj="21590" strokecolor="black [3200]" strokeweight=".5pt"/>
             </w:pict>
           </mc:Fallback>
         </mc:AlternateContent>
@@ -6414,7 +6704,7 @@
           </mc:Choice>
           <mc:Fallback>
             <w:pict>
-              <v:shape w14:anchorId="1C7C5B36" id="_x0000_s1142" type="#_x0000_t202" style="position:absolute;margin-left:963.85pt;margin-top:10.2pt;width:18.35pt;height:18.55pt;z-index:251820032;visibility:visible;mso-wrap-style:square;mso-width-percent:0;mso-height-percent:0;mso-wrap-distance-left:9pt;mso-wrap-distance-top:0;mso-wrap-distance-right:9pt;mso-wrap-distance-bottom:0;mso-position-horizontal:absolute;mso-position-horizontal-relative:text;mso-position-vertical:absolute;mso-position-vertical-relative:text;mso-width-percent:0;mso-height-percent:0;mso-width-relative:margin;mso-height-relative:margin;v-text-anchor:top" o:gfxdata="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" filled="f" stroked="f" strokeweight=".5pt">
+              <v:shape w14:anchorId="1C7C5B36" id="_x0000_s1145" type="#_x0000_t202" style="position:absolute;margin-left:963.85pt;margin-top:10.2pt;width:18.35pt;height:18.55pt;z-index:251820032;visibility:visible;mso-wrap-style:square;mso-width-percent:0;mso-height-percent:0;mso-wrap-distance-left:9pt;mso-wrap-distance-top:0;mso-wrap-distance-right:9pt;mso-wrap-distance-bottom:0;mso-position-horizontal:absolute;mso-position-horizontal-relative:text;mso-position-vertical:absolute;mso-position-vertical-relative:text;mso-width-percent:0;mso-height-percent:0;mso-width-relative:margin;mso-height-relative:margin;v-text-anchor:top" o:gfxdata="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" filled="f" stroked="f" strokeweight=".5pt">
                 <v:textbox>
                   <w:txbxContent>
                     <w:p>
@@ -6517,7 +6807,7 @@
           </mc:Choice>
           <mc:Fallback>
             <w:pict>
-              <v:shape w14:anchorId="75BF047F" id="_x0000_s1143" type="#_x0000_t202" style="position:absolute;margin-left:920.5pt;margin-top:15.85pt;width:18pt;height:17.3pt;z-index:251822080;visibility:visible;mso-wrap-style:square;mso-width-percent:0;mso-height-percent:0;mso-wrap-distance-left:9pt;mso-wrap-distance-top:0;mso-wrap-distance-right:9pt;mso-wrap-distance-bottom:0;mso-position-horizontal:absolute;mso-position-horizontal-relative:text;mso-position-vertical:absolute;mso-position-vertical-relative:text;mso-width-percent:0;mso-height-percent:0;mso-width-relative:margin;mso-height-relative:margin;v-text-anchor:top" o:gfxdata="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" filled="f" stroked="f" strokeweight=".5pt">
+              <v:shape w14:anchorId="75BF047F" id="_x0000_s1146" type="#_x0000_t202" style="position:absolute;margin-left:920.5pt;margin-top:15.85pt;width:18pt;height:17.3pt;z-index:251822080;visibility:visible;mso-wrap-style:square;mso-width-percent:0;mso-height-percent:0;mso-wrap-distance-left:9pt;mso-wrap-distance-top:0;mso-wrap-distance-right:9pt;mso-wrap-distance-bottom:0;mso-position-horizontal:absolute;mso-position-horizontal-relative:text;mso-position-vertical:absolute;mso-position-vertical-relative:text;mso-width-percent:0;mso-height-percent:0;mso-width-relative:margin;mso-height-relative:margin;v-text-anchor:top" o:gfxdata="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" filled="f" stroked="f" strokeweight=".5pt">
                 <v:textbox>
                   <w:txbxContent>
                     <w:p>
@@ -6691,7 +6981,7 @@
           </mc:Choice>
           <mc:Fallback>
             <w:pict>
-              <v:shape w14:anchorId="3110EFC7" id="_x0000_s1144" type="#_x0000_t202" style="position:absolute;margin-left:903.55pt;margin-top:8.55pt;width:22.55pt;height:16.35pt;z-index:251826176;visibility:visible;mso-wrap-style:square;mso-width-percent:0;mso-height-percent:0;mso-wrap-distance-left:9pt;mso-wrap-distance-top:0;mso-wrap-distance-right:9pt;mso-wrap-distance-bottom:0;mso-position-horizontal:absolute;mso-position-horizontal-relative:text;mso-position-vertical:absolute;mso-position-vertical-relative:text;mso-width-percent:0;mso-height-percent:0;mso-width-relative:margin;mso-height-relative:margin;v-text-anchor:top" o:gfxdata="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" filled="f" stroked="f" strokeweight=".5pt">
+              <v:shape w14:anchorId="3110EFC7" id="_x0000_s1147" type="#_x0000_t202" style="position:absolute;margin-left:903.55pt;margin-top:8.55pt;width:22.55pt;height:16.35pt;z-index:251826176;visibility:visible;mso-wrap-style:square;mso-width-percent:0;mso-height-percent:0;mso-wrap-distance-left:9pt;mso-wrap-distance-top:0;mso-wrap-distance-right:9pt;mso-wrap-distance-bottom:0;mso-position-horizontal:absolute;mso-position-horizontal-relative:text;mso-position-vertical:absolute;mso-position-vertical-relative:text;mso-width-percent:0;mso-height-percent:0;mso-width-relative:margin;mso-height-relative:margin;v-text-anchor:top" o:gfxdata="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" filled="f" stroked="f" strokeweight=".5pt">
                 <v:textbox>
                   <w:txbxContent>
                     <w:p>
@@ -6769,7 +7059,7 @@
                                 <w:sz w:val="16"/>
                                 <w:szCs w:val="16"/>
                               </w:rPr>
-                              <w:t>M</w:t>
+                              <w:t>N</w:t>
                             </w:r>
                           </w:p>
                         </w:txbxContent>
@@ -6794,7 +7084,7 @@
           </mc:Choice>
           <mc:Fallback>
             <w:pict>
-              <v:shape w14:anchorId="3016A9E3" id="_x0000_s1145" type="#_x0000_t202" style="position:absolute;margin-left:758.9pt;margin-top:16.45pt;width:26pt;height:22.35pt;z-index:251834368;visibility:visible;mso-wrap-style:square;mso-width-percent:0;mso-height-percent:0;mso-wrap-distance-left:9pt;mso-wrap-distance-top:0;mso-wrap-distance-right:9pt;mso-wrap-distance-bottom:0;mso-position-horizontal:absolute;mso-position-horizontal-relative:text;mso-position-vertical:absolute;mso-position-vertical-relative:text;mso-width-percent:0;mso-height-percent:0;mso-width-relative:margin;mso-height-relative:margin;v-text-anchor:top" o:gfxdata="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" filled="f" stroked="f" strokeweight=".5pt">
+              <v:shape w14:anchorId="3016A9E3" id="_x0000_s1148" type="#_x0000_t202" style="position:absolute;margin-left:758.9pt;margin-top:16.45pt;width:26pt;height:22.35pt;z-index:251834368;visibility:visible;mso-wrap-style:square;mso-width-percent:0;mso-height-percent:0;mso-wrap-distance-left:9pt;mso-wrap-distance-top:0;mso-wrap-distance-right:9pt;mso-wrap-distance-bottom:0;mso-position-horizontal:absolute;mso-position-horizontal-relative:text;mso-position-vertical:absolute;mso-position-vertical-relative:text;mso-width-percent:0;mso-height-percent:0;mso-width-relative:margin;mso-height-relative:margin;v-text-anchor:top" o:gfxdata="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" filled="f" stroked="f" strokeweight=".5pt">
                 <v:textbox>
                   <w:txbxContent>
                     <w:p>
@@ -6809,7 +7099,7 @@
                           <w:sz w:val="16"/>
                           <w:szCs w:val="16"/>
                         </w:rPr>
-                        <w:t>M</w:t>
+                        <w:t>N</w:t>
                       </w:r>
                     </w:p>
                   </w:txbxContent>
@@ -6872,7 +7162,7 @@
                                 <w:sz w:val="16"/>
                                 <w:szCs w:val="16"/>
                               </w:rPr>
-                              <w:t>M</w:t>
+                              <w:t>N</w:t>
                             </w:r>
                           </w:p>
                         </w:txbxContent>
@@ -6894,7 +7184,7 @@
           </mc:Choice>
           <mc:Fallback>
             <w:pict>
-              <v:shape w14:anchorId="21E83416" id="_x0000_s1146" type="#_x0000_t202" style="position:absolute;margin-left:568.35pt;margin-top:17.3pt;width:18pt;height:17.1pt;z-index:251811840;visibility:visible;mso-wrap-style:square;mso-width-percent:0;mso-wrap-distance-left:9pt;mso-wrap-distance-top:0;mso-wrap-distance-right:9pt;mso-wrap-distance-bottom:0;mso-position-horizontal:absolute;mso-position-horizontal-relative:text;mso-position-vertical:absolute;mso-position-vertical-relative:text;mso-width-percent:0;mso-width-relative:margin;v-text-anchor:top" o:gfxdata="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" filled="f" stroked="f" strokeweight=".5pt">
+              <v:shape w14:anchorId="21E83416" id="_x0000_s1149" type="#_x0000_t202" style="position:absolute;margin-left:568.35pt;margin-top:17.3pt;width:18pt;height:17.1pt;z-index:251811840;visibility:visible;mso-wrap-style:square;mso-width-percent:0;mso-wrap-distance-left:9pt;mso-wrap-distance-top:0;mso-wrap-distance-right:9pt;mso-wrap-distance-bottom:0;mso-position-horizontal:absolute;mso-position-horizontal-relative:text;mso-position-vertical:absolute;mso-position-vertical-relative:text;mso-width-percent:0;mso-width-relative:margin;v-text-anchor:top" o:gfxdata="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" filled="f" stroked="f" strokeweight=".5pt">
                 <v:textbox>
                   <w:txbxContent>
                     <w:p>
@@ -6909,7 +7199,7 @@
                           <w:sz w:val="16"/>
                           <w:szCs w:val="16"/>
                         </w:rPr>
-                        <w:t>M</w:t>
+                        <w:t>N</w:t>
                       </w:r>
                     </w:p>
                   </w:txbxContent>
@@ -6994,7 +7284,7 @@
           </mc:Choice>
           <mc:Fallback>
             <w:pict>
-              <v:shape w14:anchorId="5EB20985" id="_x0000_s1147" type="#_x0000_t202" style="position:absolute;margin-left:542.7pt;margin-top:17.3pt;width:20pt;height:17.1pt;z-index:251807744;visibility:visible;mso-wrap-style:square;mso-width-percent:0;mso-wrap-distance-left:9pt;mso-wrap-distance-top:0;mso-wrap-distance-right:9pt;mso-wrap-distance-bottom:0;mso-position-horizontal:absolute;mso-position-horizontal-relative:text;mso-position-vertical:absolute;mso-position-vertical-relative:text;mso-width-percent:0;mso-width-relative:margin;v-text-anchor:top" o:gfxdata="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" filled="f" stroked="f" strokeweight=".5pt">
+              <v:shape w14:anchorId="5EB20985" id="_x0000_s1150" type="#_x0000_t202" style="position:absolute;margin-left:542.7pt;margin-top:17.3pt;width:20pt;height:17.1pt;z-index:251807744;visibility:visible;mso-wrap-style:square;mso-width-percent:0;mso-wrap-distance-left:9pt;mso-wrap-distance-top:0;mso-wrap-distance-right:9pt;mso-wrap-distance-bottom:0;mso-position-horizontal:absolute;mso-position-horizontal-relative:text;mso-position-vertical:absolute;mso-position-vertical-relative:text;mso-width-percent:0;mso-width-relative:margin;v-text-anchor:top" o:gfxdata="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" filled="f" stroked="f" strokeweight=".5pt">
                 <v:textbox>
                   <w:txbxContent>
                     <w:p>
@@ -7385,7 +7675,7 @@
         <mc:AlternateContent>
           <mc:Choice Requires="wpg">
             <w:drawing>
-              <wp:anchor distT="0" distB="0" distL="114300" distR="114300" simplePos="0" relativeHeight="251707392" behindDoc="0" locked="0" layoutInCell="1" allowOverlap="1" wp14:anchorId="75E8251C" wp14:editId="6FB147C3">
+              <wp:anchor distT="0" distB="0" distL="114300" distR="114300" simplePos="0" relativeHeight="251707392" behindDoc="0" locked="0" layoutInCell="1" allowOverlap="1" wp14:anchorId="75E8251C" wp14:editId="46E53AD6">
                 <wp:simplePos x="0" y="0"/>
                 <wp:positionH relativeFrom="column">
                   <wp:posOffset>10330326</wp:posOffset>
@@ -7494,9 +7784,9 @@
           </mc:Choice>
           <mc:Fallback>
             <w:pict>
-              <v:group w14:anchorId="75E8251C" id="Group 13" o:spid="_x0000_s1148" style="position:absolute;margin-left:813.4pt;margin-top:9.35pt;width:68.85pt;height:38.6pt;z-index:251707392;mso-height-relative:margin" coordsize="8746,4903" o:gfxdata="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">
-                <v:shape id="Diamond 10" o:spid="_x0000_s1149" type="#_x0000_t4" style="position:absolute;width:8746;height:4903;visibility:visible;mso-wrap-style:square;v-text-anchor:middle" o:gfxdata="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" filled="f" strokecolor="#172c51" strokeweight=".5pt"/>
-                <v:shape id="Text Box 11" o:spid="_x0000_s1150" type="#_x0000_t202" style="position:absolute;left:1661;top:626;width:5499;height:3888;visibility:visible;mso-wrap-style:square;v-text-anchor:top" o:gfxdata="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" filled="f" stroked="f" strokeweight=".5pt">
+              <v:group w14:anchorId="75E8251C" id="Group 13" o:spid="_x0000_s1151" style="position:absolute;margin-left:813.4pt;margin-top:9.35pt;width:68.85pt;height:38.6pt;z-index:251707392;mso-height-relative:margin" coordsize="8746,4903" o:gfxdata="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">
+                <v:shape id="Diamond 10" o:spid="_x0000_s1152" type="#_x0000_t4" style="position:absolute;width:8746;height:4903;visibility:visible;mso-wrap-style:square;v-text-anchor:middle" o:gfxdata="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" filled="f" strokecolor="#172c51" strokeweight=".5pt"/>
+                <v:shape id="Text Box 11" o:spid="_x0000_s1153" type="#_x0000_t202" style="position:absolute;left:1661;top:626;width:5499;height:3888;visibility:visible;mso-wrap-style:square;v-text-anchor:top" o:gfxdata="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" filled="f" stroked="f" strokeweight=".5pt">
                   <v:textbox>
                     <w:txbxContent>
                       <w:p>
@@ -7546,7 +7836,151 @@
         <mc:AlternateContent>
           <mc:Choice Requires="wpg">
             <w:drawing>
-              <wp:anchor distT="0" distB="0" distL="114300" distR="114300" simplePos="0" relativeHeight="251894784" behindDoc="0" locked="0" layoutInCell="1" allowOverlap="1" wp14:anchorId="7DFFDDB4" wp14:editId="592F5D8A">
+              <wp:anchor distT="0" distB="0" distL="114300" distR="114300" simplePos="0" relativeHeight="251697152" behindDoc="0" locked="0" layoutInCell="1" allowOverlap="1" wp14:anchorId="384F496A" wp14:editId="17CE72A8">
+                <wp:simplePos x="0" y="0"/>
+                <wp:positionH relativeFrom="column">
+                  <wp:posOffset>7249583</wp:posOffset>
+                </wp:positionH>
+                <wp:positionV relativeFrom="paragraph">
+                  <wp:posOffset>52493</wp:posOffset>
+                </wp:positionV>
+                <wp:extent cx="874395" cy="490220"/>
+                <wp:effectExtent l="19050" t="19050" r="20955" b="43180"/>
+                <wp:wrapNone/>
+                <wp:docPr id="1914274484" name="Group 13"/>
+                <wp:cNvGraphicFramePr/>
+                <a:graphic xmlns:a="http://schemas.openxmlformats.org/drawingml/2006/main">
+                  <a:graphicData uri="http://schemas.microsoft.com/office/word/2010/wordprocessingGroup">
+                    <wpg:wgp>
+                      <wpg:cNvGrpSpPr/>
+                      <wpg:grpSpPr>
+                        <a:xfrm>
+                          <a:off x="0" y="0"/>
+                          <a:ext cx="874395" cy="490220"/>
+                          <a:chOff x="0" y="0"/>
+                          <a:chExt cx="874644" cy="490330"/>
+                        </a:xfrm>
+                      </wpg:grpSpPr>
+                      <wps:wsp>
+                        <wps:cNvPr id="1733087162" name="Diamond 10"/>
+                        <wps:cNvSpPr/>
+                        <wps:spPr>
+                          <a:xfrm>
+                            <a:off x="0" y="0"/>
+                            <a:ext cx="874644" cy="490330"/>
+                          </a:xfrm>
+                          <a:prstGeom prst="diamond">
+                            <a:avLst/>
+                          </a:prstGeom>
+                          <a:noFill/>
+                          <a:ln w="6350" cap="flat" cmpd="sng" algn="ctr">
+                            <a:solidFill>
+                              <a:srgbClr val="4472C4">
+                                <a:shade val="15000"/>
+                              </a:srgbClr>
+                            </a:solidFill>
+                            <a:prstDash val="solid"/>
+                            <a:miter lim="800000"/>
+                          </a:ln>
+                          <a:effectLst/>
+                        </wps:spPr>
+                        <wps:bodyPr rot="0" spcFirstLastPara="0" vertOverflow="overflow" horzOverflow="overflow" vert="horz" wrap="square" lIns="91440" tIns="45720" rIns="91440" bIns="45720" numCol="1" spcCol="0" rtlCol="0" fromWordArt="0" anchor="ctr" anchorCtr="0" forceAA="0" compatLnSpc="1">
+                          <a:prstTxWarp prst="textNoShape">
+                            <a:avLst/>
+                          </a:prstTxWarp>
+                          <a:noAutofit/>
+                        </wps:bodyPr>
+                      </wps:wsp>
+                      <wps:wsp>
+                        <wps:cNvPr id="279653698" name="Text Box 11"/>
+                        <wps:cNvSpPr txBox="1"/>
+                        <wps:spPr>
+                          <a:xfrm>
+                            <a:off x="130562" y="59280"/>
+                            <a:ext cx="628354" cy="377598"/>
+                          </a:xfrm>
+                          <a:prstGeom prst="rect">
+                            <a:avLst/>
+                          </a:prstGeom>
+                          <a:noFill/>
+                          <a:ln w="6350">
+                            <a:noFill/>
+                          </a:ln>
+                        </wps:spPr>
+                        <wps:txbx>
+                          <w:txbxContent>
+                            <w:p>
+                              <w:pPr>
+                                <w:jc w:val="center"/>
+                                <w:rPr>
+                                  <w:sz w:val="16"/>
+                                  <w:szCs w:val="16"/>
+                                </w:rPr>
+                              </w:pPr>
+                              <w:r>
+                                <w:rPr>
+                                  <w:sz w:val="16"/>
+                                  <w:szCs w:val="16"/>
+                                </w:rPr>
+                                <w:t>Assigned to</w:t>
+                              </w:r>
+                            </w:p>
+                          </w:txbxContent>
+                        </wps:txbx>
+                        <wps:bodyPr rot="0" spcFirstLastPara="0" vertOverflow="overflow" horzOverflow="overflow" vert="horz" wrap="square" lIns="91440" tIns="45720" rIns="91440" bIns="45720" numCol="1" spcCol="0" rtlCol="0" fromWordArt="0" anchor="t" anchorCtr="0" forceAA="0" compatLnSpc="1">
+                          <a:prstTxWarp prst="textNoShape">
+                            <a:avLst/>
+                          </a:prstTxWarp>
+                          <a:noAutofit/>
+                        </wps:bodyPr>
+                      </wps:wsp>
+                    </wpg:wgp>
+                  </a:graphicData>
+                </a:graphic>
+              </wp:anchor>
+            </w:drawing>
+          </mc:Choice>
+          <mc:Fallback>
+            <w:pict>
+              <v:group w14:anchorId="384F496A" id="_x0000_s1154" style="position:absolute;margin-left:570.85pt;margin-top:4.15pt;width:68.85pt;height:38.6pt;z-index:251697152" coordsize="8746,4903" o:gfxdata="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">
+                <v:shape id="Diamond 10" o:spid="_x0000_s1155" type="#_x0000_t4" style="position:absolute;width:8746;height:4903;visibility:visible;mso-wrap-style:square;v-text-anchor:middle" o:gfxdata="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" filled="f" strokecolor="#172c51" strokeweight=".5pt"/>
+                <v:shape id="Text Box 11" o:spid="_x0000_s1156" type="#_x0000_t202" style="position:absolute;left:1305;top:592;width:6284;height:3776;visibility:visible;mso-wrap-style:square;v-text-anchor:top" o:gfxdata="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" filled="f" stroked="f" strokeweight=".5pt">
+                  <v:textbox>
+                    <w:txbxContent>
+                      <w:p>
+                        <w:pPr>
+                          <w:jc w:val="center"/>
+                          <w:rPr>
+                            <w:sz w:val="16"/>
+                            <w:szCs w:val="16"/>
+                          </w:rPr>
+                        </w:pPr>
+                        <w:r>
+                          <w:rPr>
+                            <w:sz w:val="16"/>
+                            <w:szCs w:val="16"/>
+                          </w:rPr>
+                          <w:t>Assigned to</w:t>
+                        </w:r>
+                      </w:p>
+                    </w:txbxContent>
+                  </v:textbox>
+                </v:shape>
+              </v:group>
+            </w:pict>
+          </mc:Fallback>
+        </mc:AlternateContent>
+      </w:r>
+      <w:r>
+        <w:rPr>
+          <w:noProof/>
+          <w:sz w:val="16"/>
+          <w:szCs w:val="16"/>
+        </w:rPr>
+        <mc:AlternateContent>
+          <mc:Choice Requires="wpg">
+            <w:drawing>
+              <wp:anchor distT="0" distB="0" distL="114300" distR="114300" simplePos="0" relativeHeight="251894784" behindDoc="0" locked="0" layoutInCell="1" allowOverlap="1" wp14:anchorId="7DFFDDB4" wp14:editId="2BC4A880">
                 <wp:simplePos x="0" y="0"/>
                 <wp:positionH relativeFrom="column">
                   <wp:posOffset>16386810</wp:posOffset>
@@ -7693,10 +8127,10 @@
           </mc:Choice>
           <mc:Fallback>
             <w:pict>
-              <v:group w14:anchorId="7DFFDDB4" id="_x0000_s1151" style="position:absolute;margin-left:1290.3pt;margin-top:24.6pt;width:68.85pt;height:38.6pt;z-index:251894784" coordsize="8743,4902" o:gfxdata="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">
-                <v:group id="_x0000_s1152" style="position:absolute;width:8743;height:4902" coordsize="8746,4903" o:gfxdata="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">
-                  <v:shape id="Diamond 10" o:spid="_x0000_s1153" type="#_x0000_t4" style="position:absolute;width:8746;height:4903;visibility:visible;mso-wrap-style:square;v-text-anchor:middle" o:gfxdata="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" filled="f" strokecolor="#172c51" strokeweight=".5pt"/>
-                  <v:shape id="Text Box 11" o:spid="_x0000_s1154" type="#_x0000_t202" style="position:absolute;left:2821;top:1532;width:5135;height:2551;visibility:visible;mso-wrap-style:square;v-text-anchor:top" o:gfxdata="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" filled="f" stroked="f" strokeweight=".5pt">
+              <v:group w14:anchorId="7DFFDDB4" id="_x0000_s1157" style="position:absolute;margin-left:1290.3pt;margin-top:24.6pt;width:68.85pt;height:38.6pt;z-index:251894784" coordsize="8743,4902" o:gfxdata="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">
+                <v:group id="_x0000_s1158" style="position:absolute;width:8743;height:4902" coordsize="8746,4903" o:gfxdata="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">
+                  <v:shape id="Diamond 10" o:spid="_x0000_s1159" type="#_x0000_t4" style="position:absolute;width:8746;height:4903;visibility:visible;mso-wrap-style:square;v-text-anchor:middle" o:gfxdata="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" filled="f" strokecolor="#172c51" strokeweight=".5pt"/>
+                  <v:shape id="Text Box 11" o:spid="_x0000_s1160" type="#_x0000_t202" style="position:absolute;left:2821;top:1532;width:5135;height:2551;visibility:visible;mso-wrap-style:square;v-text-anchor:top" o:gfxdata="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" filled="f" stroked="f" strokeweight=".5pt">
                     <v:textbox>
                       <w:txbxContent>
                         <w:p>
@@ -7718,7 +8152,7 @@
                     </v:textbox>
                   </v:shape>
                 </v:group>
-                <v:shape id="Diamond 185" o:spid="_x0000_s1155" type="#_x0000_t4" style="position:absolute;left:285;top:219;width:8131;height:4448;visibility:visible;mso-wrap-style:square;v-text-anchor:middle" o:gfxdata="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" filled="f" strokecolor="#172c51" strokeweight=".5pt"/>
+                <v:shape id="Diamond 185" o:spid="_x0000_s1161" type="#_x0000_t4" style="position:absolute;left:285;top:219;width:8131;height:4448;visibility:visible;mso-wrap-style:square;v-text-anchor:middle" o:gfxdata="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" filled="f" strokecolor="#172c51" strokeweight=".5pt"/>
               </v:group>
             </w:pict>
           </mc:Fallback>
@@ -7818,14 +8252,7 @@
                                   <w:sz w:val="16"/>
                                   <w:szCs w:val="16"/>
                                 </w:rPr>
-                                <w:t>G</w:t>
-                              </w:r>
-                              <w:r>
-                                <w:rPr>
-                                  <w:sz w:val="16"/>
-                                  <w:szCs w:val="16"/>
-                                </w:rPr>
-                                <w:t>PA</w:t>
+                                <w:t>GPA</w:t>
                               </w:r>
                             </w:p>
                           </w:txbxContent>
@@ -7851,11 +8278,11 @@
           </mc:Choice>
           <mc:Fallback>
             <w:pict>
-              <v:group w14:anchorId="5BF0F761" id="_x0000_s1156" style="position:absolute;margin-left:1032.9pt;margin-top:9.2pt;width:84.55pt;height:31.15pt;z-index:251866112;mso-width-relative:margin;mso-height-relative:margin" coordsize="10747,3965" o:gfxdata="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">
-                <v:oval id="Oval 14" o:spid="_x0000_s1157" style="position:absolute;width:8150;height:2534;visibility:visible;mso-wrap-style:square;v-text-anchor:middle" o:gfxdata="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" filled="f" strokecolor="#172c51" strokeweight=".5pt">
+              <v:group w14:anchorId="5BF0F761" id="_x0000_s1162" style="position:absolute;margin-left:1032.9pt;margin-top:9.2pt;width:84.55pt;height:31.15pt;z-index:251866112;mso-width-relative:margin;mso-height-relative:margin" coordsize="10747,3965" o:gfxdata="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">
+                <v:oval id="Oval 14" o:spid="_x0000_s1163" style="position:absolute;width:8150;height:2534;visibility:visible;mso-wrap-style:square;v-text-anchor:middle" o:gfxdata="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" filled="f" strokecolor="#172c51" strokeweight=".5pt">
                   <v:stroke joinstyle="miter"/>
                 </v:oval>
-                <v:shape id="Text Box 15" o:spid="_x0000_s1158" type="#_x0000_t202" style="position:absolute;left:2166;top:56;width:8581;height:3909;visibility:visible;mso-wrap-style:square;v-text-anchor:top" o:gfxdata="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" filled="f" stroked="f" strokeweight=".5pt">
+                <v:shape id="Text Box 15" o:spid="_x0000_s1164" type="#_x0000_t202" style="position:absolute;left:2166;top:56;width:8581;height:3909;visibility:visible;mso-wrap-style:square;v-text-anchor:top" o:gfxdata="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" filled="f" stroked="f" strokeweight=".5pt">
                   <v:textbox>
                     <w:txbxContent>
                       <w:p>
@@ -7870,14 +8297,7 @@
                             <w:sz w:val="16"/>
                             <w:szCs w:val="16"/>
                           </w:rPr>
-                          <w:t>G</w:t>
-                        </w:r>
-                        <w:r>
-                          <w:rPr>
-                            <w:sz w:val="16"/>
-                            <w:szCs w:val="16"/>
-                          </w:rPr>
-                          <w:t>PA</w:t>
+                          <w:t>GPA</w:t>
                         </w:r>
                       </w:p>
                     </w:txbxContent>
@@ -7962,7 +8382,7 @@
         <mc:AlternateContent>
           <mc:Choice Requires="wps">
             <w:drawing>
-              <wp:anchor distT="0" distB="0" distL="114300" distR="114300" simplePos="0" relativeHeight="251699200" behindDoc="0" locked="0" layoutInCell="1" allowOverlap="1" wp14:anchorId="1B7FA8D4" wp14:editId="11064B83">
+              <wp:anchor distT="0" distB="0" distL="114300" distR="114300" simplePos="0" relativeHeight="251699200" behindDoc="0" locked="0" layoutInCell="1" allowOverlap="1" wp14:anchorId="1B7FA8D4" wp14:editId="09CDB58D">
                 <wp:simplePos x="0" y="0"/>
                 <wp:positionH relativeFrom="column">
                   <wp:posOffset>8121684</wp:posOffset>
@@ -8013,149 +8433,7 @@
           </mc:Choice>
           <mc:Fallback>
             <w:pict>
-              <v:shape w14:anchorId="3A25DD85" id="Connector: Elbow 35" o:spid="_x0000_s1026" type="#_x0000_t34" style="position:absolute;margin-left:639.5pt;margin-top:23.15pt;width:100.3pt;height:64.35pt;z-index:251699200;visibility:visible;mso-wrap-style:square;mso-wrap-distance-left:9pt;mso-wrap-distance-top:0;mso-wrap-distance-right:9pt;mso-wrap-distance-bottom:0;mso-position-horizontal:absolute;mso-position-horizontal-relative:text;mso-position-vertical:absolute;mso-position-vertical-relative:text" o:gfxdata="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" adj="3650" strokecolor="black [3200]" strokeweight=".5pt"/>
-            </w:pict>
-          </mc:Fallback>
-        </mc:AlternateContent>
-      </w:r>
-      <w:r>
-        <w:rPr>
-          <w:noProof/>
-          <w:sz w:val="16"/>
-          <w:szCs w:val="16"/>
-        </w:rPr>
-        <mc:AlternateContent>
-          <mc:Choice Requires="wpg">
-            <w:drawing>
-              <wp:anchor distT="0" distB="0" distL="114300" distR="114300" simplePos="0" relativeHeight="251697152" behindDoc="0" locked="0" layoutInCell="1" allowOverlap="1" wp14:anchorId="384F496A" wp14:editId="4C42564C">
-                <wp:simplePos x="0" y="0"/>
-                <wp:positionH relativeFrom="column">
-                  <wp:posOffset>7249069</wp:posOffset>
-                </wp:positionH>
-                <wp:positionV relativeFrom="paragraph">
-                  <wp:posOffset>51567</wp:posOffset>
-                </wp:positionV>
-                <wp:extent cx="874395" cy="490220"/>
-                <wp:effectExtent l="19050" t="19050" r="20955" b="43180"/>
-                <wp:wrapNone/>
-                <wp:docPr id="1914274484" name="Group 13"/>
-                <wp:cNvGraphicFramePr/>
-                <a:graphic xmlns:a="http://schemas.openxmlformats.org/drawingml/2006/main">
-                  <a:graphicData uri="http://schemas.microsoft.com/office/word/2010/wordprocessingGroup">
-                    <wpg:wgp>
-                      <wpg:cNvGrpSpPr/>
-                      <wpg:grpSpPr>
-                        <a:xfrm>
-                          <a:off x="0" y="0"/>
-                          <a:ext cx="874395" cy="490220"/>
-                          <a:chOff x="0" y="0"/>
-                          <a:chExt cx="874644" cy="490330"/>
-                        </a:xfrm>
-                      </wpg:grpSpPr>
-                      <wps:wsp>
-                        <wps:cNvPr id="1733087162" name="Diamond 10"/>
-                        <wps:cNvSpPr/>
-                        <wps:spPr>
-                          <a:xfrm>
-                            <a:off x="0" y="0"/>
-                            <a:ext cx="874644" cy="490330"/>
-                          </a:xfrm>
-                          <a:prstGeom prst="diamond">
-                            <a:avLst/>
-                          </a:prstGeom>
-                          <a:noFill/>
-                          <a:ln w="6350" cap="flat" cmpd="sng" algn="ctr">
-                            <a:solidFill>
-                              <a:srgbClr val="4472C4">
-                                <a:shade val="15000"/>
-                              </a:srgbClr>
-                            </a:solidFill>
-                            <a:prstDash val="solid"/>
-                            <a:miter lim="800000"/>
-                          </a:ln>
-                          <a:effectLst/>
-                        </wps:spPr>
-                        <wps:bodyPr rot="0" spcFirstLastPara="0" vertOverflow="overflow" horzOverflow="overflow" vert="horz" wrap="square" lIns="91440" tIns="45720" rIns="91440" bIns="45720" numCol="1" spcCol="0" rtlCol="0" fromWordArt="0" anchor="ctr" anchorCtr="0" forceAA="0" compatLnSpc="1">
-                          <a:prstTxWarp prst="textNoShape">
-                            <a:avLst/>
-                          </a:prstTxWarp>
-                          <a:noAutofit/>
-                        </wps:bodyPr>
-                      </wps:wsp>
-                      <wps:wsp>
-                        <wps:cNvPr id="279653698" name="Text Box 11"/>
-                        <wps:cNvSpPr txBox="1"/>
-                        <wps:spPr>
-                          <a:xfrm>
-                            <a:off x="159179" y="112732"/>
-                            <a:ext cx="628354" cy="255104"/>
-                          </a:xfrm>
-                          <a:prstGeom prst="rect">
-                            <a:avLst/>
-                          </a:prstGeom>
-                          <a:noFill/>
-                          <a:ln w="6350">
-                            <a:noFill/>
-                          </a:ln>
-                        </wps:spPr>
-                        <wps:txbx>
-                          <w:txbxContent>
-                            <w:p>
-                              <w:pPr>
-                                <w:rPr>
-                                  <w:sz w:val="16"/>
-                                  <w:szCs w:val="16"/>
-                                </w:rPr>
-                              </w:pPr>
-                              <w:r>
-                                <w:rPr>
-                                  <w:sz w:val="16"/>
-                                  <w:szCs w:val="16"/>
-                                </w:rPr>
-                                <w:t>Works at</w:t>
-                              </w:r>
-                            </w:p>
-                          </w:txbxContent>
-                        </wps:txbx>
-                        <wps:bodyPr rot="0" spcFirstLastPara="0" vertOverflow="overflow" horzOverflow="overflow" vert="horz" wrap="square" lIns="91440" tIns="45720" rIns="91440" bIns="45720" numCol="1" spcCol="0" rtlCol="0" fromWordArt="0" anchor="t" anchorCtr="0" forceAA="0" compatLnSpc="1">
-                          <a:prstTxWarp prst="textNoShape">
-                            <a:avLst/>
-                          </a:prstTxWarp>
-                          <a:noAutofit/>
-                        </wps:bodyPr>
-                      </wps:wsp>
-                    </wpg:wgp>
-                  </a:graphicData>
-                </a:graphic>
-              </wp:anchor>
-            </w:drawing>
-          </mc:Choice>
-          <mc:Fallback>
-            <w:pict>
-              <v:group w14:anchorId="384F496A" id="_x0000_s1159" style="position:absolute;margin-left:570.8pt;margin-top:4.05pt;width:68.85pt;height:38.6pt;z-index:251697152" coordsize="8746,4903" o:gfxdata="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">
-                <v:shape id="Diamond 10" o:spid="_x0000_s1160" type="#_x0000_t4" style="position:absolute;width:8746;height:4903;visibility:visible;mso-wrap-style:square;v-text-anchor:middle" o:gfxdata="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" filled="f" strokecolor="#172c51" strokeweight=".5pt"/>
-                <v:shape id="Text Box 11" o:spid="_x0000_s1161" type="#_x0000_t202" style="position:absolute;left:1591;top:1127;width:6284;height:2551;visibility:visible;mso-wrap-style:square;v-text-anchor:top" o:gfxdata="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" filled="f" stroked="f" strokeweight=".5pt">
-                  <v:textbox>
-                    <w:txbxContent>
-                      <w:p>
-                        <w:pPr>
-                          <w:rPr>
-                            <w:sz w:val="16"/>
-                            <w:szCs w:val="16"/>
-                          </w:rPr>
-                        </w:pPr>
-                        <w:r>
-                          <w:rPr>
-                            <w:sz w:val="16"/>
-                            <w:szCs w:val="16"/>
-                          </w:rPr>
-                          <w:t>Works at</w:t>
-                        </w:r>
-                      </w:p>
-                    </w:txbxContent>
-                  </v:textbox>
-                </v:shape>
-              </v:group>
+              <v:shape w14:anchorId="198AEA8A" id="Connector: Elbow 35" o:spid="_x0000_s1026" type="#_x0000_t34" style="position:absolute;margin-left:639.5pt;margin-top:23.15pt;width:100.3pt;height:64.35pt;z-index:251699200;visibility:visible;mso-wrap-style:square;mso-wrap-distance-left:9pt;mso-wrap-distance-top:0;mso-wrap-distance-right:9pt;mso-wrap-distance-bottom:0;mso-position-horizontal:absolute;mso-position-horizontal-relative:text;mso-position-vertical:absolute;mso-position-vertical-relative:text" o:gfxdata="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" adj="3650" strokecolor="black [3200]" strokeweight=".5pt"/>
             </w:pict>
           </mc:Fallback>
         </mc:AlternateContent>
@@ -8274,9 +8552,9 @@
           </mc:Choice>
           <mc:Fallback>
             <w:pict>
-              <v:group w14:anchorId="5825C421" id="_x0000_s1162" style="position:absolute;margin-left:729.55pt;margin-top:8.95pt;width:68.85pt;height:38.6pt;z-index:251694080" coordsize="8746,4903" o:gfxdata="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">
-                <v:shape id="Diamond 10" o:spid="_x0000_s1163" type="#_x0000_t4" style="position:absolute;width:8746;height:4903;visibility:visible;mso-wrap-style:square;v-text-anchor:middle" o:gfxdata="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" filled="f" strokecolor="#172c51" strokeweight=".5pt"/>
-                <v:shape id="Text Box 11" o:spid="_x0000_s1164" type="#_x0000_t202" style="position:absolute;left:1591;top:1127;width:6284;height:2551;visibility:visible;mso-wrap-style:square;v-text-anchor:top" o:gfxdata="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" filled="f" stroked="f" strokeweight=".5pt">
+              <v:group w14:anchorId="5825C421" id="_x0000_s1165" style="position:absolute;margin-left:729.55pt;margin-top:8.95pt;width:68.85pt;height:38.6pt;z-index:251694080" coordsize="8746,4903" o:gfxdata="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">
+                <v:shape id="Diamond 10" o:spid="_x0000_s1166" type="#_x0000_t4" style="position:absolute;width:8746;height:4903;visibility:visible;mso-wrap-style:square;v-text-anchor:middle" o:gfxdata="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" filled="f" strokecolor="#172c51" strokeweight=".5pt"/>
+                <v:shape id="Text Box 11" o:spid="_x0000_s1167" type="#_x0000_t202" style="position:absolute;left:1591;top:1127;width:6284;height:2551;visibility:visible;mso-wrap-style:square;v-text-anchor:top" o:gfxdata="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" filled="f" stroked="f" strokeweight=".5pt">
                   <v:textbox>
                     <w:txbxContent>
                       <w:p>
@@ -8318,7 +8596,7 @@
         <mc:AlternateContent>
           <mc:Choice Requires="wpg">
             <w:drawing>
-              <wp:anchor distT="0" distB="0" distL="114300" distR="114300" simplePos="0" relativeHeight="251774976" behindDoc="0" locked="0" layoutInCell="1" allowOverlap="1" wp14:anchorId="3C71EE6C" wp14:editId="2F977D99">
+              <wp:anchor distT="0" distB="0" distL="114300" distR="114300" simplePos="0" relativeHeight="251774976" behindDoc="0" locked="0" layoutInCell="1" allowOverlap="1" wp14:anchorId="3C71EE6C" wp14:editId="4CBF686E">
                 <wp:simplePos x="0" y="0"/>
                 <wp:positionH relativeFrom="column">
                   <wp:posOffset>15007167</wp:posOffset>
@@ -8465,10 +8743,10 @@
           </mc:Choice>
           <mc:Fallback>
             <w:pict>
-              <v:group w14:anchorId="3C71EE6C" id="_x0000_s1165" style="position:absolute;margin-left:1181.65pt;margin-top:24.75pt;width:68.85pt;height:38.6pt;z-index:251774976" coordsize="8743,4902" o:gfxdata="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">
-                <v:group id="_x0000_s1166" style="position:absolute;width:8743;height:4902" coordsize="8746,4903" o:gfxdata="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">
-                  <v:shape id="Diamond 10" o:spid="_x0000_s1167" type="#_x0000_t4" style="position:absolute;width:8746;height:4903;visibility:visible;mso-wrap-style:square;v-text-anchor:middle" o:gfxdata="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" filled="f" strokecolor="#172c51" strokeweight=".5pt"/>
-                  <v:shape id="Text Box 11" o:spid="_x0000_s1168" type="#_x0000_t202" style="position:absolute;left:2821;top:1532;width:5135;height:2551;visibility:visible;mso-wrap-style:square;v-text-anchor:top" o:gfxdata="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" filled="f" stroked="f" strokeweight=".5pt">
+              <v:group w14:anchorId="3C71EE6C" id="_x0000_s1168" style="position:absolute;margin-left:1181.65pt;margin-top:24.75pt;width:68.85pt;height:38.6pt;z-index:251774976" coordsize="8743,4902" o:gfxdata="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">
+                <v:group id="_x0000_s1169" style="position:absolute;width:8743;height:4902" coordsize="8746,4903" o:gfxdata="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">
+                  <v:shape id="Diamond 10" o:spid="_x0000_s1170" type="#_x0000_t4" style="position:absolute;width:8746;height:4903;visibility:visible;mso-wrap-style:square;v-text-anchor:middle" o:gfxdata="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" filled="f" strokecolor="#172c51" strokeweight=".5pt"/>
+                  <v:shape id="Text Box 11" o:spid="_x0000_s1171" type="#_x0000_t202" style="position:absolute;left:2821;top:1532;width:5135;height:2551;visibility:visible;mso-wrap-style:square;v-text-anchor:top" o:gfxdata="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" filled="f" stroked="f" strokeweight=".5pt">
                     <v:textbox>
                       <w:txbxContent>
                         <w:p>
@@ -8490,7 +8768,7 @@
                     </v:textbox>
                   </v:shape>
                 </v:group>
-                <v:shape id="Diamond 185" o:spid="_x0000_s1169" type="#_x0000_t4" style="position:absolute;left:285;top:219;width:8131;height:4448;visibility:visible;mso-wrap-style:square;v-text-anchor:middle" o:gfxdata="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" filled="f" strokecolor="#172c51" strokeweight=".5pt"/>
+                <v:shape id="Diamond 185" o:spid="_x0000_s1172" type="#_x0000_t4" style="position:absolute;left:285;top:219;width:8131;height:4448;visibility:visible;mso-wrap-style:square;v-text-anchor:middle" o:gfxdata="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" filled="f" strokecolor="#172c51" strokeweight=".5pt"/>
               </v:group>
             </w:pict>
           </mc:Fallback>
@@ -8681,11 +8959,11 @@
           </mc:Choice>
           <mc:Fallback>
             <w:pict>
-              <v:group w14:anchorId="15A548AE" id="_x0000_s1170" style="position:absolute;margin-left:1085.15pt;margin-top:15.5pt;width:81.7pt;height:31.15pt;z-index:251864064;mso-width-relative:margin;mso-height-relative:margin" coordsize="10380,3965" o:gfxdata="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">
-                <v:oval id="Oval 14" o:spid="_x0000_s1171" style="position:absolute;width:8150;height:2534;visibility:visible;mso-wrap-style:square;v-text-anchor:middle" o:gfxdata="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" filled="f" strokecolor="#172c51" strokeweight=".5pt">
+              <v:group w14:anchorId="15A548AE" id="_x0000_s1173" style="position:absolute;margin-left:1085.15pt;margin-top:15.5pt;width:81.7pt;height:31.15pt;z-index:251864064;mso-width-relative:margin;mso-height-relative:margin" coordsize="10380,3965" o:gfxdata="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">
+                <v:oval id="Oval 14" o:spid="_x0000_s1174" style="position:absolute;width:8150;height:2534;visibility:visible;mso-wrap-style:square;v-text-anchor:middle" o:gfxdata="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" filled="f" strokecolor="#172c51" strokeweight=".5pt">
                   <v:stroke joinstyle="miter"/>
                 </v:oval>
-                <v:shape id="Text Box 15" o:spid="_x0000_s1172" type="#_x0000_t202" style="position:absolute;left:1799;top:56;width:8581;height:3909;visibility:visible;mso-wrap-style:square;v-text-anchor:top" o:gfxdata="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" filled="f" stroked="f" strokeweight=".5pt">
+                <v:shape id="Text Box 15" o:spid="_x0000_s1175" type="#_x0000_t202" style="position:absolute;left:1799;top:56;width:8581;height:3909;visibility:visible;mso-wrap-style:square;v-text-anchor:top" o:gfxdata="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" filled="f" stroked="f" strokeweight=".5pt">
                   <v:textbox>
                     <w:txbxContent>
                       <w:p>
@@ -8832,11 +9110,11 @@
           </mc:Choice>
           <mc:Fallback>
             <w:pict>
-              <v:group w14:anchorId="34C8C3FA" id="_x0000_s1173" style="position:absolute;margin-left:983.1pt;margin-top:15.55pt;width:79.25pt;height:30.75pt;z-index:251859968;mso-width-relative:margin" coordorigin=",-18" coordsize="10069,3909" o:gfxdata="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">
-                <v:oval id="Oval 14" o:spid="_x0000_s1174" style="position:absolute;width:8150;height:2534;visibility:visible;mso-wrap-style:square;v-text-anchor:middle" o:gfxdata="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" filled="f" strokecolor="#172c51" strokeweight=".5pt">
+              <v:group w14:anchorId="34C8C3FA" id="_x0000_s1176" style="position:absolute;margin-left:983.1pt;margin-top:15.55pt;width:79.25pt;height:30.75pt;z-index:251859968;mso-width-relative:margin" coordorigin=",-18" coordsize="10069,3909" o:gfxdata="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">
+                <v:oval id="Oval 14" o:spid="_x0000_s1177" style="position:absolute;width:8150;height:2534;visibility:visible;mso-wrap-style:square;v-text-anchor:middle" o:gfxdata="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" filled="f" strokecolor="#172c51" strokeweight=".5pt">
                   <v:stroke joinstyle="miter"/>
                 </v:oval>
-                <v:shape id="Text Box 15" o:spid="_x0000_s1175" type="#_x0000_t202" style="position:absolute;left:1488;top:-18;width:8581;height:3909;visibility:visible;mso-wrap-style:square;v-text-anchor:top" o:gfxdata="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" filled="f" stroked="f" strokeweight=".5pt">
+                <v:shape id="Text Box 15" o:spid="_x0000_s1178" type="#_x0000_t202" style="position:absolute;left:1488;top:-18;width:8581;height:3909;visibility:visible;mso-wrap-style:square;v-text-anchor:top" o:gfxdata="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" filled="f" stroked="f" strokeweight=".5pt">
                   <v:textbox>
                     <w:txbxContent>
                       <w:p>
@@ -8948,7 +9226,7 @@
         <mc:AlternateContent>
           <mc:Choice Requires="wpg">
             <w:drawing>
-              <wp:anchor distT="0" distB="0" distL="114300" distR="114300" simplePos="0" relativeHeight="251902976" behindDoc="0" locked="0" layoutInCell="1" allowOverlap="1" wp14:anchorId="72A1557C" wp14:editId="6D4E3B6B">
+              <wp:anchor distT="0" distB="0" distL="114300" distR="114300" simplePos="0" relativeHeight="251902976" behindDoc="0" locked="0" layoutInCell="1" allowOverlap="1" wp14:anchorId="72A1557C" wp14:editId="054CFDFF">
                 <wp:simplePos x="0" y="0"/>
                 <wp:positionH relativeFrom="column">
                   <wp:posOffset>15609490</wp:posOffset>
@@ -9041,7 +9319,7 @@
           </mc:Choice>
           <mc:Fallback>
             <w:pict>
-              <v:group w14:anchorId="0F49E85D" id="Group 232" o:spid="_x0000_s1026" style="position:absolute;margin-left:1229.1pt;margin-top:13.3pt;width:95.7pt;height:142.75pt;z-index:251902976" coordsize="12154,18129" o:gfxdata="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">
+              <v:group w14:anchorId="7C083D2B" id="Group 232" o:spid="_x0000_s1026" style="position:absolute;margin-left:1229.1pt;margin-top:13.3pt;width:95.7pt;height:142.75pt;z-index:251902976" coordsize="12154,18129" o:gfxdata="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">
                 <v:shape id="Connector: Elbow 230" o:spid="_x0000_s1027" type="#_x0000_t34" style="position:absolute;top:4615;width:9493;height:13514;flip:y;visibility:visible;mso-wrap-style:square" o:connectortype="elbow" o:gfxdata="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" adj="93" strokecolor="black [3200]" strokeweight=".5pt"/>
                 <v:shape id="Connector: Elbow 231" o:spid="_x0000_s1028" type="#_x0000_t34" style="position:absolute;left:9493;width:2661;height:4615;flip:x;visibility:visible;mso-wrap-style:square" o:connectortype="elbow" o:gfxdata="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" adj="-17" strokecolor="black [3200]" strokeweight=".5pt"/>
               </v:group>
@@ -9257,7 +9535,7 @@
           </mc:Choice>
           <mc:Fallback>
             <w:pict>
-              <v:shape w14:anchorId="4F2E2108" id="_x0000_s1176" type="#_x0000_t202" style="position:absolute;margin-left:784.55pt;margin-top:23.35pt;width:18.35pt;height:15.1pt;z-index:251830272;visibility:visible;mso-wrap-style:square;mso-width-percent:0;mso-height-percent:0;mso-wrap-distance-left:9pt;mso-wrap-distance-top:0;mso-wrap-distance-right:9pt;mso-wrap-distance-bottom:0;mso-position-horizontal:absolute;mso-position-horizontal-relative:text;mso-position-vertical:absolute;mso-position-vertical-relative:text;mso-width-percent:0;mso-height-percent:0;mso-width-relative:margin;mso-height-relative:margin;v-text-anchor:top" o:gfxdata="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" filled="f" stroked="f" strokeweight=".5pt">
+              <v:shape w14:anchorId="4F2E2108" id="_x0000_s1179" type="#_x0000_t202" style="position:absolute;margin-left:784.55pt;margin-top:23.35pt;width:18.35pt;height:15.1pt;z-index:251830272;visibility:visible;mso-wrap-style:square;mso-width-percent:0;mso-height-percent:0;mso-wrap-distance-left:9pt;mso-wrap-distance-top:0;mso-wrap-distance-right:9pt;mso-wrap-distance-bottom:0;mso-position-horizontal:absolute;mso-position-horizontal-relative:text;mso-position-vertical:absolute;mso-position-vertical-relative:text;mso-width-percent:0;mso-height-percent:0;mso-width-relative:margin;mso-height-relative:margin;v-text-anchor:top" o:gfxdata="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" filled="f" stroked="f" strokeweight=".5pt">
                 <v:textbox>
                   <w:txbxContent>
                     <w:p>
@@ -9360,7 +9638,7 @@
           </mc:Choice>
           <mc:Fallback>
             <w:pict>
-              <v:shape w14:anchorId="0335C3C7" id="_x0000_s1177" type="#_x0000_t202" style="position:absolute;margin-left:759pt;margin-top:18.05pt;width:18pt;height:22.35pt;z-index:251828224;visibility:visible;mso-wrap-style:square;mso-width-percent:0;mso-height-percent:0;mso-wrap-distance-left:9pt;mso-wrap-distance-top:0;mso-wrap-distance-right:9pt;mso-wrap-distance-bottom:0;mso-position-horizontal:absolute;mso-position-horizontal-relative:text;mso-position-vertical:absolute;mso-position-vertical-relative:text;mso-width-percent:0;mso-height-percent:0;mso-width-relative:margin;mso-height-relative:margin;v-text-anchor:top" o:gfxdata="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" filled="f" stroked="f" strokeweight=".5pt">
+              <v:shape w14:anchorId="0335C3C7" id="_x0000_s1180" type="#_x0000_t202" style="position:absolute;margin-left:759pt;margin-top:18.05pt;width:18pt;height:22.35pt;z-index:251828224;visibility:visible;mso-wrap-style:square;mso-width-percent:0;mso-height-percent:0;mso-wrap-distance-left:9pt;mso-wrap-distance-top:0;mso-wrap-distance-right:9pt;mso-wrap-distance-bottom:0;mso-position-horizontal:absolute;mso-position-horizontal-relative:text;mso-position-vertical:absolute;mso-position-vertical-relative:text;mso-width-percent:0;mso-height-percent:0;mso-width-relative:margin;mso-height-relative:margin;v-text-anchor:top" o:gfxdata="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" filled="f" stroked="f" strokeweight=".5pt">
                 <v:textbox>
                   <w:txbxContent>
                     <w:p>
@@ -9460,7 +9738,7 @@
           </mc:Choice>
           <mc:Fallback>
             <w:pict>
-              <v:shape w14:anchorId="162D9D7D" id="_x0000_s1178" type="#_x0000_t202" style="position:absolute;margin-left:724.5pt;margin-top:21.55pt;width:20pt;height:17.1pt;z-index:251813888;visibility:visible;mso-wrap-style:square;mso-width-percent:0;mso-wrap-distance-left:9pt;mso-wrap-distance-top:0;mso-wrap-distance-right:9pt;mso-wrap-distance-bottom:0;mso-position-horizontal:absolute;mso-position-horizontal-relative:text;mso-position-vertical:absolute;mso-position-vertical-relative:text;mso-width-percent:0;mso-width-relative:margin;v-text-anchor:top" o:gfxdata="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" filled="f" stroked="f" strokeweight=".5pt">
+              <v:shape w14:anchorId="162D9D7D" id="_x0000_s1181" type="#_x0000_t202" style="position:absolute;margin-left:724.5pt;margin-top:21.55pt;width:20pt;height:17.1pt;z-index:251813888;visibility:visible;mso-wrap-style:square;mso-width-percent:0;mso-wrap-distance-left:9pt;mso-wrap-distance-top:0;mso-wrap-distance-right:9pt;mso-wrap-distance-bottom:0;mso-position-horizontal:absolute;mso-position-horizontal-relative:text;mso-position-vertical:absolute;mso-position-vertical-relative:text;mso-width-percent:0;mso-width-relative:margin;v-text-anchor:top" o:gfxdata="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" filled="f" stroked="f" strokeweight=".5pt">
                 <v:textbox>
                   <w:txbxContent>
                     <w:p>
@@ -9495,11 +9773,114 @@
       <w:r>
         <w:rPr>
           <w:noProof/>
+          <w:sz w:val="16"/>
+          <w:szCs w:val="16"/>
         </w:rPr>
         <mc:AlternateContent>
           <mc:Choice Requires="wps">
             <w:drawing>
-              <wp:anchor distT="0" distB="0" distL="114300" distR="114300" simplePos="0" relativeHeight="251778048" behindDoc="0" locked="0" layoutInCell="1" allowOverlap="1" wp14:anchorId="6085D214" wp14:editId="22268274">
+              <wp:anchor distT="0" distB="0" distL="114300" distR="114300" simplePos="0" relativeHeight="251907072" behindDoc="0" locked="0" layoutInCell="1" allowOverlap="1" wp14:anchorId="3F4DBD7C" wp14:editId="670B4B70">
+                <wp:simplePos x="0" y="0"/>
+                <wp:positionH relativeFrom="column">
+                  <wp:posOffset>13428155</wp:posOffset>
+                </wp:positionH>
+                <wp:positionV relativeFrom="paragraph">
+                  <wp:posOffset>229235</wp:posOffset>
+                </wp:positionV>
+                <wp:extent cx="232833" cy="192071"/>
+                <wp:effectExtent l="0" t="0" r="0" b="0"/>
+                <wp:wrapNone/>
+                <wp:docPr id="1688905704" name="Text Box 190"/>
+                <wp:cNvGraphicFramePr/>
+                <a:graphic xmlns:a="http://schemas.openxmlformats.org/drawingml/2006/main">
+                  <a:graphicData uri="http://schemas.microsoft.com/office/word/2010/wordprocessingShape">
+                    <wps:wsp>
+                      <wps:cNvSpPr txBox="1"/>
+                      <wps:spPr>
+                        <a:xfrm>
+                          <a:off x="0" y="0"/>
+                          <a:ext cx="232833" cy="192071"/>
+                        </a:xfrm>
+                        <a:prstGeom prst="rect">
+                          <a:avLst/>
+                        </a:prstGeom>
+                        <a:noFill/>
+                        <a:ln w="6350">
+                          <a:noFill/>
+                        </a:ln>
+                      </wps:spPr>
+                      <wps:txbx>
+                        <w:txbxContent>
+                          <w:p>
+                            <w:pPr>
+                              <w:rPr>
+                                <w:sz w:val="16"/>
+                                <w:szCs w:val="16"/>
+                              </w:rPr>
+                            </w:pPr>
+                            <w:r>
+                              <w:rPr>
+                                <w:sz w:val="16"/>
+                                <w:szCs w:val="16"/>
+                              </w:rPr>
+                              <w:t>1</w:t>
+                            </w:r>
+                          </w:p>
+                        </w:txbxContent>
+                      </wps:txbx>
+                      <wps:bodyPr rot="0" spcFirstLastPara="0" vertOverflow="overflow" horzOverflow="overflow" vert="horz" wrap="square" lIns="91440" tIns="45720" rIns="91440" bIns="45720" numCol="1" spcCol="0" rtlCol="0" fromWordArt="0" anchor="t" anchorCtr="0" forceAA="0" compatLnSpc="1">
+                        <a:prstTxWarp prst="textNoShape">
+                          <a:avLst/>
+                        </a:prstTxWarp>
+                        <a:noAutofit/>
+                      </wps:bodyPr>
+                    </wps:wsp>
+                  </a:graphicData>
+                </a:graphic>
+                <wp14:sizeRelH relativeFrom="margin">
+                  <wp14:pctWidth>0</wp14:pctWidth>
+                </wp14:sizeRelH>
+                <wp14:sizeRelV relativeFrom="margin">
+                  <wp14:pctHeight>0</wp14:pctHeight>
+                </wp14:sizeRelV>
+              </wp:anchor>
+            </w:drawing>
+          </mc:Choice>
+          <mc:Fallback>
+            <w:pict>
+              <v:shape w14:anchorId="3F4DBD7C" id="_x0000_s1182" type="#_x0000_t202" style="position:absolute;margin-left:1057.35pt;margin-top:18.05pt;width:18.35pt;height:15.1pt;z-index:251907072;visibility:visible;mso-wrap-style:square;mso-width-percent:0;mso-height-percent:0;mso-wrap-distance-left:9pt;mso-wrap-distance-top:0;mso-wrap-distance-right:9pt;mso-wrap-distance-bottom:0;mso-position-horizontal:absolute;mso-position-horizontal-relative:text;mso-position-vertical:absolute;mso-position-vertical-relative:text;mso-width-percent:0;mso-height-percent:0;mso-width-relative:margin;mso-height-relative:margin;v-text-anchor:top" o:gfxdata="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" filled="f" stroked="f" strokeweight=".5pt">
+                <v:textbox>
+                  <w:txbxContent>
+                    <w:p>
+                      <w:pPr>
+                        <w:rPr>
+                          <w:sz w:val="16"/>
+                          <w:szCs w:val="16"/>
+                        </w:rPr>
+                      </w:pPr>
+                      <w:r>
+                        <w:rPr>
+                          <w:sz w:val="16"/>
+                          <w:szCs w:val="16"/>
+                        </w:rPr>
+                        <w:t>1</w:t>
+                      </w:r>
+                    </w:p>
+                  </w:txbxContent>
+                </v:textbox>
+              </v:shape>
+            </w:pict>
+          </mc:Fallback>
+        </mc:AlternateContent>
+      </w:r>
+      <w:r>
+        <w:rPr>
+          <w:noProof/>
+        </w:rPr>
+        <mc:AlternateContent>
+          <mc:Choice Requires="wps">
+            <w:drawing>
+              <wp:anchor distT="0" distB="0" distL="114300" distR="114300" simplePos="0" relativeHeight="251778048" behindDoc="0" locked="0" layoutInCell="1" allowOverlap="1" wp14:anchorId="6085D214" wp14:editId="4FC7B7D3">
                 <wp:simplePos x="0" y="0"/>
                 <wp:positionH relativeFrom="column">
                   <wp:posOffset>15442777</wp:posOffset>
@@ -9554,7 +9935,7 @@
           </mc:Choice>
           <mc:Fallback>
             <w:pict>
-              <v:line w14:anchorId="45E17B64" id="Straight Connector 73" o:spid="_x0000_s1026" style="position:absolute;z-index:251778048;visibility:visible;mso-wrap-style:square;mso-width-percent:0;mso-height-percent:0;mso-wrap-distance-left:9pt;mso-wrap-distance-top:0;mso-wrap-distance-right:9pt;mso-wrap-distance-bottom:0;mso-position-horizontal:absolute;mso-position-horizontal-relative:text;mso-position-vertical:absolute;mso-position-vertical-relative:text;mso-width-percent:0;mso-height-percent:0;mso-width-relative:margin;mso-height-relative:margin" from="1215.95pt,13.45pt" to="1215.95pt,131.5pt" o:gfxdata="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" strokecolor="black [3200]" strokeweight=".5pt">
+              <v:line w14:anchorId="5927A346" id="Straight Connector 73" o:spid="_x0000_s1026" style="position:absolute;z-index:251778048;visibility:visible;mso-wrap-style:square;mso-width-percent:0;mso-height-percent:0;mso-wrap-distance-left:9pt;mso-wrap-distance-top:0;mso-wrap-distance-right:9pt;mso-wrap-distance-bottom:0;mso-position-horizontal:absolute;mso-position-horizontal-relative:text;mso-position-vertical:absolute;mso-position-vertical-relative:text;mso-width-percent:0;mso-height-percent:0;mso-width-relative:margin;mso-height-relative:margin" from="1215.95pt,13.45pt" to="1215.95pt,131.5pt" o:gfxdata="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" strokecolor="black [3200]" strokeweight=".5pt">
                 <v:stroke joinstyle="miter"/>
               </v:line>
             </w:pict>
@@ -9777,8 +10158,8 @@
           </mc:Choice>
           <mc:Fallback>
             <w:pict>
-              <v:group w14:anchorId="4B0088A9" id="Group 52" o:spid="_x0000_s1179" style="position:absolute;margin-left:1044.5pt;margin-top:1.35pt;width:62.9pt;height:20.3pt;z-index:251857920;mso-width-relative:margin" coordsize="7992,2583" o:gfxdata="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">
-                <v:shape id="Text Box 7" o:spid="_x0000_s1180" type="#_x0000_t202" style="position:absolute;left:989;top:209;width:7003;height:2203;visibility:visible;mso-wrap-style:square;v-text-anchor:top" o:gfxdata="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" filled="f" stroked="f" strokeweight=".5pt">
+              <v:group w14:anchorId="4B0088A9" id="Group 52" o:spid="_x0000_s1183" style="position:absolute;margin-left:1044.5pt;margin-top:1.35pt;width:62.9pt;height:20.3pt;z-index:251857920;mso-width-relative:margin" coordsize="7992,2583" o:gfxdata="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">
+                <v:shape id="Text Box 7" o:spid="_x0000_s1184" type="#_x0000_t202" style="position:absolute;left:989;top:209;width:7003;height:2203;visibility:visible;mso-wrap-style:square;v-text-anchor:top" o:gfxdata="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" filled="f" stroked="f" strokeweight=".5pt">
                   <v:textbox>
                     <w:txbxContent>
                       <w:p>
@@ -9799,8 +10180,8 @@
                     </w:txbxContent>
                   </v:textbox>
                 </v:shape>
-                <v:rect id="Rectangle 8" o:spid="_x0000_s1181" style="position:absolute;left:225;top:184;width:6212;height:2201;visibility:visible;mso-wrap-style:square;v-text-anchor:middle" o:gfxdata="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" filled="f" strokecolor="#172c51" strokeweight=".5pt"/>
-                <v:rect id="Rectangle 51" o:spid="_x0000_s1182" style="position:absolute;width:6663;height:2583;visibility:visible;mso-wrap-style:square;v-text-anchor:middle" o:gfxdata="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" filled="f" strokecolor="#172c51" strokeweight=".5pt"/>
+                <v:rect id="Rectangle 8" o:spid="_x0000_s1185" style="position:absolute;left:225;top:184;width:6212;height:2201;visibility:visible;mso-wrap-style:square;v-text-anchor:middle" o:gfxdata="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" filled="f" strokecolor="#172c51" strokeweight=".5pt"/>
+                <v:rect id="Rectangle 51" o:spid="_x0000_s1186" style="position:absolute;width:6663;height:2583;visibility:visible;mso-wrap-style:square;v-text-anchor:middle" o:gfxdata="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" filled="f" strokecolor="#172c51" strokeweight=".5pt"/>
               </v:group>
             </w:pict>
           </mc:Fallback>
@@ -9881,7 +10262,7 @@
           </mc:Choice>
           <mc:Fallback>
             <w:pict>
-              <v:shape w14:anchorId="78E0B315" id="_x0000_s1183" type="#_x0000_t202" style="position:absolute;margin-left:722.5pt;margin-top:13.5pt;width:20pt;height:17.1pt;z-index:251815936;visibility:visible;mso-wrap-style:square;mso-width-percent:0;mso-wrap-distance-left:9pt;mso-wrap-distance-top:0;mso-wrap-distance-right:9pt;mso-wrap-distance-bottom:0;mso-position-horizontal:absolute;mso-position-horizontal-relative:text;mso-position-vertical:absolute;mso-position-vertical-relative:text;mso-width-percent:0;mso-width-relative:margin;v-text-anchor:top" o:gfxdata="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" filled="f" stroked="f" strokeweight=".5pt">
+              <v:shape w14:anchorId="78E0B315" id="_x0000_s1187" type="#_x0000_t202" style="position:absolute;margin-left:722.5pt;margin-top:13.5pt;width:20pt;height:17.1pt;z-index:251815936;visibility:visible;mso-wrap-style:square;mso-width-percent:0;mso-wrap-distance-left:9pt;mso-wrap-distance-top:0;mso-wrap-distance-right:9pt;mso-wrap-distance-bottom:0;mso-position-horizontal:absolute;mso-position-horizontal-relative:text;mso-position-vertical:absolute;mso-position-vertical-relative:text;mso-width-percent:0;mso-width-relative:margin;v-text-anchor:top" o:gfxdata="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" filled="f" stroked="f" strokeweight=".5pt">
                 <v:textbox>
                   <w:txbxContent>
                     <w:p>
@@ -10386,9 +10767,9 @@
           </mc:Choice>
           <mc:Fallback>
             <w:pict>
-              <v:group w14:anchorId="260B093F" id="Group 50" o:spid="_x0000_s1184" style="position:absolute;margin-left:687.8pt;margin-top:7.35pt;width:179.15pt;height:97.15pt;z-index:251719680" coordsize="22752,12335" o:gfxdata="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">
-                <v:group id="_x0000_s1185" style="position:absolute;left:6243;width:7496;height:2203" coordorigin="-357" coordsize="7502,2205" o:gfxdata="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">
-                  <v:shape id="Text Box 7" o:spid="_x0000_s1186" type="#_x0000_t202" style="position:absolute;left:-357;width:7501;height:2205;visibility:visible;mso-wrap-style:square;v-text-anchor:top" o:gfxdata="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" filled="f" stroked="f" strokeweight=".5pt">
+              <v:group w14:anchorId="260B093F" id="Group 50" o:spid="_x0000_s1188" style="position:absolute;margin-left:687.8pt;margin-top:7.35pt;width:179.15pt;height:97.15pt;z-index:251719680" coordsize="22752,12335" o:gfxdata="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">
+                <v:group id="_x0000_s1189" style="position:absolute;left:6243;width:7496;height:2203" coordorigin="-357" coordsize="7502,2205" o:gfxdata="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">
+                  <v:shape id="Text Box 7" o:spid="_x0000_s1190" type="#_x0000_t202" style="position:absolute;left:-357;width:7501;height:2205;visibility:visible;mso-wrap-style:square;v-text-anchor:top" o:gfxdata="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" filled="f" stroked="f" strokeweight=".5pt">
                     <v:textbox>
                       <w:txbxContent>
                         <w:p>
@@ -10425,13 +10806,13 @@
                       </w:txbxContent>
                     </v:textbox>
                   </v:shape>
-                  <v:rect id="Rectangle 8" o:spid="_x0000_s1187" style="position:absolute;width:6216;height:2203;visibility:visible;mso-wrap-style:square;v-text-anchor:middle" o:gfxdata="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" filled="f" strokecolor="#172c51" strokeweight=".5pt"/>
+                  <v:rect id="Rectangle 8" o:spid="_x0000_s1191" style="position:absolute;width:6216;height:2203;visibility:visible;mso-wrap-style:square;v-text-anchor:middle" o:gfxdata="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" filled="f" strokecolor="#172c51" strokeweight=".5pt"/>
                 </v:group>
-                <v:group id="_x0000_s1188" style="position:absolute;left:12044;top:5497;width:10708;height:3988" coordsize="10708,3992" o:gfxdata="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">
-                  <v:oval id="Oval 14" o:spid="_x0000_s1189" style="position:absolute;width:8150;height:2534;visibility:visible;mso-wrap-style:square;v-text-anchor:middle" o:gfxdata="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" filled="f" strokecolor="#172c51" strokeweight=".5pt">
+                <v:group id="_x0000_s1192" style="position:absolute;left:12044;top:5497;width:10708;height:3988" coordsize="10708,3992" o:gfxdata="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">
+                  <v:oval id="Oval 14" o:spid="_x0000_s1193" style="position:absolute;width:8150;height:2534;visibility:visible;mso-wrap-style:square;v-text-anchor:middle" o:gfxdata="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" filled="f" strokecolor="#172c51" strokeweight=".5pt">
                     <v:stroke joinstyle="miter"/>
                   </v:oval>
-                  <v:shape id="Text Box 15" o:spid="_x0000_s1190" type="#_x0000_t202" style="position:absolute;left:2127;top:82;width:8581;height:3910;visibility:visible;mso-wrap-style:square;v-text-anchor:top" o:gfxdata="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" filled="f" stroked="f" strokeweight=".5pt">
+                  <v:shape id="Text Box 15" o:spid="_x0000_s1194" type="#_x0000_t202" style="position:absolute;left:2127;top:82;width:8581;height:3910;visibility:visible;mso-wrap-style:square;v-text-anchor:top" o:gfxdata="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" filled="f" stroked="f" strokeweight=".5pt">
                     <v:textbox>
                       <w:txbxContent>
                         <w:p>
@@ -10453,11 +10834,11 @@
                     </v:textbox>
                   </v:shape>
                 </v:group>
-                <v:group id="_x0000_s1191" style="position:absolute;top:5469;width:9944;height:3906" coordorigin=",-21" coordsize="9944,3909" o:gfxdata="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">
-                  <v:oval id="Oval 14" o:spid="_x0000_s1192" style="position:absolute;width:8150;height:2534;visibility:visible;mso-wrap-style:square;v-text-anchor:middle" o:gfxdata="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" filled="f" strokecolor="#172c51" strokeweight=".5pt">
+                <v:group id="_x0000_s1195" style="position:absolute;top:5469;width:9944;height:3906" coordorigin=",-21" coordsize="9944,3909" o:gfxdata="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">
+                  <v:oval id="Oval 14" o:spid="_x0000_s1196" style="position:absolute;width:8150;height:2534;visibility:visible;mso-wrap-style:square;v-text-anchor:middle" o:gfxdata="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" filled="f" strokecolor="#172c51" strokeweight=".5pt">
                     <v:stroke joinstyle="miter"/>
                   </v:oval>
-                  <v:shape id="Text Box 15" o:spid="_x0000_s1193" type="#_x0000_t202" style="position:absolute;left:1363;top:-21;width:8581;height:3909;visibility:visible;mso-wrap-style:square;v-text-anchor:top" o:gfxdata="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" filled="f" stroked="f" strokeweight=".5pt">
+                  <v:shape id="Text Box 15" o:spid="_x0000_s1197" type="#_x0000_t202" style="position:absolute;left:1363;top:-21;width:8581;height:3909;visibility:visible;mso-wrap-style:square;v-text-anchor:top" o:gfxdata="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" filled="f" stroked="f" strokeweight=".5pt">
                     <v:textbox>
                       <w:txbxContent>
                         <w:p>
@@ -10483,11 +10864,11 @@
                     </v:textbox>
                   </v:shape>
                 </v:group>
-                <v:group id="_x0000_s1194" style="position:absolute;left:6022;top:8425;width:10414;height:3910" coordorigin="" coordsize="10414,3909" o:gfxdata="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">
-                  <v:oval id="Oval 14" o:spid="_x0000_s1195" style="position:absolute;width:8150;height:2534;visibility:visible;mso-wrap-style:square;v-text-anchor:middle" o:gfxdata="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" filled="f" strokecolor="#172c51" strokeweight=".5pt">
+                <v:group id="_x0000_s1198" style="position:absolute;left:6022;top:8425;width:10414;height:3910" coordorigin="" coordsize="10414,3909" o:gfxdata="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">
+                  <v:oval id="Oval 14" o:spid="_x0000_s1199" style="position:absolute;width:8150;height:2534;visibility:visible;mso-wrap-style:square;v-text-anchor:middle" o:gfxdata="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" filled="f" strokecolor="#172c51" strokeweight=".5pt">
                     <v:stroke joinstyle="miter"/>
                   </v:oval>
-                  <v:shape id="Text Box 15" o:spid="_x0000_s1196" type="#_x0000_t202" style="position:absolute;left:1833;width:8581;height:3909;visibility:visible;mso-wrap-style:square;v-text-anchor:top" o:gfxdata="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" filled="f" stroked="f" strokeweight=".5pt">
+                  <v:shape id="Text Box 15" o:spid="_x0000_s1200" type="#_x0000_t202" style="position:absolute;left:1833;width:8581;height:3909;visibility:visible;mso-wrap-style:square;v-text-anchor:top" o:gfxdata="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" filled="f" stroked="f" strokeweight=".5pt">
                     <v:textbox>
                       <w:txbxContent>
                         <w:p>
@@ -10509,13 +10890,13 @@
                     </v:textbox>
                   </v:shape>
                 </v:group>
-                <v:line id="Straight Connector 47" o:spid="_x0000_s1197" style="position:absolute;flip:x;visibility:visible;mso-wrap-style:square" from="9945,2182" to="9947,8384" o:connectortype="straight" o:gfxdata="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" strokecolor="black [3200]" strokeweight=".5pt">
+                <v:line id="Straight Connector 47" o:spid="_x0000_s1201" style="position:absolute;flip:x;visibility:visible;mso-wrap-style:square" from="9945,2182" to="9947,8384" o:connectortype="straight" o:gfxdata="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" strokecolor="black [3200]" strokeweight=".5pt">
                   <v:stroke joinstyle="miter"/>
                 </v:line>
-                <v:line id="Straight Connector 48" o:spid="_x0000_s1198" style="position:absolute;flip:x;visibility:visible;mso-wrap-style:square" from="3839,2182" to="8149,5469" o:connectortype="straight" o:gfxdata="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" strokecolor="black [3200]" strokeweight=".5pt">
+                <v:line id="Straight Connector 48" o:spid="_x0000_s1202" style="position:absolute;flip:x;visibility:visible;mso-wrap-style:square" from="3839,2182" to="8149,5469" o:connectortype="straight" o:gfxdata="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" strokecolor="black [3200]" strokeweight=".5pt">
                   <v:stroke joinstyle="miter"/>
                 </v:line>
-                <v:line id="Straight Connector 49" o:spid="_x0000_s1199" style="position:absolute;visibility:visible;mso-wrap-style:square" from="11575,2182" to="16188,5465" o:connectortype="straight" o:gfxdata="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" strokecolor="black [3200]" strokeweight=".5pt">
+                <v:line id="Straight Connector 49" o:spid="_x0000_s1203" style="position:absolute;visibility:visible;mso-wrap-style:square" from="11575,2182" to="16188,5465" o:connectortype="straight" o:gfxdata="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" strokecolor="black [3200]" strokeweight=".5pt">
                   <v:stroke joinstyle="miter"/>
                 </v:line>
               </v:group>
@@ -10615,7 +10996,7 @@
         <mc:AlternateContent>
           <mc:Choice Requires="wpg">
             <w:drawing>
-              <wp:anchor distT="0" distB="0" distL="114300" distR="114300" simplePos="0" relativeHeight="251731968" behindDoc="0" locked="0" layoutInCell="1" allowOverlap="1" wp14:anchorId="62221424" wp14:editId="2A600125">
+              <wp:anchor distT="0" distB="0" distL="114300" distR="114300" simplePos="0" relativeHeight="251731968" behindDoc="0" locked="0" layoutInCell="1" allowOverlap="1" wp14:anchorId="62221424" wp14:editId="195C00E6">
                 <wp:simplePos x="0" y="0"/>
                 <wp:positionH relativeFrom="column">
                   <wp:posOffset>11412008</wp:posOffset>
@@ -10720,9 +11101,9 @@
           </mc:Choice>
           <mc:Fallback>
             <w:pict>
-              <v:group w14:anchorId="62221424" id="_x0000_s1200" style="position:absolute;margin-left:898.6pt;margin-top:10.6pt;width:68.85pt;height:38.6pt;z-index:251731968" coordsize="8746,4903" o:gfxdata="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">
-                <v:shape id="Diamond 10" o:spid="_x0000_s1201" type="#_x0000_t4" style="position:absolute;width:8746;height:4903;visibility:visible;mso-wrap-style:square;v-text-anchor:middle" o:gfxdata="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" filled="f" strokecolor="#172c51" strokeweight=".5pt"/>
-                <v:shape id="Text Box 11" o:spid="_x0000_s1202" type="#_x0000_t202" style="position:absolute;left:1923;top:1127;width:5499;height:2551;visibility:visible;mso-wrap-style:square;v-text-anchor:top" o:gfxdata="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" filled="f" stroked="f" strokeweight=".5pt">
+              <v:group w14:anchorId="62221424" id="_x0000_s1204" style="position:absolute;margin-left:898.6pt;margin-top:10.6pt;width:68.85pt;height:38.6pt;z-index:251731968" coordsize="8746,4903" o:gfxdata="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">
+                <v:shape id="Diamond 10" o:spid="_x0000_s1205" type="#_x0000_t4" style="position:absolute;width:8746;height:4903;visibility:visible;mso-wrap-style:square;v-text-anchor:middle" o:gfxdata="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" filled="f" strokecolor="#172c51" strokeweight=".5pt"/>
+                <v:shape id="Text Box 11" o:spid="_x0000_s1206" type="#_x0000_t202" style="position:absolute;left:1923;top:1127;width:5499;height:2551;visibility:visible;mso-wrap-style:square;v-text-anchor:top" o:gfxdata="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" filled="f" stroked="f" strokeweight=".5pt">
                   <v:textbox>
                     <w:txbxContent>
                       <w:p>
@@ -10764,7 +11145,7 @@
         <mc:AlternateContent>
           <mc:Choice Requires="wpg">
             <w:drawing>
-              <wp:anchor distT="0" distB="0" distL="114300" distR="114300" simplePos="0" relativeHeight="251806720" behindDoc="0" locked="0" layoutInCell="1" allowOverlap="1" wp14:anchorId="38E355A5" wp14:editId="5B00C745">
+              <wp:anchor distT="0" distB="0" distL="114300" distR="114300" simplePos="0" relativeHeight="251806720" behindDoc="0" locked="0" layoutInCell="1" allowOverlap="1" wp14:anchorId="38E355A5" wp14:editId="487A24B3">
                 <wp:simplePos x="0" y="0"/>
                 <wp:positionH relativeFrom="column">
                   <wp:posOffset>14103458</wp:posOffset>
@@ -11414,9 +11795,9 @@
           </mc:Choice>
           <mc:Fallback>
             <w:pict>
-              <v:group w14:anchorId="38E355A5" id="Group 223" o:spid="_x0000_s1203" style="position:absolute;margin-left:1110.5pt;margin-top:14.2pt;width:220.5pt;height:136.9pt;z-index:251806720" coordsize="28002,17388" o:gfxdata="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">
-                <v:group id="_x0000_s1204" style="position:absolute;left:10151;top:5346;width:7003;height:2584" coordsize="7003,2583" o:gfxdata="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">
-                  <v:shape id="Text Box 7" o:spid="_x0000_s1205" type="#_x0000_t202" style="position:absolute;top:123;width:7003;height:2203;visibility:visible;mso-wrap-style:square;v-text-anchor:top" o:gfxdata="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" filled="f" stroked="f" strokeweight=".5pt">
+              <v:group w14:anchorId="38E355A5" id="Group 223" o:spid="_x0000_s1207" style="position:absolute;margin-left:1110.5pt;margin-top:14.2pt;width:220.5pt;height:136.9pt;z-index:251806720" coordsize="28002,17388" o:gfxdata="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">
+                <v:group id="_x0000_s1208" style="position:absolute;left:10151;top:5346;width:7003;height:2584" coordsize="7003,2583" o:gfxdata="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">
+                  <v:shape id="Text Box 7" o:spid="_x0000_s1209" type="#_x0000_t202" style="position:absolute;top:123;width:7003;height:2203;visibility:visible;mso-wrap-style:square;v-text-anchor:top" o:gfxdata="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" filled="f" stroked="f" strokeweight=".5pt">
                     <v:textbox>
                       <w:txbxContent>
                         <w:p>
@@ -11437,14 +11818,14 @@
                       </w:txbxContent>
                     </v:textbox>
                   </v:shape>
-                  <v:rect id="Rectangle 8" o:spid="_x0000_s1206" style="position:absolute;left:225;top:184;width:6212;height:2201;visibility:visible;mso-wrap-style:square;v-text-anchor:middle" o:gfxdata="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" filled="f" strokecolor="#172c51" strokeweight=".5pt"/>
-                  <v:rect id="Rectangle 51" o:spid="_x0000_s1207" style="position:absolute;width:6663;height:2583;visibility:visible;mso-wrap-style:square;v-text-anchor:middle" o:gfxdata="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" filled="f" strokecolor="#09101d [484]" strokeweight=".5pt"/>
+                  <v:rect id="Rectangle 8" o:spid="_x0000_s1210" style="position:absolute;left:225;top:184;width:6212;height:2201;visibility:visible;mso-wrap-style:square;v-text-anchor:middle" o:gfxdata="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" filled="f" strokecolor="#172c51" strokeweight=".5pt"/>
+                  <v:rect id="Rectangle 51" o:spid="_x0000_s1211" style="position:absolute;width:6663;height:2583;visibility:visible;mso-wrap-style:square;v-text-anchor:middle" o:gfxdata="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" filled="f" strokecolor="#09101d [484]" strokeweight=".5pt"/>
                 </v:group>
-                <v:group id="_x0000_s1208" style="position:absolute;width:8580;height:3909" coordorigin="-139" coordsize="8580,3909" o:gfxdata="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">
-                  <v:oval id="Oval 14" o:spid="_x0000_s1209" style="position:absolute;width:8150;height:2534;visibility:visible;mso-wrap-style:square;v-text-anchor:middle" o:gfxdata="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" filled="f" strokecolor="#172c51" strokeweight=".5pt">
+                <v:group id="_x0000_s1212" style="position:absolute;width:8580;height:3909" coordorigin="-139" coordsize="8580,3909" o:gfxdata="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">
+                  <v:oval id="Oval 14" o:spid="_x0000_s1213" style="position:absolute;width:8150;height:2534;visibility:visible;mso-wrap-style:square;v-text-anchor:middle" o:gfxdata="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" filled="f" strokecolor="#172c51" strokeweight=".5pt">
                     <v:stroke joinstyle="miter"/>
                   </v:oval>
-                  <v:shape id="Text Box 15" o:spid="_x0000_s1210" type="#_x0000_t202" style="position:absolute;left:-139;width:8580;height:3909;visibility:visible;mso-wrap-style:square;v-text-anchor:top" o:gfxdata="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" filled="f" stroked="f" strokeweight=".5pt">
+                  <v:shape id="Text Box 15" o:spid="_x0000_s1214" type="#_x0000_t202" style="position:absolute;left:-139;width:8580;height:3909;visibility:visible;mso-wrap-style:square;v-text-anchor:top" o:gfxdata="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" filled="f" stroked="f" strokeweight=".5pt">
                     <v:textbox>
                       <w:txbxContent>
                         <w:p>
@@ -11470,12 +11851,12 @@
                     </v:textbox>
                   </v:shape>
                 </v:group>
-                <v:group id="_x0000_s1211" style="position:absolute;left:17280;width:10722;height:4108" coordorigin=",2065" coordsize="10722,4108" o:gfxdata="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">
-                  <v:group id="_x0000_s1212" style="position:absolute;left:245;top:2167;width:10477;height:4007" coordorigin="-8908,2169" coordsize="10478,4011" o:gfxdata="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">
-                    <v:oval id="Oval 14" o:spid="_x0000_s1213" style="position:absolute;left:-8908;top:2169;width:8150;height:2535;visibility:visible;mso-wrap-style:square;v-text-anchor:middle" o:gfxdata="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" filled="f" strokecolor="#172c51" strokeweight=".5pt">
+                <v:group id="_x0000_s1215" style="position:absolute;left:17280;width:10722;height:4108" coordorigin=",2065" coordsize="10722,4108" o:gfxdata="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">
+                  <v:group id="_x0000_s1216" style="position:absolute;left:245;top:2167;width:10477;height:4007" coordorigin="-8908,2169" coordsize="10478,4011" o:gfxdata="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">
+                    <v:oval id="Oval 14" o:spid="_x0000_s1217" style="position:absolute;left:-8908;top:2169;width:8150;height:2535;visibility:visible;mso-wrap-style:square;v-text-anchor:middle" o:gfxdata="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" filled="f" strokecolor="#172c51" strokeweight=".5pt">
                       <v:stroke joinstyle="miter"/>
                     </v:oval>
-                    <v:shape id="Text Box 15" o:spid="_x0000_s1214" type="#_x0000_t202" style="position:absolute;left:-8369;top:2271;width:9939;height:3909;visibility:visible;mso-wrap-style:square;v-text-anchor:top" o:gfxdata="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" filled="f" stroked="f" strokeweight=".5pt">
+                    <v:shape id="Text Box 15" o:spid="_x0000_s1218" type="#_x0000_t202" style="position:absolute;left:-8369;top:2271;width:9939;height:3909;visibility:visible;mso-wrap-style:square;v-text-anchor:top" o:gfxdata="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" filled="f" stroked="f" strokeweight=".5pt">
                       <v:textbox>
                         <w:txbxContent>
                           <w:p>
@@ -11499,15 +11880,15 @@
                       </v:textbox>
                     </v:shape>
                   </v:group>
-                  <v:oval id="Oval 17" o:spid="_x0000_s1215" style="position:absolute;top:2065;width:8580;height:2789;visibility:visible;mso-wrap-style:square;v-text-anchor:middle" o:gfxdata="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" filled="f" strokecolor="#172c51" strokeweight=".5pt">
+                  <v:oval id="Oval 17" o:spid="_x0000_s1219" style="position:absolute;top:2065;width:8580;height:2789;visibility:visible;mso-wrap-style:square;v-text-anchor:middle" o:gfxdata="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" filled="f" strokecolor="#172c51" strokeweight=".5pt">
                     <v:stroke joinstyle="miter"/>
                   </v:oval>
                 </v:group>
-                <v:group id="_x0000_s1216" style="position:absolute;left:17048;top:13483;width:10547;height:3905" coordsize="10551,3909" o:gfxdata="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">
-                  <v:oval id="Oval 14" o:spid="_x0000_s1217" style="position:absolute;width:8150;height:2534;visibility:visible;mso-wrap-style:square;v-text-anchor:middle" o:gfxdata="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" filled="f" strokecolor="#172c51" strokeweight=".5pt">
+                <v:group id="_x0000_s1220" style="position:absolute;left:17048;top:13483;width:10547;height:3905" coordsize="10551,3909" o:gfxdata="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">
+                  <v:oval id="Oval 14" o:spid="_x0000_s1221" style="position:absolute;width:8150;height:2534;visibility:visible;mso-wrap-style:square;v-text-anchor:middle" o:gfxdata="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" filled="f" strokecolor="#172c51" strokeweight=".5pt">
                     <v:stroke joinstyle="miter"/>
                   </v:oval>
-                  <v:shape id="Text Box 15" o:spid="_x0000_s1218" type="#_x0000_t202" style="position:absolute;left:1970;width:8581;height:3909;visibility:visible;mso-wrap-style:square;v-text-anchor:top" o:gfxdata="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" filled="f" stroked="f" strokeweight=".5pt">
+                  <v:shape id="Text Box 15" o:spid="_x0000_s1222" type="#_x0000_t202" style="position:absolute;left:1970;width:8581;height:3909;visibility:visible;mso-wrap-style:square;v-text-anchor:top" o:gfxdata="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" filled="f" stroked="f" strokeweight=".5pt">
                     <v:textbox>
                       <w:txbxContent>
                         <w:p>
@@ -11529,11 +11910,11 @@
                     </v:textbox>
                   </v:shape>
                 </v:group>
-                <v:group id="_x0000_s1219" style="position:absolute;left:2092;top:11778;width:10350;height:3905" coordsize="10359,3909" o:gfxdata="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">
-                  <v:oval id="Oval 14" o:spid="_x0000_s1220" style="position:absolute;width:8150;height:2534;visibility:visible;mso-wrap-style:square;v-text-anchor:middle" o:gfxdata="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" filled="f" strokecolor="#172c51" strokeweight=".5pt">
+                <v:group id="_x0000_s1223" style="position:absolute;left:2092;top:11778;width:10350;height:3905" coordsize="10359,3909" o:gfxdata="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">
+                  <v:oval id="Oval 14" o:spid="_x0000_s1224" style="position:absolute;width:8150;height:2534;visibility:visible;mso-wrap-style:square;v-text-anchor:middle" o:gfxdata="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" filled="f" strokecolor="#172c51" strokeweight=".5pt">
                     <v:stroke joinstyle="miter"/>
                   </v:oval>
-                  <v:shape id="Text Box 15" o:spid="_x0000_s1221" type="#_x0000_t202" style="position:absolute;left:1778;width:8581;height:3909;visibility:visible;mso-wrap-style:square;v-text-anchor:top" o:gfxdata="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" filled="f" stroked="f" strokeweight=".5pt">
+                  <v:shape id="Text Box 15" o:spid="_x0000_s1225" type="#_x0000_t202" style="position:absolute;left:1778;width:8581;height:3909;visibility:visible;mso-wrap-style:square;v-text-anchor:top" o:gfxdata="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" filled="f" stroked="f" strokeweight=".5pt">
                     <v:textbox>
                       <w:txbxContent>
                         <w:p>
@@ -11555,16 +11936,16 @@
                     </v:textbox>
                   </v:shape>
                 </v:group>
-                <v:line id="Straight Connector 76" o:spid="_x0000_s1222" style="position:absolute;visibility:visible;mso-wrap-style:square" from="7594,1937" to="11207,5372" o:connectortype="straight" o:gfxdata="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" strokecolor="black [3200]" strokeweight=".5pt">
+                <v:line id="Straight Connector 76" o:spid="_x0000_s1226" style="position:absolute;visibility:visible;mso-wrap-style:square" from="7594,1937" to="11207,5372" o:connectortype="straight" o:gfxdata="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" strokecolor="black [3200]" strokeweight=".5pt">
                   <v:stroke joinstyle="miter"/>
                 </v:line>
-                <v:line id="Straight Connector 77" o:spid="_x0000_s1223" style="position:absolute;flip:y;visibility:visible;mso-wrap-style:square" from="6121,7904" to="11246,11775" o:connectortype="straight" o:gfxdata="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" strokecolor="black [3200]" strokeweight=".5pt">
+                <v:line id="Straight Connector 77" o:spid="_x0000_s1227" style="position:absolute;flip:y;visibility:visible;mso-wrap-style:square" from="6121,7904" to="11246,11775" o:connectortype="straight" o:gfxdata="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" strokecolor="black [3200]" strokeweight=".5pt">
                   <v:stroke joinstyle="miter"/>
                 </v:line>
-                <v:line id="Straight Connector 78" o:spid="_x0000_s1224" style="position:absolute;flip:y;visibility:visible;mso-wrap-style:square" from="15885,2557" to="19425,5334" o:connectortype="straight" o:gfxdata="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" strokecolor="black [3200]" strokeweight=".5pt">
+                <v:line id="Straight Connector 78" o:spid="_x0000_s1228" style="position:absolute;flip:y;visibility:visible;mso-wrap-style:square" from="15885,2557" to="19425,5334" o:connectortype="straight" o:gfxdata="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" strokecolor="black [3200]" strokeweight=".5pt">
                   <v:stroke joinstyle="miter"/>
                 </v:line>
-                <v:line id="Straight Connector 80" o:spid="_x0000_s1225" style="position:absolute;visibility:visible;mso-wrap-style:square" from="15498,7904" to="21131,13471" o:connectortype="straight" o:gfxdata="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" strokecolor="black [3200]" strokeweight=".5pt">
+                <v:line id="Straight Connector 80" o:spid="_x0000_s1229" style="position:absolute;visibility:visible;mso-wrap-style:square" from="15498,7904" to="21131,13471" o:connectortype="straight" o:gfxdata="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" strokecolor="black [3200]" strokeweight=".5pt">
                   <v:stroke joinstyle="miter"/>
                 </v:line>
               </v:group>
@@ -11698,7 +12079,110 @@
         <mc:AlternateContent>
           <mc:Choice Requires="wps">
             <w:drawing>
-              <wp:anchor distT="0" distB="0" distL="114300" distR="114300" simplePos="0" relativeHeight="251842560" behindDoc="0" locked="0" layoutInCell="1" allowOverlap="1" wp14:anchorId="1503459B" wp14:editId="619DF0CB">
+              <wp:anchor distT="0" distB="0" distL="114300" distR="114300" simplePos="0" relativeHeight="251913216" behindDoc="0" locked="0" layoutInCell="1" allowOverlap="1" wp14:anchorId="7FD4D8D4" wp14:editId="0948A859">
+                <wp:simplePos x="0" y="0"/>
+                <wp:positionH relativeFrom="column">
+                  <wp:posOffset>15438755</wp:posOffset>
+                </wp:positionH>
+                <wp:positionV relativeFrom="paragraph">
+                  <wp:posOffset>230717</wp:posOffset>
+                </wp:positionV>
+                <wp:extent cx="232833" cy="192071"/>
+                <wp:effectExtent l="0" t="0" r="0" b="0"/>
+                <wp:wrapNone/>
+                <wp:docPr id="1294168542" name="Text Box 190"/>
+                <wp:cNvGraphicFramePr/>
+                <a:graphic xmlns:a="http://schemas.openxmlformats.org/drawingml/2006/main">
+                  <a:graphicData uri="http://schemas.microsoft.com/office/word/2010/wordprocessingShape">
+                    <wps:wsp>
+                      <wps:cNvSpPr txBox="1"/>
+                      <wps:spPr>
+                        <a:xfrm>
+                          <a:off x="0" y="0"/>
+                          <a:ext cx="232833" cy="192071"/>
+                        </a:xfrm>
+                        <a:prstGeom prst="rect">
+                          <a:avLst/>
+                        </a:prstGeom>
+                        <a:noFill/>
+                        <a:ln w="6350">
+                          <a:noFill/>
+                        </a:ln>
+                      </wps:spPr>
+                      <wps:txbx>
+                        <w:txbxContent>
+                          <w:p>
+                            <w:pPr>
+                              <w:rPr>
+                                <w:sz w:val="16"/>
+                                <w:szCs w:val="16"/>
+                              </w:rPr>
+                            </w:pPr>
+                            <w:r>
+                              <w:rPr>
+                                <w:sz w:val="16"/>
+                                <w:szCs w:val="16"/>
+                              </w:rPr>
+                              <w:t>1</w:t>
+                            </w:r>
+                          </w:p>
+                        </w:txbxContent>
+                      </wps:txbx>
+                      <wps:bodyPr rot="0" spcFirstLastPara="0" vertOverflow="overflow" horzOverflow="overflow" vert="horz" wrap="square" lIns="91440" tIns="45720" rIns="91440" bIns="45720" numCol="1" spcCol="0" rtlCol="0" fromWordArt="0" anchor="t" anchorCtr="0" forceAA="0" compatLnSpc="1">
+                        <a:prstTxWarp prst="textNoShape">
+                          <a:avLst/>
+                        </a:prstTxWarp>
+                        <a:noAutofit/>
+                      </wps:bodyPr>
+                    </wps:wsp>
+                  </a:graphicData>
+                </a:graphic>
+                <wp14:sizeRelH relativeFrom="margin">
+                  <wp14:pctWidth>0</wp14:pctWidth>
+                </wp14:sizeRelH>
+                <wp14:sizeRelV relativeFrom="margin">
+                  <wp14:pctHeight>0</wp14:pctHeight>
+                </wp14:sizeRelV>
+              </wp:anchor>
+            </w:drawing>
+          </mc:Choice>
+          <mc:Fallback>
+            <w:pict>
+              <v:shape w14:anchorId="7FD4D8D4" id="_x0000_s1230" type="#_x0000_t202" style="position:absolute;margin-left:1215.65pt;margin-top:18.15pt;width:18.35pt;height:15.1pt;z-index:251913216;visibility:visible;mso-wrap-style:square;mso-width-percent:0;mso-height-percent:0;mso-wrap-distance-left:9pt;mso-wrap-distance-top:0;mso-wrap-distance-right:9pt;mso-wrap-distance-bottom:0;mso-position-horizontal:absolute;mso-position-horizontal-relative:text;mso-position-vertical:absolute;mso-position-vertical-relative:text;mso-width-percent:0;mso-height-percent:0;mso-width-relative:margin;mso-height-relative:margin;v-text-anchor:top" o:gfxdata="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" filled="f" stroked="f" strokeweight=".5pt">
+                <v:textbox>
+                  <w:txbxContent>
+                    <w:p>
+                      <w:pPr>
+                        <w:rPr>
+                          <w:sz w:val="16"/>
+                          <w:szCs w:val="16"/>
+                        </w:rPr>
+                      </w:pPr>
+                      <w:r>
+                        <w:rPr>
+                          <w:sz w:val="16"/>
+                          <w:szCs w:val="16"/>
+                        </w:rPr>
+                        <w:t>1</w:t>
+                      </w:r>
+                    </w:p>
+                  </w:txbxContent>
+                </v:textbox>
+              </v:shape>
+            </w:pict>
+          </mc:Fallback>
+        </mc:AlternateContent>
+      </w:r>
+      <w:r>
+        <w:rPr>
+          <w:noProof/>
+          <w:sz w:val="16"/>
+          <w:szCs w:val="16"/>
+        </w:rPr>
+        <mc:AlternateContent>
+          <mc:Choice Requires="wps">
+            <w:drawing>
+              <wp:anchor distT="0" distB="0" distL="114300" distR="114300" simplePos="0" relativeHeight="251842560" behindDoc="0" locked="0" layoutInCell="1" allowOverlap="1" wp14:anchorId="1503459B" wp14:editId="515019BA">
                 <wp:simplePos x="0" y="0"/>
                 <wp:positionH relativeFrom="column">
                   <wp:posOffset>15265019</wp:posOffset>
@@ -11764,7 +12248,7 @@
           </mc:Choice>
           <mc:Fallback>
             <w:pict>
-              <v:shape w14:anchorId="1503459B" id="_x0000_s1226" type="#_x0000_t202" style="position:absolute;margin-left:1201.95pt;margin-top:18.2pt;width:19.95pt;height:17.1pt;z-index:251842560;visibility:visible;mso-wrap-style:square;mso-width-percent:0;mso-wrap-distance-left:9pt;mso-wrap-distance-top:0;mso-wrap-distance-right:9pt;mso-wrap-distance-bottom:0;mso-position-horizontal:absolute;mso-position-horizontal-relative:text;mso-position-vertical:absolute;mso-position-vertical-relative:text;mso-width-percent:0;mso-width-relative:margin;v-text-anchor:top" o:gfxdata="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" filled="f" stroked="f" strokeweight=".5pt">
+              <v:shape w14:anchorId="1503459B" id="_x0000_s1231" type="#_x0000_t202" style="position:absolute;margin-left:1201.95pt;margin-top:18.2pt;width:19.95pt;height:17.1pt;z-index:251842560;visibility:visible;mso-wrap-style:square;mso-width-percent:0;mso-wrap-distance-left:9pt;mso-wrap-distance-top:0;mso-wrap-distance-right:9pt;mso-wrap-distance-bottom:0;mso-position-horizontal:absolute;mso-position-horizontal-relative:text;mso-position-vertical:absolute;mso-position-vertical-relative:text;mso-width-percent:0;mso-width-relative:margin;v-text-anchor:top" o:gfxdata="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" filled="f" stroked="f" strokeweight=".5pt">
                 <v:textbox>
                   <w:txbxContent>
                     <w:p>
@@ -11871,7 +12355,7 @@
           </mc:Choice>
           <mc:Fallback>
             <w:pict>
-              <v:shape w14:anchorId="29454D61" id="_x0000_s1227" type="#_x0000_t202" style="position:absolute;margin-left:1209.2pt;margin-top:22.8pt;width:19.95pt;height:17.1pt;z-index:251846656;visibility:visible;mso-wrap-style:square;mso-width-percent:0;mso-wrap-distance-left:9pt;mso-wrap-distance-top:0;mso-wrap-distance-right:9pt;mso-wrap-distance-bottom:0;mso-position-horizontal:absolute;mso-position-horizontal-relative:text;mso-position-vertical:absolute;mso-position-vertical-relative:text;mso-width-percent:0;mso-width-relative:margin;v-text-anchor:top" o:gfxdata="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" filled="f" stroked="f" strokeweight=".5pt">
+              <v:shape w14:anchorId="29454D61" id="_x0000_s1232" type="#_x0000_t202" style="position:absolute;margin-left:1209.2pt;margin-top:22.8pt;width:19.95pt;height:17.1pt;z-index:251846656;visibility:visible;mso-wrap-style:square;mso-width-percent:0;mso-wrap-distance-left:9pt;mso-wrap-distance-top:0;mso-wrap-distance-right:9pt;mso-wrap-distance-bottom:0;mso-position-horizontal:absolute;mso-position-horizontal-relative:text;mso-position-vertical:absolute;mso-position-vertical-relative:text;mso-width-percent:0;mso-width-relative:margin;v-text-anchor:top" o:gfxdata="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" filled="f" stroked="f" strokeweight=".5pt">
                 <v:textbox>
                   <w:txbxContent>
                     <w:p>
@@ -12055,10 +12539,10 @@
           </mc:Choice>
           <mc:Fallback>
             <w:pict>
-              <v:group w14:anchorId="145DD7E3" id="_x0000_s1228" style="position:absolute;margin-left:967.05pt;margin-top:5.95pt;width:68.85pt;height:38.6pt;z-index:251862016;mso-width-relative:margin" coordsize="8743,4902" o:gfxdata="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">
-                <v:group id="_x0000_s1229" style="position:absolute;width:8743;height:4902" coordsize="8746,4903" o:gfxdata="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">
-                  <v:shape id="Diamond 10" o:spid="_x0000_s1230" type="#_x0000_t4" style="position:absolute;width:8746;height:4903;visibility:visible;mso-wrap-style:square;v-text-anchor:middle" o:gfxdata="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" filled="f" strokecolor="#172c51" strokeweight=".5pt"/>
-                  <v:shape id="Text Box 11" o:spid="_x0000_s1231" type="#_x0000_t202" style="position:absolute;left:1494;top:1324;width:6304;height:2551;visibility:visible;mso-wrap-style:square;v-text-anchor:top" o:gfxdata="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" filled="f" stroked="f" strokeweight=".5pt">
+              <v:group w14:anchorId="145DD7E3" id="_x0000_s1233" style="position:absolute;margin-left:967.05pt;margin-top:5.95pt;width:68.85pt;height:38.6pt;z-index:251862016;mso-width-relative:margin" coordsize="8743,4902" o:gfxdata="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">
+                <v:group id="_x0000_s1234" style="position:absolute;width:8743;height:4902" coordsize="8746,4903" o:gfxdata="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">
+                  <v:shape id="Diamond 10" o:spid="_x0000_s1235" type="#_x0000_t4" style="position:absolute;width:8746;height:4903;visibility:visible;mso-wrap-style:square;v-text-anchor:middle" o:gfxdata="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" filled="f" strokecolor="#172c51" strokeweight=".5pt"/>
+                  <v:shape id="Text Box 11" o:spid="_x0000_s1236" type="#_x0000_t202" style="position:absolute;left:1494;top:1324;width:6304;height:2551;visibility:visible;mso-wrap-style:square;v-text-anchor:top" o:gfxdata="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" filled="f" stroked="f" strokeweight=".5pt">
                     <v:textbox>
                       <w:txbxContent>
                         <w:p>
@@ -12080,7 +12564,7 @@
                     </v:textbox>
                   </v:shape>
                 </v:group>
-                <v:shape id="Diamond 185" o:spid="_x0000_s1232" type="#_x0000_t4" style="position:absolute;left:285;top:219;width:8131;height:4448;visibility:visible;mso-wrap-style:square;v-text-anchor:middle" o:gfxdata="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" filled="f" strokecolor="#172c51" strokeweight=".5pt"/>
+                <v:shape id="Diamond 185" o:spid="_x0000_s1237" type="#_x0000_t4" style="position:absolute;left:285;top:219;width:8131;height:4448;visibility:visible;mso-wrap-style:square;v-text-anchor:middle" o:gfxdata="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" filled="f" strokecolor="#172c51" strokeweight=".5pt"/>
               </v:group>
             </w:pict>
           </mc:Fallback>
@@ -12426,9 +12910,9 @@
           </mc:Choice>
           <mc:Fallback>
             <w:pict>
-              <v:group w14:anchorId="1CE963B7" id="_x0000_s1233" style="position:absolute;margin-left:740.5pt;margin-top:1.75pt;width:68.85pt;height:38.6pt;z-index:251608064" coordsize="8746,4903" o:gfxdata="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">
-                <v:shape id="Diamond 10" o:spid="_x0000_s1234" type="#_x0000_t4" style="position:absolute;width:8746;height:4903;visibility:visible;mso-wrap-style:square;v-text-anchor:middle" o:gfxdata="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" filled="f" strokecolor="#09101d [484]" strokeweight=".5pt"/>
-                <v:shape id="Text Box 11" o:spid="_x0000_s1235" type="#_x0000_t202" style="position:absolute;left:2095;top:1532;width:5135;height:2551;visibility:visible;mso-wrap-style:square;v-text-anchor:top" o:gfxdata="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" filled="f" stroked="f" strokeweight=".5pt">
+              <v:group w14:anchorId="1CE963B7" id="_x0000_s1238" style="position:absolute;margin-left:740.5pt;margin-top:1.75pt;width:68.85pt;height:38.6pt;z-index:251608064" coordsize="8746,4903" o:gfxdata="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">
+                <v:shape id="Diamond 10" o:spid="_x0000_s1239" type="#_x0000_t4" style="position:absolute;width:8746;height:4903;visibility:visible;mso-wrap-style:square;v-text-anchor:middle" o:gfxdata="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" filled="f" strokecolor="#09101d [484]" strokeweight=".5pt"/>
+                <v:shape id="Text Box 11" o:spid="_x0000_s1240" type="#_x0000_t202" style="position:absolute;left:2095;top:1532;width:5135;height:2551;visibility:visible;mso-wrap-style:square;v-text-anchor:top" o:gfxdata="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" filled="f" stroked="f" strokeweight=".5pt">
                   <v:textbox>
                     <w:txbxContent>
                       <w:p>
@@ -12657,9 +13141,9 @@
           </mc:Choice>
           <mc:Fallback>
             <w:pict>
-              <v:group w14:anchorId="401ABED8" id="_x0000_s1236" style="position:absolute;margin-left:525.75pt;margin-top:9.35pt;width:68.85pt;height:38.6pt;z-index:251688960" coordsize="8746,4903" o:gfxdata="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">
-                <v:shape id="Diamond 10" o:spid="_x0000_s1237" type="#_x0000_t4" style="position:absolute;width:8746;height:4903;visibility:visible;mso-wrap-style:square;v-text-anchor:middle" o:gfxdata="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" filled="f" strokecolor="#172c51" strokeweight=".5pt"/>
-                <v:shape id="Text Box 11" o:spid="_x0000_s1238" type="#_x0000_t202" style="position:absolute;left:1662;top:1242;width:5498;height:2551;visibility:visible;mso-wrap-style:square;v-text-anchor:top" o:gfxdata="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" filled="f" stroked="f" strokeweight=".5pt">
+              <v:group w14:anchorId="401ABED8" id="_x0000_s1241" style="position:absolute;margin-left:525.75pt;margin-top:9.35pt;width:68.85pt;height:38.6pt;z-index:251688960" coordsize="8746,4903" o:gfxdata="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">
+                <v:shape id="Diamond 10" o:spid="_x0000_s1242" type="#_x0000_t4" style="position:absolute;width:8746;height:4903;visibility:visible;mso-wrap-style:square;v-text-anchor:middle" o:gfxdata="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" filled="f" strokecolor="#172c51" strokeweight=".5pt"/>
+                <v:shape id="Text Box 11" o:spid="_x0000_s1243" type="#_x0000_t202" style="position:absolute;left:1662;top:1242;width:5498;height:2551;visibility:visible;mso-wrap-style:square;v-text-anchor:top" o:gfxdata="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" filled="f" stroked="f" strokeweight=".5pt">
                   <v:textbox>
                     <w:txbxContent>
                       <w:p>
@@ -13982,9 +14466,9 @@
           </mc:Choice>
           <mc:Fallback>
             <w:pict>
-              <v:group w14:anchorId="65F44259" id="Group 210" o:spid="_x0000_s1239" style="position:absolute;margin-left:707.45pt;margin-top:9.55pt;width:377.25pt;height:166.6pt;z-index:251772928" coordsize="47913,21159" o:gfxdata="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">
-                <v:group id="_x0000_s1240" style="position:absolute;left:19594;top:12246;width:6877;height:2203" coordorigin=",-2" coordsize="6883,2205" o:gfxdata="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">
-                  <v:shape id="Text Box 7" o:spid="_x0000_s1241" type="#_x0000_t202" style="position:absolute;left:870;top:-2;width:6013;height:2205;visibility:visible;mso-wrap-style:square;v-text-anchor:top" o:gfxdata="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" filled="f" stroked="f" strokeweight=".5pt">
+              <v:group w14:anchorId="65F44259" id="Group 210" o:spid="_x0000_s1244" style="position:absolute;margin-left:707.45pt;margin-top:9.55pt;width:377.25pt;height:166.6pt;z-index:251772928" coordsize="47913,21159" o:gfxdata="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">
+                <v:group id="_x0000_s1245" style="position:absolute;left:19594;top:12246;width:6877;height:2203" coordorigin=",-2" coordsize="6883,2205" o:gfxdata="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">
+                  <v:shape id="Text Box 7" o:spid="_x0000_s1246" type="#_x0000_t202" style="position:absolute;left:870;top:-2;width:6013;height:2205;visibility:visible;mso-wrap-style:square;v-text-anchor:top" o:gfxdata="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" filled="f" stroked="f" strokeweight=".5pt">
                     <v:textbox>
                       <w:txbxContent>
                         <w:p>
@@ -14005,13 +14489,13 @@
                       </w:txbxContent>
                     </v:textbox>
                   </v:shape>
-                  <v:rect id="Rectangle 8" o:spid="_x0000_s1242" style="position:absolute;width:6216;height:2203;visibility:visible;mso-wrap-style:square;v-text-anchor:middle" o:gfxdata="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" filled="f" strokecolor="#172c51" strokeweight=".5pt"/>
+                  <v:rect id="Rectangle 8" o:spid="_x0000_s1247" style="position:absolute;width:6216;height:2203;visibility:visible;mso-wrap-style:square;v-text-anchor:middle" o:gfxdata="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" filled="f" strokecolor="#172c51" strokeweight=".5pt"/>
                 </v:group>
-                <v:group id="_x0000_s1243" style="position:absolute;left:7293;top:13335;width:10300;height:3905" coordsize="10303,3909" o:gfxdata="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">
-                  <v:oval id="Oval 14" o:spid="_x0000_s1244" style="position:absolute;width:8150;height:2534;visibility:visible;mso-wrap-style:square;v-text-anchor:middle" o:gfxdata="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" filled="f" strokecolor="#172c51" strokeweight=".5pt">
+                <v:group id="_x0000_s1248" style="position:absolute;left:7293;top:13335;width:10300;height:3905" coordsize="10303,3909" o:gfxdata="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">
+                  <v:oval id="Oval 14" o:spid="_x0000_s1249" style="position:absolute;width:8150;height:2534;visibility:visible;mso-wrap-style:square;v-text-anchor:middle" o:gfxdata="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" filled="f" strokecolor="#172c51" strokeweight=".5pt">
                     <v:stroke joinstyle="miter"/>
                   </v:oval>
-                  <v:shape id="Text Box 15" o:spid="_x0000_s1245" type="#_x0000_t202" style="position:absolute;left:1722;width:8581;height:3909;visibility:visible;mso-wrap-style:square;v-text-anchor:top" o:gfxdata="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" filled="f" stroked="f" strokeweight=".5pt">
+                  <v:shape id="Text Box 15" o:spid="_x0000_s1250" type="#_x0000_t202" style="position:absolute;left:1722;width:8581;height:3909;visibility:visible;mso-wrap-style:square;v-text-anchor:top" o:gfxdata="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" filled="f" stroked="f" strokeweight=".5pt">
                     <v:textbox>
                       <w:txbxContent>
                         <w:p>
@@ -14037,11 +14521,11 @@
                     </v:textbox>
                   </v:shape>
                 </v:group>
-                <v:group id="_x0000_s1246" style="position:absolute;left:12518;top:17145;width:9766;height:3937" coordorigin="-502" coordsize="9768,3939" o:gfxdata="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">
-                  <v:oval id="Oval 14" o:spid="_x0000_s1247" style="position:absolute;width:8150;height:2534;visibility:visible;mso-wrap-style:square;v-text-anchor:middle" o:gfxdata="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" filled="f" strokecolor="#172c51" strokeweight=".5pt">
+                <v:group id="_x0000_s1251" style="position:absolute;left:12518;top:17145;width:9766;height:3937" coordorigin="-502" coordsize="9768,3939" o:gfxdata="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">
+                  <v:oval id="Oval 14" o:spid="_x0000_s1252" style="position:absolute;width:8150;height:2534;visibility:visible;mso-wrap-style:square;v-text-anchor:middle" o:gfxdata="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" filled="f" strokecolor="#172c51" strokeweight=".5pt">
                     <v:stroke joinstyle="miter"/>
                   </v:oval>
-                  <v:shape id="Text Box 15" o:spid="_x0000_s1248" type="#_x0000_t202" style="position:absolute;left:-502;top:30;width:9767;height:3909;visibility:visible;mso-wrap-style:square;v-text-anchor:top" o:gfxdata="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" filled="f" stroked="f" strokeweight=".5pt">
+                  <v:shape id="Text Box 15" o:spid="_x0000_s1253" type="#_x0000_t202" style="position:absolute;left:-502;top:30;width:9767;height:3909;visibility:visible;mso-wrap-style:square;v-text-anchor:top" o:gfxdata="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" filled="f" stroked="f" strokeweight=".5pt">
                     <v:textbox>
                       <w:txbxContent>
                         <w:p>
@@ -14065,11 +14549,11 @@
                     </v:textbox>
                   </v:shape>
                 </v:group>
-                <v:group id="_x0000_s1249" style="position:absolute;left:26942;top:17253;width:9766;height:3906" coordorigin="-259" coordsize="9768,3909" o:gfxdata="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">
-                  <v:oval id="Oval 14" o:spid="_x0000_s1250" style="position:absolute;width:8150;height:2534;visibility:visible;mso-wrap-style:square;v-text-anchor:middle" o:gfxdata="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" filled="f" strokecolor="#172c51" strokeweight=".5pt">
+                <v:group id="_x0000_s1254" style="position:absolute;left:26942;top:17253;width:9766;height:3906" coordorigin="-259" coordsize="9768,3909" o:gfxdata="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">
+                  <v:oval id="Oval 14" o:spid="_x0000_s1255" style="position:absolute;width:8150;height:2534;visibility:visible;mso-wrap-style:square;v-text-anchor:middle" o:gfxdata="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" filled="f" strokecolor="#172c51" strokeweight=".5pt">
                     <v:stroke joinstyle="miter"/>
                   </v:oval>
-                  <v:shape id="Text Box 15" o:spid="_x0000_s1251" type="#_x0000_t202" style="position:absolute;left:-259;width:9768;height:3909;visibility:visible;mso-wrap-style:square;v-text-anchor:top" o:gfxdata="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" filled="f" stroked="f" strokeweight=".5pt">
+                  <v:shape id="Text Box 15" o:spid="_x0000_s1256" type="#_x0000_t202" style="position:absolute;left:-259;width:9768;height:3909;visibility:visible;mso-wrap-style:square;v-text-anchor:top" o:gfxdata="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" filled="f" stroked="f" strokeweight=".5pt">
                     <v:textbox>
                       <w:txbxContent>
                         <w:p>
@@ -14093,12 +14577,12 @@
                     </v:textbox>
                   </v:shape>
                 </v:group>
-                <v:group id="Group 64" o:spid="_x0000_s1252" style="position:absolute;width:22800;height:12145" coordsize="22800,12145" o:gfxdata="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">
-                  <v:group id="_x0000_s1253" style="position:absolute;left:12348;top:8177;width:10452;height:3968" coordsize="10454,3970" o:gfxdata="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">
-                    <v:oval id="Oval 14" o:spid="_x0000_s1254" style="position:absolute;width:8150;height:2534;visibility:visible;mso-wrap-style:square;v-text-anchor:middle" o:gfxdata="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" filled="f" strokecolor="#172c51" strokeweight=".5pt">
+                <v:group id="Group 64" o:spid="_x0000_s1257" style="position:absolute;width:22800;height:12145" coordsize="22800,12145" o:gfxdata="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">
+                  <v:group id="_x0000_s1258" style="position:absolute;left:12348;top:8177;width:10452;height:3968" coordsize="10454,3970" o:gfxdata="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">
+                    <v:oval id="Oval 14" o:spid="_x0000_s1259" style="position:absolute;width:8150;height:2534;visibility:visible;mso-wrap-style:square;v-text-anchor:middle" o:gfxdata="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" filled="f" strokecolor="#172c51" strokeweight=".5pt">
                       <v:stroke joinstyle="miter"/>
                     </v:oval>
-                    <v:shape id="Text Box 15" o:spid="_x0000_s1255" type="#_x0000_t202" style="position:absolute;left:685;top:60;width:9769;height:3910;visibility:visible;mso-wrap-style:square;v-text-anchor:top" o:gfxdata="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" filled="f" stroked="f" strokeweight=".5pt">
+                    <v:shape id="Text Box 15" o:spid="_x0000_s1260" type="#_x0000_t202" style="position:absolute;left:685;top:60;width:9769;height:3910;visibility:visible;mso-wrap-style:square;v-text-anchor:top" o:gfxdata="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" filled="f" stroked="f" strokeweight=".5pt">
                       <v:textbox>
                         <w:txbxContent>
                           <w:p>
@@ -14122,11 +14606,11 @@
                       </v:textbox>
                     </v:shape>
                   </v:group>
-                  <v:group id="_x0000_s1256" style="position:absolute;left:11519;width:9767;height:3905" coordorigin="-380" coordsize="9768,3909" o:gfxdata="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">
-                    <v:oval id="Oval 14" o:spid="_x0000_s1257" style="position:absolute;width:8150;height:2534;visibility:visible;mso-wrap-style:square;v-text-anchor:middle" o:gfxdata="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" filled="f" strokecolor="#172c51" strokeweight=".5pt">
+                  <v:group id="_x0000_s1261" style="position:absolute;left:11519;width:9767;height:3905" coordorigin="-380" coordsize="9768,3909" o:gfxdata="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">
+                    <v:oval id="Oval 14" o:spid="_x0000_s1262" style="position:absolute;width:8150;height:2534;visibility:visible;mso-wrap-style:square;v-text-anchor:middle" o:gfxdata="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" filled="f" strokecolor="#172c51" strokeweight=".5pt">
                       <v:stroke joinstyle="miter"/>
                     </v:oval>
-                    <v:shape id="Text Box 15" o:spid="_x0000_s1258" type="#_x0000_t202" style="position:absolute;left:-380;width:9767;height:3909;visibility:visible;mso-wrap-style:square;v-text-anchor:top" o:gfxdata="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" filled="f" stroked="f" strokeweight=".5pt">
+                    <v:shape id="Text Box 15" o:spid="_x0000_s1263" type="#_x0000_t202" style="position:absolute;left:-380;width:9767;height:3909;visibility:visible;mso-wrap-style:square;v-text-anchor:top" o:gfxdata="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" filled="f" stroked="f" strokeweight=".5pt">
                       <v:textbox>
                         <w:txbxContent>
                           <w:p>
@@ -14150,11 +14634,11 @@
                       </v:textbox>
                     </v:shape>
                   </v:group>
-                  <v:group id="_x0000_s1259" style="position:absolute;left:1049;top:1906;width:10617;height:3905" coordorigin="-463" coordsize="9768,3909" o:gfxdata="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">
-                    <v:oval id="Oval 14" o:spid="_x0000_s1260" style="position:absolute;width:8150;height:2534;visibility:visible;mso-wrap-style:square;v-text-anchor:middle" o:gfxdata="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" filled="f" strokecolor="#172c51" strokeweight=".5pt">
+                  <v:group id="_x0000_s1264" style="position:absolute;left:1049;top:1906;width:10617;height:3905" coordorigin="-463" coordsize="9768,3909" o:gfxdata="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">
+                    <v:oval id="Oval 14" o:spid="_x0000_s1265" style="position:absolute;width:8150;height:2534;visibility:visible;mso-wrap-style:square;v-text-anchor:middle" o:gfxdata="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" filled="f" strokecolor="#172c51" strokeweight=".5pt">
                       <v:stroke joinstyle="miter"/>
                     </v:oval>
-                    <v:shape id="Text Box 15" o:spid="_x0000_s1261" type="#_x0000_t202" style="position:absolute;left:-463;width:9768;height:3909;visibility:visible;mso-wrap-style:square;v-text-anchor:top" o:gfxdata="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" filled="f" stroked="f" strokeweight=".5pt">
+                    <v:shape id="Text Box 15" o:spid="_x0000_s1266" type="#_x0000_t202" style="position:absolute;left:-463;width:9768;height:3909;visibility:visible;mso-wrap-style:square;v-text-anchor:top" o:gfxdata="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" filled="f" stroked="f" strokeweight=".5pt">
                       <v:textbox>
                         <w:txbxContent>
                           <w:p>
@@ -14178,11 +14662,11 @@
                       </v:textbox>
                     </v:shape>
                   </v:group>
-                  <v:group id="_x0000_s1262" style="position:absolute;top:6768;width:9766;height:3968" coordorigin="-289" coordsize="9768,3970" o:gfxdata="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">
-                    <v:oval id="Oval 14" o:spid="_x0000_s1263" style="position:absolute;width:8150;height:2534;visibility:visible;mso-wrap-style:square;v-text-anchor:middle" o:gfxdata="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" filled="f" strokecolor="#172c51" strokeweight=".5pt">
+                  <v:group id="_x0000_s1267" style="position:absolute;top:6768;width:9766;height:3968" coordorigin="-289" coordsize="9768,3970" o:gfxdata="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">
+                    <v:oval id="Oval 14" o:spid="_x0000_s1268" style="position:absolute;width:8150;height:2534;visibility:visible;mso-wrap-style:square;v-text-anchor:middle" o:gfxdata="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" filled="f" strokecolor="#172c51" strokeweight=".5pt">
                       <v:stroke joinstyle="miter"/>
                     </v:oval>
-                    <v:shape id="Text Box 15" o:spid="_x0000_s1264" type="#_x0000_t202" style="position:absolute;left:-289;top:60;width:9768;height:3910;visibility:visible;mso-wrap-style:square;v-text-anchor:top" o:gfxdata="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" filled="f" stroked="f" strokeweight=".5pt">
+                    <v:shape id="Text Box 15" o:spid="_x0000_s1269" type="#_x0000_t202" style="position:absolute;left:-289;top:60;width:9768;height:3910;visibility:visible;mso-wrap-style:square;v-text-anchor:top" o:gfxdata="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" filled="f" stroked="f" strokeweight=".5pt">
                       <v:textbox>
                         <w:txbxContent>
                           <w:p>
@@ -14206,37 +14690,37 @@
                       </v:textbox>
                     </v:shape>
                   </v:group>
-                  <v:line id="Straight Connector 61" o:spid="_x0000_s1265" style="position:absolute;visibility:visible;mso-wrap-style:square" from="16077,2569" to="16077,8194" o:connectortype="straight" o:gfxdata="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" strokecolor="black [3200]" strokeweight=".5pt">
+                  <v:line id="Straight Connector 61" o:spid="_x0000_s1270" style="position:absolute;visibility:visible;mso-wrap-style:square" from="16077,2569" to="16077,8194" o:connectortype="straight" o:gfxdata="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" strokecolor="black [3200]" strokeweight=".5pt">
                     <v:stroke joinstyle="miter"/>
                   </v:line>
-                  <v:line id="Straight Connector 62" o:spid="_x0000_s1266" style="position:absolute;visibility:visible;mso-wrap-style:square" from="9392,3895" to="15161,8222" o:connectortype="straight" o:gfxdata="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" strokecolor="black [3200]" strokeweight=".5pt">
+                  <v:line id="Straight Connector 62" o:spid="_x0000_s1271" style="position:absolute;visibility:visible;mso-wrap-style:square" from="9392,3895" to="15161,8222" o:connectortype="straight" o:gfxdata="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" strokecolor="black [3200]" strokeweight=".5pt">
                     <v:stroke joinstyle="miter"/>
                   </v:line>
-                  <v:line id="Straight Connector 63" o:spid="_x0000_s1267" style="position:absolute;visibility:visible;mso-wrap-style:square" from="8425,8177" to="12336,9301" o:connectortype="straight" o:gfxdata="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" strokecolor="black [3200]" strokeweight=".5pt">
+                  <v:line id="Straight Connector 63" o:spid="_x0000_s1272" style="position:absolute;visibility:visible;mso-wrap-style:square" from="8425,8177" to="12336,9301" o:connectortype="straight" o:gfxdata="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" strokecolor="black [3200]" strokeweight=".5pt">
                     <v:stroke joinstyle="miter"/>
                   </v:line>
                 </v:group>
-                <v:line id="Straight Connector 65" o:spid="_x0000_s1268" style="position:absolute;visibility:visible;mso-wrap-style:square" from="20410,9742" to="20930,12243" o:connectortype="straight" o:gfxdata="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" strokecolor="black [3200]" strokeweight=".5pt">
+                <v:line id="Straight Connector 65" o:spid="_x0000_s1273" style="position:absolute;visibility:visible;mso-wrap-style:square" from="20410,9742" to="20930,12243" o:connectortype="straight" o:gfxdata="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" strokecolor="black [3200]" strokeweight=".5pt">
                   <v:stroke joinstyle="miter"/>
                 </v:line>
-                <v:line id="Straight Connector 66" o:spid="_x0000_s1269" style="position:absolute;flip:y;visibility:visible;mso-wrap-style:square" from="15457,13226" to="19601,14451" o:connectortype="straight" o:gfxdata="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" strokecolor="black [3200]" strokeweight=".5pt">
+                <v:line id="Straight Connector 66" o:spid="_x0000_s1274" style="position:absolute;flip:y;visibility:visible;mso-wrap-style:square" from="15457,13226" to="19601,14451" o:connectortype="straight" o:gfxdata="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" strokecolor="black [3200]" strokeweight=".5pt">
                   <v:stroke joinstyle="miter"/>
                 </v:line>
-                <v:line id="Straight Connector 67" o:spid="_x0000_s1270" style="position:absolute;flip:y;visibility:visible;mso-wrap-style:square" from="17417,14423" to="20887,17130" o:connectortype="straight" o:gfxdata="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" strokecolor="black [3200]" strokeweight=".5pt">
+                <v:line id="Straight Connector 67" o:spid="_x0000_s1275" style="position:absolute;flip:y;visibility:visible;mso-wrap-style:square" from="17417,14423" to="20887,17130" o:connectortype="straight" o:gfxdata="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" strokecolor="black [3200]" strokeweight=".5pt">
                   <v:stroke joinstyle="miter"/>
                 </v:line>
-                <v:line id="Straight Connector 68" o:spid="_x0000_s1271" style="position:absolute;visibility:visible;mso-wrap-style:square" from="24819,14423" to="30850,17268" o:connectortype="straight" o:gfxdata="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" strokecolor="black [3200]" strokeweight=".5pt">
+                <v:line id="Straight Connector 68" o:spid="_x0000_s1276" style="position:absolute;visibility:visible;mso-wrap-style:square" from="24819,14423" to="30850,17268" o:connectortype="straight" o:gfxdata="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" strokecolor="black [3200]" strokeweight=".5pt">
                   <v:stroke joinstyle="miter"/>
                 </v:line>
-                <v:line id="Straight Connector 69" o:spid="_x0000_s1272" style="position:absolute;flip:y;visibility:visible;mso-wrap-style:square" from="24819,9416" to="29082,12247" o:connectortype="straight" o:gfxdata="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" strokecolor="black [3200]" strokeweight=".5pt">
+                <v:line id="Straight Connector 69" o:spid="_x0000_s1277" style="position:absolute;flip:y;visibility:visible;mso-wrap-style:square" from="24819,9416" to="29082,12247" o:connectortype="straight" o:gfxdata="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" strokecolor="black [3200]" strokeweight=".5pt">
                   <v:stroke joinstyle="miter"/>
                 </v:line>
-                <v:group id="Group 72" o:spid="_x0000_s1273" style="position:absolute;left:25254;top:1687;width:22659;height:13180" coordsize="22658,13180" o:gfxdata="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">
-                  <v:group id="_x0000_s1274" style="position:absolute;top:5138;width:9766;height:3905" coordorigin="-624,-60" coordsize="9768,3909" o:gfxdata="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">
-                    <v:oval id="Oval 14" o:spid="_x0000_s1275" style="position:absolute;width:8150;height:2534;visibility:visible;mso-wrap-style:square;v-text-anchor:middle" o:gfxdata="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" filled="f" strokecolor="#172c51" strokeweight=".5pt">
+                <v:group id="Group 72" o:spid="_x0000_s1278" style="position:absolute;left:25254;top:1687;width:22659;height:13180" coordsize="22658,13180" o:gfxdata="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">
+                  <v:group id="_x0000_s1279" style="position:absolute;top:5138;width:9766;height:3905" coordorigin="-624,-60" coordsize="9768,3909" o:gfxdata="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">
+                    <v:oval id="Oval 14" o:spid="_x0000_s1280" style="position:absolute;width:8150;height:2534;visibility:visible;mso-wrap-style:square;v-text-anchor:middle" o:gfxdata="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" filled="f" strokecolor="#172c51" strokeweight=".5pt">
                       <v:stroke joinstyle="miter"/>
                     </v:oval>
-                    <v:shape id="Text Box 15" o:spid="_x0000_s1276" type="#_x0000_t202" style="position:absolute;left:-624;top:-60;width:9768;height:3908;visibility:visible;mso-wrap-style:square;v-text-anchor:top" o:gfxdata="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" filled="f" stroked="f" strokeweight=".5pt">
+                    <v:shape id="Text Box 15" o:spid="_x0000_s1281" type="#_x0000_t202" style="position:absolute;left:-624;top:-60;width:9768;height:3908;visibility:visible;mso-wrap-style:square;v-text-anchor:top" o:gfxdata="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" filled="f" stroked="f" strokeweight=".5pt">
                       <v:textbox>
                         <w:txbxContent>
                           <w:p>
@@ -14260,11 +14744,11 @@
                       </v:textbox>
                     </v:shape>
                   </v:group>
-                  <v:group id="_x0000_s1277" style="position:absolute;left:10746;top:9033;width:11912;height:4147" coordorigin="-624" coordsize="10975,4152" o:gfxdata="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">
-                    <v:oval id="Oval 14" o:spid="_x0000_s1278" style="position:absolute;width:8150;height:2534;visibility:visible;mso-wrap-style:square;v-text-anchor:middle" o:gfxdata="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" filled="f" strokecolor="#172c51" strokeweight=".5pt">
+                  <v:group id="_x0000_s1282" style="position:absolute;left:10746;top:9033;width:11912;height:4147" coordorigin="-624" coordsize="10975,4152" o:gfxdata="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">
+                    <v:oval id="Oval 14" o:spid="_x0000_s1283" style="position:absolute;width:8150;height:2534;visibility:visible;mso-wrap-style:square;v-text-anchor:middle" o:gfxdata="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" filled="f" strokecolor="#172c51" strokeweight=".5pt">
                       <v:stroke joinstyle="miter"/>
                     </v:oval>
-                    <v:shape id="Text Box 15" o:spid="_x0000_s1279" type="#_x0000_t202" style="position:absolute;left:-624;top:242;width:10974;height:3910;visibility:visible;mso-wrap-style:square;v-text-anchor:top" o:gfxdata="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" filled="f" stroked="f" strokeweight=".5pt">
+                    <v:shape id="Text Box 15" o:spid="_x0000_s1284" type="#_x0000_t202" style="position:absolute;left:-624;top:242;width:10974;height:3910;visibility:visible;mso-wrap-style:square;v-text-anchor:top" o:gfxdata="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" filled="f" stroked="f" strokeweight=".5pt">
                       <v:textbox>
                         <w:txbxContent>
                           <w:p>
@@ -14288,11 +14772,11 @@
                       </v:textbox>
                     </v:shape>
                   </v:group>
-                  <v:group id="_x0000_s1280" style="position:absolute;left:10718;width:9766;height:4051" coordorigin="-305" coordsize="9768,4060" o:gfxdata="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">
-                    <v:oval id="Oval 14" o:spid="_x0000_s1281" style="position:absolute;width:8150;height:2534;visibility:visible;mso-wrap-style:square;v-text-anchor:middle" o:gfxdata="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" filled="f" strokecolor="#172c51" strokeweight=".5pt">
+                  <v:group id="_x0000_s1285" style="position:absolute;left:10718;width:9766;height:4051" coordorigin="-305" coordsize="9768,4060" o:gfxdata="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">
+                    <v:oval id="Oval 14" o:spid="_x0000_s1286" style="position:absolute;width:8150;height:2534;visibility:visible;mso-wrap-style:square;v-text-anchor:middle" o:gfxdata="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" filled="f" strokecolor="#172c51" strokeweight=".5pt">
                       <v:stroke joinstyle="miter"/>
                     </v:oval>
-                    <v:shape id="Text Box 15" o:spid="_x0000_s1282" type="#_x0000_t202" style="position:absolute;left:-305;top:150;width:9768;height:3910;visibility:visible;mso-wrap-style:square;v-text-anchor:top" o:gfxdata="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" filled="f" stroked="f" strokeweight=".5pt">
+                    <v:shape id="Text Box 15" o:spid="_x0000_s1287" type="#_x0000_t202" style="position:absolute;left:-305;top:150;width:9768;height:3910;visibility:visible;mso-wrap-style:square;v-text-anchor:top" o:gfxdata="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" filled="f" stroked="f" strokeweight=".5pt">
                       <v:textbox>
                         <w:txbxContent>
                           <w:p>
@@ -14316,10 +14800,10 @@
                       </v:textbox>
                     </v:shape>
                   </v:group>
-                  <v:line id="Straight Connector 70" o:spid="_x0000_s1283" style="position:absolute;flip:y;visibility:visible;mso-wrap-style:square" from="8619,2513" to="14609,6132" o:connectortype="straight" o:gfxdata="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" strokecolor="black [3200]" strokeweight=".5pt">
+                  <v:line id="Straight Connector 70" o:spid="_x0000_s1288" style="position:absolute;flip:y;visibility:visible;mso-wrap-style:square" from="8619,2513" to="14609,6132" o:connectortype="straight" o:gfxdata="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" strokecolor="black [3200]" strokeweight=".5pt">
                     <v:stroke joinstyle="miter"/>
                   </v:line>
-                  <v:line id="Straight Connector 71" o:spid="_x0000_s1284" style="position:absolute;visibility:visible;mso-wrap-style:square" from="8757,6491" to="16022,9033" o:connectortype="straight" o:gfxdata="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" strokecolor="black [3200]" strokeweight=".5pt">
+                  <v:line id="Straight Connector 71" o:spid="_x0000_s1289" style="position:absolute;visibility:visible;mso-wrap-style:square" from="8757,6491" to="16022,9033" o:connectortype="straight" o:gfxdata="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" strokecolor="black [3200]" strokeweight=".5pt">
                     <v:stroke joinstyle="miter"/>
                   </v:line>
                 </v:group>
@@ -14588,9 +15072,9 @@
           </mc:Choice>
           <mc:Fallback>
             <w:pict>
-              <v:group w14:anchorId="37631442" id="_x0000_s1285" style="position:absolute;margin-left:577.9pt;margin-top:2.5pt;width:68.85pt;height:38.6pt;z-index:251704320" coordsize="8746,4903" o:gfxdata="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">
-                <v:shape id="Diamond 10" o:spid="_x0000_s1286" type="#_x0000_t4" style="position:absolute;width:8746;height:4903;visibility:visible;mso-wrap-style:square;v-text-anchor:middle" o:gfxdata="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" filled="f" strokecolor="#172c51" strokeweight=".5pt"/>
-                <v:shape id="Text Box 11" o:spid="_x0000_s1287" type="#_x0000_t202" style="position:absolute;left:2473;top:1242;width:5499;height:2551;visibility:visible;mso-wrap-style:square;v-text-anchor:top" o:gfxdata="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" filled="f" stroked="f" strokeweight=".5pt">
+              <v:group w14:anchorId="37631442" id="_x0000_s1290" style="position:absolute;margin-left:577.9pt;margin-top:2.5pt;width:68.85pt;height:38.6pt;z-index:251704320" coordsize="8746,4903" o:gfxdata="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">
+                <v:shape id="Diamond 10" o:spid="_x0000_s1291" type="#_x0000_t4" style="position:absolute;width:8746;height:4903;visibility:visible;mso-wrap-style:square;v-text-anchor:middle" o:gfxdata="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" filled="f" strokecolor="#172c51" strokeweight=".5pt"/>
+                <v:shape id="Text Box 11" o:spid="_x0000_s1292" type="#_x0000_t202" style="position:absolute;left:2473;top:1242;width:5499;height:2551;visibility:visible;mso-wrap-style:square;v-text-anchor:top" o:gfxdata="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" filled="f" stroked="f" strokeweight=".5pt">
                   <v:textbox>
                     <w:txbxContent>
                       <w:p>
@@ -14630,6 +15114,109 @@
           <w:tab w:val="left" w:pos="5064"/>
         </w:tabs>
       </w:pPr>
+      <w:r>
+        <w:rPr>
+          <w:noProof/>
+          <w:sz w:val="16"/>
+          <w:szCs w:val="16"/>
+        </w:rPr>
+        <mc:AlternateContent>
+          <mc:Choice Requires="wps">
+            <w:drawing>
+              <wp:anchor distT="0" distB="0" distL="114300" distR="114300" simplePos="0" relativeHeight="251905024" behindDoc="0" locked="0" layoutInCell="1" allowOverlap="1" wp14:anchorId="6ECA0F21" wp14:editId="4B994E5A">
+                <wp:simplePos x="0" y="0"/>
+                <wp:positionH relativeFrom="column">
+                  <wp:posOffset>11171766</wp:posOffset>
+                </wp:positionH>
+                <wp:positionV relativeFrom="paragraph">
+                  <wp:posOffset>238760</wp:posOffset>
+                </wp:positionV>
+                <wp:extent cx="275167" cy="234527"/>
+                <wp:effectExtent l="0" t="0" r="0" b="0"/>
+                <wp:wrapNone/>
+                <wp:docPr id="780982980" name="Text Box 190"/>
+                <wp:cNvGraphicFramePr/>
+                <a:graphic xmlns:a="http://schemas.openxmlformats.org/drawingml/2006/main">
+                  <a:graphicData uri="http://schemas.microsoft.com/office/word/2010/wordprocessingShape">
+                    <wps:wsp>
+                      <wps:cNvSpPr txBox="1"/>
+                      <wps:spPr>
+                        <a:xfrm>
+                          <a:off x="0" y="0"/>
+                          <a:ext cx="275167" cy="234527"/>
+                        </a:xfrm>
+                        <a:prstGeom prst="rect">
+                          <a:avLst/>
+                        </a:prstGeom>
+                        <a:noFill/>
+                        <a:ln w="6350">
+                          <a:noFill/>
+                        </a:ln>
+                      </wps:spPr>
+                      <wps:txbx>
+                        <w:txbxContent>
+                          <w:p>
+                            <w:pPr>
+                              <w:rPr>
+                                <w:sz w:val="16"/>
+                                <w:szCs w:val="16"/>
+                              </w:rPr>
+                            </w:pPr>
+                            <w:r>
+                              <w:rPr>
+                                <w:sz w:val="16"/>
+                                <w:szCs w:val="16"/>
+                              </w:rPr>
+                              <w:t>N</w:t>
+                            </w:r>
+                          </w:p>
+                        </w:txbxContent>
+                      </wps:txbx>
+                      <wps:bodyPr rot="0" spcFirstLastPara="0" vertOverflow="overflow" horzOverflow="overflow" vert="horz" wrap="square" lIns="91440" tIns="45720" rIns="91440" bIns="45720" numCol="1" spcCol="0" rtlCol="0" fromWordArt="0" anchor="t" anchorCtr="0" forceAA="0" compatLnSpc="1">
+                        <a:prstTxWarp prst="textNoShape">
+                          <a:avLst/>
+                        </a:prstTxWarp>
+                        <a:noAutofit/>
+                      </wps:bodyPr>
+                    </wps:wsp>
+                  </a:graphicData>
+                </a:graphic>
+                <wp14:sizeRelH relativeFrom="margin">
+                  <wp14:pctWidth>0</wp14:pctWidth>
+                </wp14:sizeRelH>
+                <wp14:sizeRelV relativeFrom="margin">
+                  <wp14:pctHeight>0</wp14:pctHeight>
+                </wp14:sizeRelV>
+              </wp:anchor>
+            </w:drawing>
+          </mc:Choice>
+          <mc:Fallback>
+            <w:pict>
+              <v:shape w14:anchorId="6ECA0F21" id="_x0000_s1293" type="#_x0000_t202" style="position:absolute;margin-left:879.65pt;margin-top:18.8pt;width:21.65pt;height:18.45pt;z-index:251905024;visibility:visible;mso-wrap-style:square;mso-width-percent:0;mso-height-percent:0;mso-wrap-distance-left:9pt;mso-wrap-distance-top:0;mso-wrap-distance-right:9pt;mso-wrap-distance-bottom:0;mso-position-horizontal:absolute;mso-position-horizontal-relative:text;mso-position-vertical:absolute;mso-position-vertical-relative:text;mso-width-percent:0;mso-height-percent:0;mso-width-relative:margin;mso-height-relative:margin;v-text-anchor:top" o:gfxdata="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" filled="f" stroked="f" strokeweight=".5pt">
+                <v:textbox>
+                  <w:txbxContent>
+                    <w:p>
+                      <w:pPr>
+                        <w:rPr>
+                          <w:sz w:val="16"/>
+                          <w:szCs w:val="16"/>
+                        </w:rPr>
+                      </w:pPr>
+                      <w:r>
+                        <w:rPr>
+                          <w:sz w:val="16"/>
+                          <w:szCs w:val="16"/>
+                        </w:rPr>
+                        <w:t>N</w:t>
+                      </w:r>
+                    </w:p>
+                  </w:txbxContent>
+                </v:textbox>
+              </v:shape>
+            </w:pict>
+          </mc:Fallback>
+        </mc:AlternateContent>
+      </w:r>
       <w:r>
         <w:rPr>
           <w:noProof/>
@@ -14683,7 +15270,7 @@
                                 <w:sz w:val="16"/>
                                 <w:szCs w:val="16"/>
                               </w:rPr>
-                              <w:t>M</w:t>
+                              <w:t>N</w:t>
                             </w:r>
                           </w:p>
                         </w:txbxContent>
@@ -14708,7 +15295,7 @@
           </mc:Choice>
           <mc:Fallback>
             <w:pict>
-              <v:shape w14:anchorId="75B25CAD" id="_x0000_s1288" type="#_x0000_t202" style="position:absolute;margin-left:866.75pt;margin-top:18.9pt;width:21.65pt;height:18.45pt;z-index:251840512;visibility:visible;mso-wrap-style:square;mso-width-percent:0;mso-height-percent:0;mso-wrap-distance-left:9pt;mso-wrap-distance-top:0;mso-wrap-distance-right:9pt;mso-wrap-distance-bottom:0;mso-position-horizontal:absolute;mso-position-horizontal-relative:text;mso-position-vertical:absolute;mso-position-vertical-relative:text;mso-width-percent:0;mso-height-percent:0;mso-width-relative:margin;mso-height-relative:margin;v-text-anchor:top" o:gfxdata="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" filled="f" stroked="f" strokeweight=".5pt">
+              <v:shape w14:anchorId="75B25CAD" id="_x0000_s1294" type="#_x0000_t202" style="position:absolute;margin-left:866.75pt;margin-top:18.9pt;width:21.65pt;height:18.45pt;z-index:251840512;visibility:visible;mso-wrap-style:square;mso-width-percent:0;mso-height-percent:0;mso-wrap-distance-left:9pt;mso-wrap-distance-top:0;mso-wrap-distance-right:9pt;mso-wrap-distance-bottom:0;mso-position-horizontal:absolute;mso-position-horizontal-relative:text;mso-position-vertical:absolute;mso-position-vertical-relative:text;mso-width-percent:0;mso-height-percent:0;mso-width-relative:margin;mso-height-relative:margin;v-text-anchor:top" o:gfxdata="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" filled="f" stroked="f" strokeweight=".5pt">
                 <v:textbox>
                   <w:txbxContent>
                     <w:p>
@@ -14723,7 +15310,7 @@
                           <w:sz w:val="16"/>
                           <w:szCs w:val="16"/>
                         </w:rPr>
-                        <w:t>M</w:t>
+                        <w:t>N</w:t>
                       </w:r>
                     </w:p>
                   </w:txbxContent>
@@ -14815,7 +15402,7 @@
           </mc:Choice>
           <mc:Fallback>
             <w:pict>
-              <v:shape w14:anchorId="5EF203C8" id="_x0000_s1289" type="#_x0000_t202" style="position:absolute;margin-left:868.45pt;margin-top:19.15pt;width:20pt;height:17.1pt;z-index:251838464;visibility:visible;mso-wrap-style:square;mso-width-percent:0;mso-wrap-distance-left:9pt;mso-wrap-distance-top:0;mso-wrap-distance-right:9pt;mso-wrap-distance-bottom:0;mso-position-horizontal:absolute;mso-position-horizontal-relative:text;mso-position-vertical:absolute;mso-position-vertical-relative:text;mso-width-percent:0;mso-width-relative:margin;v-text-anchor:top" o:gfxdata="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" filled="f" stroked="f" strokeweight=".5pt">
+              <v:shape w14:anchorId="5EF203C8" id="_x0000_s1295" type="#_x0000_t202" style="position:absolute;margin-left:868.45pt;margin-top:19.15pt;width:20pt;height:17.1pt;z-index:251838464;visibility:visible;mso-wrap-style:square;mso-width-percent:0;mso-wrap-distance-left:9pt;mso-wrap-distance-top:0;mso-wrap-distance-right:9pt;mso-wrap-distance-bottom:0;mso-position-horizontal:absolute;mso-position-horizontal-relative:text;mso-position-vertical:absolute;mso-position-vertical-relative:text;mso-width-percent:0;mso-width-relative:margin;v-text-anchor:top" o:gfxdata="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" filled="f" stroked="f" strokeweight=".5pt">
                 <v:textbox>
                   <w:txbxContent>
                     <w:p>
@@ -15072,10 +15659,10 @@
           </mc:Choice>
           <mc:Fallback>
             <w:pict>
-              <v:group w14:anchorId="77F35169" id="_x0000_s1290" style="position:absolute;margin-left:1181.35pt;margin-top:18.95pt;width:68.85pt;height:38.6pt;z-index:251777024" coordsize="8743,4902" o:gfxdata="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">
-                <v:group id="_x0000_s1291" style="position:absolute;width:8743;height:4902" coordsize="8746,4903" o:gfxdata="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">
-                  <v:shape id="Diamond 10" o:spid="_x0000_s1292" type="#_x0000_t4" style="position:absolute;width:8746;height:4903;visibility:visible;mso-wrap-style:square;v-text-anchor:middle" o:gfxdata="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" filled="f" strokecolor="#172c51" strokeweight=".5pt"/>
-                  <v:shape id="Text Box 11" o:spid="_x0000_s1293" type="#_x0000_t202" style="position:absolute;left:2821;top:1532;width:5135;height:2551;visibility:visible;mso-wrap-style:square;v-text-anchor:top" o:gfxdata="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" filled="f" stroked="f" strokeweight=".5pt">
+              <v:group w14:anchorId="77F35169" id="_x0000_s1296" style="position:absolute;margin-left:1181.35pt;margin-top:18.95pt;width:68.85pt;height:38.6pt;z-index:251777024" coordsize="8743,4902" o:gfxdata="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">
+                <v:group id="_x0000_s1297" style="position:absolute;width:8743;height:4902" coordsize="8746,4903" o:gfxdata="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">
+                  <v:shape id="Diamond 10" o:spid="_x0000_s1298" type="#_x0000_t4" style="position:absolute;width:8746;height:4903;visibility:visible;mso-wrap-style:square;v-text-anchor:middle" o:gfxdata="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" filled="f" strokecolor="#172c51" strokeweight=".5pt"/>
+                  <v:shape id="Text Box 11" o:spid="_x0000_s1299" type="#_x0000_t202" style="position:absolute;left:2821;top:1532;width:5135;height:2551;visibility:visible;mso-wrap-style:square;v-text-anchor:top" o:gfxdata="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" filled="f" stroked="f" strokeweight=".5pt">
                     <v:textbox>
                       <w:txbxContent>
                         <w:p>
@@ -15097,7 +15684,7 @@
                     </v:textbox>
                   </v:shape>
                 </v:group>
-                <v:shape id="Diamond 185" o:spid="_x0000_s1294" type="#_x0000_t4" style="position:absolute;left:285;top:219;width:8131;height:4448;visibility:visible;mso-wrap-style:square;v-text-anchor:middle" o:gfxdata="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" filled="f" strokecolor="#172c51" strokeweight=".5pt"/>
+                <v:shape id="Diamond 185" o:spid="_x0000_s1300" type="#_x0000_t4" style="position:absolute;left:285;top:219;width:8131;height:4448;visibility:visible;mso-wrap-style:square;v-text-anchor:middle" o:gfxdata="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" filled="f" strokecolor="#172c51" strokeweight=".5pt"/>
               </v:group>
             </w:pict>
           </mc:Fallback>
@@ -15307,9 +15894,9 @@
           </mc:Choice>
           <mc:Fallback>
             <w:pict>
-              <v:group w14:anchorId="33C4366D" id="_x0000_s1295" style="position:absolute;margin-left:809.15pt;margin-top:6.75pt;width:68.85pt;height:38.6pt;z-index:251729920" coordsize="8746,4903" o:gfxdata="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">
-                <v:shape id="Diamond 10" o:spid="_x0000_s1296" type="#_x0000_t4" style="position:absolute;width:8746;height:4903;visibility:visible;mso-wrap-style:square;v-text-anchor:middle" o:gfxdata="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" filled="f" strokecolor="#172c51" strokeweight=".5pt"/>
-                <v:shape id="Text Box 11" o:spid="_x0000_s1297" type="#_x0000_t202" style="position:absolute;left:1825;top:1182;width:5498;height:2551;visibility:visible;mso-wrap-style:square;v-text-anchor:top" o:gfxdata="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" filled="f" stroked="f" strokeweight=".5pt">
+              <v:group w14:anchorId="33C4366D" id="_x0000_s1301" style="position:absolute;margin-left:809.15pt;margin-top:6.75pt;width:68.85pt;height:38.6pt;z-index:251729920" coordsize="8746,4903" o:gfxdata="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">
+                <v:shape id="Diamond 10" o:spid="_x0000_s1302" type="#_x0000_t4" style="position:absolute;width:8746;height:4903;visibility:visible;mso-wrap-style:square;v-text-anchor:middle" o:gfxdata="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" filled="f" strokecolor="#172c51" strokeweight=".5pt"/>
+                <v:shape id="Text Box 11" o:spid="_x0000_s1303" type="#_x0000_t202" style="position:absolute;left:1825;top:1182;width:5498;height:2551;visibility:visible;mso-wrap-style:square;v-text-anchor:top" o:gfxdata="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" filled="f" stroked="f" strokeweight=".5pt">
                   <v:textbox>
                     <w:txbxContent>
                       <w:p>
@@ -15468,7 +16055,7 @@
                                 <w:sz w:val="16"/>
                                 <w:szCs w:val="16"/>
                               </w:rPr>
-                              <w:t>M</w:t>
+                              <w:t>N</w:t>
                             </w:r>
                           </w:p>
                         </w:txbxContent>
@@ -15490,7 +16077,7 @@
           </mc:Choice>
           <mc:Fallback>
             <w:pict>
-              <v:shape w14:anchorId="49EFC1DB" id="_x0000_s1298" type="#_x0000_t202" style="position:absolute;margin-left:568.2pt;margin-top:24.65pt;width:19.95pt;height:17.1pt;z-index:251817984;visibility:visible;mso-wrap-style:square;mso-width-percent:0;mso-wrap-distance-left:9pt;mso-wrap-distance-top:0;mso-wrap-distance-right:9pt;mso-wrap-distance-bottom:0;mso-position-horizontal:absolute;mso-position-horizontal-relative:text;mso-position-vertical:absolute;mso-position-vertical-relative:text;mso-width-percent:0;mso-width-relative:margin;v-text-anchor:top" o:gfxdata="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" filled="f" stroked="f" strokeweight=".5pt">
+              <v:shape w14:anchorId="49EFC1DB" id="_x0000_s1304" type="#_x0000_t202" style="position:absolute;margin-left:568.2pt;margin-top:24.65pt;width:19.95pt;height:17.1pt;z-index:251817984;visibility:visible;mso-wrap-style:square;mso-width-percent:0;mso-wrap-distance-left:9pt;mso-wrap-distance-top:0;mso-wrap-distance-right:9pt;mso-wrap-distance-bottom:0;mso-position-horizontal:absolute;mso-position-horizontal-relative:text;mso-position-vertical:absolute;mso-position-vertical-relative:text;mso-width-percent:0;mso-width-relative:margin;v-text-anchor:top" o:gfxdata="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" filled="f" stroked="f" strokeweight=".5pt">
                 <v:textbox>
                   <w:txbxContent>
                     <w:p>
@@ -15505,7 +16092,7 @@
                           <w:sz w:val="16"/>
                           <w:szCs w:val="16"/>
                         </w:rPr>
-                        <w:t>M</w:t>
+                        <w:t>N</w:t>
                       </w:r>
                     </w:p>
                   </w:txbxContent>
@@ -15590,7 +16177,7 @@
           </mc:Choice>
           <mc:Fallback>
             <w:pict>
-              <v:shape w14:anchorId="50B8709C" id="_x0000_s1299" type="#_x0000_t202" style="position:absolute;margin-left:543.9pt;margin-top:24.75pt;width:19.95pt;height:17.1pt;z-index:251809792;visibility:visible;mso-wrap-style:square;mso-width-percent:0;mso-wrap-distance-left:9pt;mso-wrap-distance-top:0;mso-wrap-distance-right:9pt;mso-wrap-distance-bottom:0;mso-position-horizontal:absolute;mso-position-horizontal-relative:text;mso-position-vertical:absolute;mso-position-vertical-relative:text;mso-width-percent:0;mso-width-relative:margin;v-text-anchor:top" o:gfxdata="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" filled="f" stroked="f" strokeweight=".5pt">
+              <v:shape w14:anchorId="50B8709C" id="_x0000_s1305" type="#_x0000_t202" style="position:absolute;margin-left:543.9pt;margin-top:24.75pt;width:19.95pt;height:17.1pt;z-index:251809792;visibility:visible;mso-wrap-style:square;mso-width-percent:0;mso-wrap-distance-left:9pt;mso-wrap-distance-top:0;mso-wrap-distance-right:9pt;mso-wrap-distance-bottom:0;mso-position-horizontal:absolute;mso-position-horizontal-relative:text;mso-position-vertical:absolute;mso-position-vertical-relative:text;mso-width-percent:0;mso-width-relative:margin;v-text-anchor:top" o:gfxdata="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" filled="f" stroked="f" strokeweight=".5pt">
                 <v:textbox>
                   <w:txbxContent>
                     <w:p>
@@ -15697,7 +16284,7 @@
           </mc:Choice>
           <mc:Fallback>
             <w:pict>
-              <v:shape w14:anchorId="4815A946" id="_x0000_s1300" type="#_x0000_t202" style="position:absolute;margin-left:586.6pt;margin-top:25.1pt;width:19.95pt;height:17.1pt;z-index:251844608;visibility:visible;mso-wrap-style:square;mso-width-percent:0;mso-wrap-distance-left:9pt;mso-wrap-distance-top:0;mso-wrap-distance-right:9pt;mso-wrap-distance-bottom:0;mso-position-horizontal:absolute;mso-position-horizontal-relative:text;mso-position-vertical:absolute;mso-position-vertical-relative:text;mso-width-percent:0;mso-width-relative:margin;v-text-anchor:top" o:gfxdata="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" filled="f" stroked="f" strokeweight=".5pt">
+              <v:shape w14:anchorId="4815A946" id="_x0000_s1306" type="#_x0000_t202" style="position:absolute;margin-left:586.6pt;margin-top:25.1pt;width:19.95pt;height:17.1pt;z-index:251844608;visibility:visible;mso-wrap-style:square;mso-width-percent:0;mso-wrap-distance-left:9pt;mso-wrap-distance-top:0;mso-wrap-distance-right:9pt;mso-wrap-distance-bottom:0;mso-position-horizontal:absolute;mso-position-horizontal-relative:text;mso-position-vertical:absolute;mso-position-vertical-relative:text;mso-width-percent:0;mso-width-relative:margin;v-text-anchor:top" o:gfxdata="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" filled="f" stroked="f" strokeweight=".5pt">
                 <v:textbox>
                   <w:txbxContent>
                     <w:p>
@@ -15797,7 +16384,7 @@
           </mc:Choice>
           <mc:Fallback>
             <w:pict>
-              <v:shape w14:anchorId="715AF284" id="_x0000_s1301" type="#_x0000_t202" style="position:absolute;margin-left:586.2pt;margin-top:11pt;width:19.95pt;height:17.1pt;z-index:251836416;visibility:visible;mso-wrap-style:square;mso-width-percent:0;mso-wrap-distance-left:9pt;mso-wrap-distance-top:0;mso-wrap-distance-right:9pt;mso-wrap-distance-bottom:0;mso-position-horizontal:absolute;mso-position-horizontal-relative:text;mso-position-vertical:absolute;mso-position-vertical-relative:text;mso-width-percent:0;mso-width-relative:margin;v-text-anchor:top" o:gfxdata="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" filled="f" stroked="f" strokeweight=".5pt">
+              <v:shape w14:anchorId="715AF284" id="_x0000_s1307" type="#_x0000_t202" style="position:absolute;margin-left:586.2pt;margin-top:11pt;width:19.95pt;height:17.1pt;z-index:251836416;visibility:visible;mso-wrap-style:square;mso-width-percent:0;mso-wrap-distance-left:9pt;mso-wrap-distance-top:0;mso-wrap-distance-right:9pt;mso-wrap-distance-bottom:0;mso-position-horizontal:absolute;mso-position-horizontal-relative:text;mso-position-vertical:absolute;mso-position-vertical-relative:text;mso-width-percent:0;mso-width-relative:margin;v-text-anchor:top" o:gfxdata="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" filled="f" stroked="f" strokeweight=".5pt">
                 <v:textbox>
                   <w:txbxContent>
                     <w:p>
@@ -15900,7 +16487,7 @@
           </mc:Choice>
           <mc:Fallback>
             <w:pict>
-              <v:shape w14:anchorId="210A1453" id="_x0000_s1302" type="#_x0000_t202" style="position:absolute;margin-left:594.6pt;margin-top:4.15pt;width:16.35pt;height:17.65pt;z-index:251824128;visibility:visible;mso-wrap-style:square;mso-width-percent:0;mso-height-percent:0;mso-wrap-distance-left:9pt;mso-wrap-distance-top:0;mso-wrap-distance-right:9pt;mso-wrap-distance-bottom:0;mso-position-horizontal:absolute;mso-position-horizontal-relative:text;mso-position-vertical:absolute;mso-position-vertical-relative:text;mso-width-percent:0;mso-height-percent:0;mso-width-relative:margin;mso-height-relative:margin;v-text-anchor:top" o:gfxdata="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" filled="f" stroked="f" strokeweight=".5pt">
+              <v:shape w14:anchorId="210A1453" id="_x0000_s1308" type="#_x0000_t202" style="position:absolute;margin-left:594.6pt;margin-top:4.15pt;width:16.35pt;height:17.65pt;z-index:251824128;visibility:visible;mso-wrap-style:square;mso-width-percent:0;mso-height-percent:0;mso-wrap-distance-left:9pt;mso-wrap-distance-top:0;mso-wrap-distance-right:9pt;mso-wrap-distance-bottom:0;mso-position-horizontal:absolute;mso-position-horizontal-relative:text;mso-position-vertical:absolute;mso-position-vertical-relative:text;mso-width-percent:0;mso-height-percent:0;mso-width-relative:margin;mso-height-relative:margin;v-text-anchor:top" o:gfxdata="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" filled="f" stroked="f" strokeweight=".5pt">
                 <v:textbox>
                   <w:txbxContent>
                     <w:p>
@@ -16519,9 +17106,9 @@
           </mc:Choice>
           <mc:Fallback>
             <w:pict>
-              <v:group w14:anchorId="7D4AA8EB" id="Group 46" o:spid="_x0000_s1303" style="position:absolute;margin-left:437.5pt;margin-top:14.9pt;width:215.3pt;height:99.5pt;z-index:251684864" coordsize="27345,12636" o:gfxdata="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">
-                <v:group id="_x0000_s1304" style="position:absolute;left:13425;width:6655;height:2203" coordsize="6657,2205" o:gfxdata="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">
-                  <v:shape id="Text Box 7" o:spid="_x0000_s1305" type="#_x0000_t202" style="position:absolute;left:644;width:6013;height:2205;visibility:visible;mso-wrap-style:square;v-text-anchor:top" o:gfxdata="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" filled="f" stroked="f" strokeweight=".5pt">
+              <v:group w14:anchorId="7D4AA8EB" id="Group 46" o:spid="_x0000_s1309" style="position:absolute;margin-left:437.5pt;margin-top:14.9pt;width:215.3pt;height:99.5pt;z-index:251684864" coordsize="27345,12636" o:gfxdata="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">
+                <v:group id="_x0000_s1310" style="position:absolute;left:13425;width:6655;height:2203" coordsize="6657,2205" o:gfxdata="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">
+                  <v:shape id="Text Box 7" o:spid="_x0000_s1311" type="#_x0000_t202" style="position:absolute;left:644;width:6013;height:2205;visibility:visible;mso-wrap-style:square;v-text-anchor:top" o:gfxdata="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" filled="f" stroked="f" strokeweight=".5pt">
                     <v:textbox>
                       <w:txbxContent>
                         <w:p>
@@ -16558,13 +17145,13 @@
                       </w:txbxContent>
                     </v:textbox>
                   </v:shape>
-                  <v:rect id="Rectangle 8" o:spid="_x0000_s1306" style="position:absolute;width:6216;height:2203;visibility:visible;mso-wrap-style:square;v-text-anchor:middle" o:gfxdata="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" filled="f" strokecolor="#172c51" strokeweight=".5pt"/>
+                  <v:rect id="Rectangle 8" o:spid="_x0000_s1312" style="position:absolute;width:6216;height:2203;visibility:visible;mso-wrap-style:square;v-text-anchor:middle" o:gfxdata="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" filled="f" strokecolor="#172c51" strokeweight=".5pt"/>
                 </v:group>
-                <v:group id="_x0000_s1307" style="position:absolute;left:7983;top:8094;width:8947;height:4032" coordsize="8952,4038" o:gfxdata="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">
-                  <v:oval id="Oval 14" o:spid="_x0000_s1308" style="position:absolute;width:8150;height:2534;visibility:visible;mso-wrap-style:square;v-text-anchor:middle" o:gfxdata="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" filled="f" strokecolor="#172c51" strokeweight=".5pt">
+                <v:group id="_x0000_s1313" style="position:absolute;left:7983;top:8094;width:8947;height:4032" coordsize="8952,4038" o:gfxdata="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">
+                  <v:oval id="Oval 14" o:spid="_x0000_s1314" style="position:absolute;width:8150;height:2534;visibility:visible;mso-wrap-style:square;v-text-anchor:middle" o:gfxdata="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" filled="f" strokecolor="#172c51" strokeweight=".5pt">
                     <v:stroke joinstyle="miter"/>
                   </v:oval>
-                  <v:shape id="Text Box 15" o:spid="_x0000_s1309" type="#_x0000_t202" style="position:absolute;left:372;top:128;width:8580;height:3910;visibility:visible;mso-wrap-style:square;v-text-anchor:top" o:gfxdata="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" filled="f" stroked="f" strokeweight=".5pt">
+                  <v:shape id="Text Box 15" o:spid="_x0000_s1315" type="#_x0000_t202" style="position:absolute;left:372;top:128;width:8580;height:3910;visibility:visible;mso-wrap-style:square;v-text-anchor:top" o:gfxdata="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" filled="f" stroked="f" strokeweight=".5pt">
                     <v:textbox>
                       <w:txbxContent>
                         <w:p>
@@ -16588,11 +17175,11 @@
                     </v:textbox>
                   </v:shape>
                 </v:group>
-                <v:group id="_x0000_s1310" style="position:absolute;left:17210;top:8674;width:10135;height:3962" coordsize="10139,3967" o:gfxdata="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">
-                  <v:oval id="Oval 14" o:spid="_x0000_s1311" style="position:absolute;width:8150;height:2534;visibility:visible;mso-wrap-style:square;v-text-anchor:middle" o:gfxdata="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" filled="f" strokecolor="#172c51" strokeweight=".5pt">
+                <v:group id="_x0000_s1316" style="position:absolute;left:17210;top:8674;width:10135;height:3962" coordsize="10139,3967" o:gfxdata="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">
+                  <v:oval id="Oval 14" o:spid="_x0000_s1317" style="position:absolute;width:8150;height:2534;visibility:visible;mso-wrap-style:square;v-text-anchor:middle" o:gfxdata="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" filled="f" strokecolor="#172c51" strokeweight=".5pt">
                     <v:stroke joinstyle="miter"/>
                   </v:oval>
-                  <v:shape id="Text Box 15" o:spid="_x0000_s1312" type="#_x0000_t202" style="position:absolute;left:1558;top:57;width:8581;height:3910;visibility:visible;mso-wrap-style:square;v-text-anchor:top" o:gfxdata="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" filled="f" stroked="f" strokeweight=".5pt">
+                  <v:shape id="Text Box 15" o:spid="_x0000_s1318" type="#_x0000_t202" style="position:absolute;left:1558;top:57;width:8581;height:3910;visibility:visible;mso-wrap-style:square;v-text-anchor:top" o:gfxdata="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" filled="f" stroked="f" strokeweight=".5pt">
                     <v:textbox>
                       <w:txbxContent>
                         <w:p>
@@ -16614,11 +17201,11 @@
                     </v:textbox>
                   </v:shape>
                 </v:group>
-                <v:group id="_x0000_s1313" style="position:absolute;left:2762;top:5248;width:10554;height:3931" coordsize="10560,3935" o:gfxdata="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">
-                  <v:oval id="Oval 14" o:spid="_x0000_s1314" style="position:absolute;width:8150;height:2534;visibility:visible;mso-wrap-style:square;v-text-anchor:middle" o:gfxdata="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" filled="f" strokecolor="#172c51" strokeweight=".5pt">
+                <v:group id="_x0000_s1319" style="position:absolute;left:2762;top:5248;width:10554;height:3931" coordsize="10560,3935" o:gfxdata="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">
+                  <v:oval id="Oval 14" o:spid="_x0000_s1320" style="position:absolute;width:8150;height:2534;visibility:visible;mso-wrap-style:square;v-text-anchor:middle" o:gfxdata="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" filled="f" strokecolor="#172c51" strokeweight=".5pt">
                     <v:stroke joinstyle="miter"/>
                   </v:oval>
-                  <v:shape id="Text Box 15" o:spid="_x0000_s1315" type="#_x0000_t202" style="position:absolute;left:1979;top:26;width:8581;height:3909;visibility:visible;mso-wrap-style:square;v-text-anchor:top" o:gfxdata="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" filled="f" stroked="f" strokeweight=".5pt">
+                  <v:shape id="Text Box 15" o:spid="_x0000_s1321" type="#_x0000_t202" style="position:absolute;left:1979;top:26;width:8581;height:3909;visibility:visible;mso-wrap-style:square;v-text-anchor:top" o:gfxdata="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" filled="f" stroked="f" strokeweight=".5pt">
                     <v:textbox>
                       <w:txbxContent>
                         <w:p>
@@ -16640,11 +17227,11 @@
                     </v:textbox>
                   </v:shape>
                 </v:group>
-                <v:group id="_x0000_s1316" style="position:absolute;top:856;width:9315;height:3905" coordsize="9321,3909" o:gfxdata="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">
-                  <v:oval id="Oval 14" o:spid="_x0000_s1317" style="position:absolute;width:8150;height:2534;visibility:visible;mso-wrap-style:square;v-text-anchor:middle" o:gfxdata="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" filled="f" strokecolor="#172c51" strokeweight=".5pt">
+                <v:group id="_x0000_s1322" style="position:absolute;top:856;width:9315;height:3905" coordsize="9321,3909" o:gfxdata="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">
+                  <v:oval id="Oval 14" o:spid="_x0000_s1323" style="position:absolute;width:8150;height:2534;visibility:visible;mso-wrap-style:square;v-text-anchor:middle" o:gfxdata="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" filled="f" strokecolor="#172c51" strokeweight=".5pt">
                     <v:stroke joinstyle="miter"/>
                   </v:oval>
-                  <v:shape id="Text Box 15" o:spid="_x0000_s1318" type="#_x0000_t202" style="position:absolute;left:741;width:8580;height:3909;visibility:visible;mso-wrap-style:square;v-text-anchor:top" o:gfxdata="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" filled="f" stroked="f" strokeweight=".5pt">
+                  <v:shape id="Text Box 15" o:spid="_x0000_s1324" type="#_x0000_t202" style="position:absolute;left:741;width:8580;height:3909;visibility:visible;mso-wrap-style:square;v-text-anchor:top" o:gfxdata="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" filled="f" stroked="f" strokeweight=".5pt">
                     <v:textbox>
                       <w:txbxContent>
                         <w:p>
@@ -16670,16 +17257,16 @@
                     </v:textbox>
                   </v:shape>
                 </v:group>
-                <v:line id="Straight Connector 25" o:spid="_x0000_s1319" style="position:absolute;visibility:visible;mso-wrap-style:square" from="17431,2210" to="20912,8674" o:connectortype="straight" o:gfxdata="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" strokecolor="black [3200]" strokeweight=".5pt">
+                <v:line id="Straight Connector 25" o:spid="_x0000_s1325" style="position:absolute;visibility:visible;mso-wrap-style:square" from="17431,2210" to="20912,8674" o:connectortype="straight" o:gfxdata="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" strokecolor="black [3200]" strokeweight=".5pt">
                   <v:stroke joinstyle="miter"/>
                 </v:line>
-                <v:line id="Straight Connector 26" o:spid="_x0000_s1320" style="position:absolute;flip:x;visibility:visible;mso-wrap-style:square" from="12403,2210" to="14724,8094" o:connectortype="straight" o:gfxdata="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" strokecolor="black [3200]" strokeweight=".5pt">
+                <v:line id="Straight Connector 26" o:spid="_x0000_s1326" style="position:absolute;flip:x;visibility:visible;mso-wrap-style:square" from="12403,2210" to="14724,8094" o:connectortype="straight" o:gfxdata="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" strokecolor="black [3200]" strokeweight=".5pt">
                   <v:stroke joinstyle="miter"/>
                 </v:line>
-                <v:line id="Straight Connector 27" o:spid="_x0000_s1321" style="position:absolute;flip:x;visibility:visible;mso-wrap-style:square" from="7486,1878" to="13412,5275" o:connectortype="straight" o:gfxdata="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" strokecolor="black [3200]" strokeweight=".5pt">
+                <v:line id="Straight Connector 27" o:spid="_x0000_s1327" style="position:absolute;flip:x;visibility:visible;mso-wrap-style:square" from="7486,1878" to="13412,5275" o:connectortype="straight" o:gfxdata="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" strokecolor="black [3200]" strokeweight=".5pt">
                   <v:stroke joinstyle="miter"/>
                 </v:line>
-                <v:line id="Straight Connector 28" o:spid="_x0000_s1322" style="position:absolute;flip:x;visibility:visible;mso-wrap-style:square" from="8149,469" to="13416,2154" o:connectortype="straight" o:gfxdata="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" strokecolor="black [3200]" strokeweight=".5pt">
+                <v:line id="Straight Connector 28" o:spid="_x0000_s1328" style="position:absolute;flip:x;visibility:visible;mso-wrap-style:square" from="8149,469" to="13416,2154" o:connectortype="straight" o:gfxdata="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" strokecolor="black [3200]" strokeweight=".5pt">
                   <v:stroke joinstyle="miter"/>
                 </v:line>
               </v:group>

</xml_diff>